<commit_message>
Add 이은택 W-bottom and Gravity Rules AND-gate to Sep 18 brief
Fold the KB asset-allocation interview into the one-board and notes: V/W/triple bottoms, 5.0-5.3 plus No Way Back as an AND condition, capital-supplier vs Big Tech CapEx, and the misery-index / KOSPI-leads-GDP tips, with fact tags on the 30% drawdown, 5% tap, and inflation path.

Co-authored-by: choijunh-cloud <choijunh-cloud@users.noreply.github.com>
</commit_message>
<xml_diff>
--- a/lectures/9월 18일 AI·반도체 시장 코멘트.docx
+++ b/lectures/9월 18일 AI·반도체 시장 코멘트.docx
@@ -15,7 +15,7 @@
           <w:color w:val="4B5563"/>
           <w:sz w:val="21"/>
         </w:rPr>
-        <w:t>2026. 9. 18. 강의노트  ·  FOMC 다음날 + BOJ 인상일  ·  영상 5편 + 퀵코멘트</w:t>
+        <w:t>2026. 9. 18. 강의노트  ·  FOMC 다음날 + BOJ 인상일  ·  영상 6편 + 퀵코멘트</w:t>
       </w:r>
     </w:p>
     <w:p>
@@ -31,7 +31,7 @@
           <w:color w:val="B8943A"/>
           <w:sz w:val="26"/>
         </w:rPr>
-        <w:t>금리 산은 넘고 노드는 남았다</w:t>
+        <w:t>산은 넘었다. 바닥은 W. 5%는 터치일 뿐 AND가 안 켜졌다</w:t>
       </w:r>
     </w:p>
     <w:p>
@@ -63,7 +63,7 @@
           <w:color w:val="1E407C"/>
           <w:sz w:val="24"/>
         </w:rPr>
-        <w:t>노드  ·  메모리 2031  ·  미국 3축  ·  Generac  ·  속도조절</w:t>
+        <w:t>이은택 W바닥  ·  Gravity Rules  ·  노드  ·  메모리 2031  ·  Generac</w:t>
       </w:r>
     </w:p>
     <w:tbl>
@@ -122,7 +122,7 @@
                 <w:color w:val="1A1A1A"/>
                 <w:sz w:val="21"/>
               </w:rPr>
-              <w:t>연준·BOJ가 올린 뒤에도 주식은 안도했다. 알려진 인상은 악재가 아니었다.</w:t>
+              <w:t>이은택(자막 이윤택은 오역): 25%+ 급락의 바닥은 V보다 W가 많다. 지금은 두 번째 바닥을 만드는 과정이다.</w:t>
             </w:r>
           </w:p>
           <w:p>
@@ -137,7 +137,7 @@
                 <w:color w:val="1A1A1A"/>
                 <w:sz w:val="21"/>
               </w:rPr>
-              <w:t>정지훈의 프레임: 병목=노드=돈. 연산은 풀렸고 지금은 메모리. 에너지는 가장 복제하기 어렵다.</w:t>
+              <w:t>버블 붕괴는 미 10년 5.0~5.3% 추세 돌파와 인플레 No Way Back의 AND다. 이번 주 5.04 터치는 금요일 4.95로 해제됐다.</w:t>
             </w:r>
           </w:p>
           <w:p>
@@ -152,7 +152,7 @@
                 <w:color w:val="1A1A1A"/>
                 <w:sz w:val="21"/>
               </w:rPr>
-              <w:t>Amazon–Generac $24억(최대 $80억)이 전력 캡엑스의 영수증이다. 전선주는 장중 급등, 밸류는 이미 비싸다.</w:t>
+              <w:t>빅테크는 캡엑스를 못 멈춘다. 꺾는 쪽은 자본공급자다. 7월 알파벳이 그 증거(캡엑스 상향, 주가 −7%).</w:t>
             </w:r>
           </w:p>
           <w:p>
@@ -167,7 +167,7 @@
                 <w:color w:val="1A1A1A"/>
                 <w:sz w:val="21"/>
               </w:rPr>
-              <w:t>하이닉스 미국은 Indiana(후공정 확정) · Ohio(협의) · New York Solidigm(검토) 세 줄. 확정이 아니다.</w:t>
+              <w:t>정지훈의 프레임은 그대로다. 병목=노드=돈. 연산은 풀렸고 지금은 메모리, 다음 영수증은 전력이다.</w:t>
             </w:r>
           </w:p>
           <w:p>
@@ -182,7 +182,7 @@
                 <w:color w:val="1A1A1A"/>
                 <w:sz w:val="21"/>
               </w:rPr>
-              <w:t>Citi는 지속학습이 메모리 부족을 2031까지 연장할 수 있다고 본다. 젠슨의 칩 2배는 대수지, 매출 2배가 아니다.</w:t>
+              <w:t>하이닉스 미국은 Indiana(확정) · Ohio(협의) · New York(검토). Citi는 메모리 부족을 2031까지 볼 수 있다.</w:t>
             </w:r>
           </w:p>
         </w:tc>
@@ -537,7 +537,7 @@
                 <w:color w:val="1A1A1A"/>
                 <w:sz w:val="19"/>
               </w:rPr>
-              <w:t>Ohio/NY 투자 확정, 젠슨 2배=매출 2배, 원/달러 1,587, 매일 1.6조 자사주, CXMT 즉각 공급 해소</w:t>
+              <w:t>Ohio/NY 확정, 젠슨 2배=매출 2배, 원/달러 1,587, 5% 터치=붕괴, 코스피 −30%를 정확한 낙폭, 이윤택</w:t>
             </w:r>
           </w:p>
         </w:tc>
@@ -737,6 +737,69 @@
                 <w:color w:val="1A1A1A"/>
                 <w:sz w:val="19"/>
               </w:rPr>
+              <w:t>이은택 (KB 자산배분)</w:t>
+            </w:r>
+          </w:p>
+        </w:tc>
+        <w:tc>
+          <w:tcPr>
+            <w:tcW w:type="dxa" w:w="7483"/>
+            <w:shd w:val="clear" w:color="auto" w:fill="F7F9FC"/>
+            <w:tcMar>
+              <w:top w:w="60" w:type="dxa"/>
+              <w:left w:w="80" w:type="dxa"/>
+              <w:bottom w:w="60" w:type="dxa"/>
+              <w:right w:w="80" w:type="dxa"/>
+            </w:tcMar>
+          </w:tcPr>
+          <w:p>
+            <w:pPr>
+              <w:spacing w:before="0" w:after="0" w:line="269" w:lineRule="auto"/>
+              <w:jc w:val="center"/>
+            </w:pPr>
+            <w:r/>
+            <w:r>
+              <w:rPr>
+                <w:rFonts w:ascii="맑은 고딕" w:hAnsi="맑은 고딕" w:eastAsia="맑은 고딕"/>
+                <w:b w:val="0"/>
+                <w:i w:val="0"/>
+                <w:color w:val="1A1A1A"/>
+                <w:sz w:val="19"/>
+              </w:rPr>
+              <w:t>V/W/트리플, Gravity Rules AND, 자본공급자, 고통지수, 주가 선행</w:t>
+            </w:r>
+          </w:p>
+        </w:tc>
+      </w:tr>
+      <w:tr>
+        <w:trPr>
+          <w:cantSplit/>
+        </w:trPr>
+        <w:tc>
+          <w:tcPr>
+            <w:tcW w:type="dxa" w:w="2494"/>
+            <w:shd w:val="clear" w:color="auto" w:fill="FFFFFF"/>
+            <w:tcMar>
+              <w:top w:w="60" w:type="dxa"/>
+              <w:left w:w="80" w:type="dxa"/>
+              <w:bottom w:w="60" w:type="dxa"/>
+              <w:right w:w="80" w:type="dxa"/>
+            </w:tcMar>
+          </w:tcPr>
+          <w:p>
+            <w:pPr>
+              <w:spacing w:before="0" w:after="0" w:line="269" w:lineRule="auto"/>
+              <w:jc w:val="left"/>
+            </w:pPr>
+            <w:r/>
+            <w:r>
+              <w:rPr>
+                <w:rFonts w:ascii="맑은 고딕" w:hAnsi="맑은 고딕" w:eastAsia="맑은 고딕"/>
+                <w:b/>
+                <w:i w:val="0"/>
+                <w:color w:val="1A1A1A"/>
+                <w:sz w:val="19"/>
+              </w:rPr>
               <w:t>증시각도기 9/18</w:t>
             </w:r>
           </w:p>
@@ -744,7 +807,7 @@
         <w:tc>
           <w:tcPr>
             <w:tcW w:type="dxa" w:w="7483"/>
-            <w:shd w:val="clear" w:color="auto" w:fill="F7F9FC"/>
+            <w:shd w:val="clear" w:color="auto" w:fill="FFFFFF"/>
             <w:tcMar>
               <w:top w:w="60" w:type="dxa"/>
               <w:left w:w="80" w:type="dxa"/>
@@ -778,7 +841,7 @@
         <w:tc>
           <w:tcPr>
             <w:tcW w:type="dxa" w:w="2494"/>
-            <w:shd w:val="clear" w:color="auto" w:fill="FFFFFF"/>
+            <w:shd w:val="clear" w:color="auto" w:fill="F7F9FC"/>
             <w:tcMar>
               <w:top w:w="60" w:type="dxa"/>
               <w:left w:w="80" w:type="dxa"/>
@@ -807,7 +870,7 @@
         <w:tc>
           <w:tcPr>
             <w:tcW w:type="dxa" w:w="7483"/>
-            <w:shd w:val="clear" w:color="auto" w:fill="FFFFFF"/>
+            <w:shd w:val="clear" w:color="auto" w:fill="F7F9FC"/>
             <w:tcMar>
               <w:top w:w="60" w:type="dxa"/>
               <w:left w:w="80" w:type="dxa"/>
@@ -841,7 +904,7 @@
         <w:tc>
           <w:tcPr>
             <w:tcW w:type="dxa" w:w="2494"/>
-            <w:shd w:val="clear" w:color="auto" w:fill="F7F9FC"/>
+            <w:shd w:val="clear" w:color="auto" w:fill="FFFFFF"/>
             <w:tcMar>
               <w:top w:w="60" w:type="dxa"/>
               <w:left w:w="80" w:type="dxa"/>
@@ -870,7 +933,7 @@
         <w:tc>
           <w:tcPr>
             <w:tcW w:type="dxa" w:w="7483"/>
-            <w:shd w:val="clear" w:color="auto" w:fill="F7F9FC"/>
+            <w:shd w:val="clear" w:color="auto" w:fill="FFFFFF"/>
             <w:tcMar>
               <w:top w:w="60" w:type="dxa"/>
               <w:left w:w="80" w:type="dxa"/>
@@ -904,7 +967,7 @@
         <w:tc>
           <w:tcPr>
             <w:tcW w:type="dxa" w:w="2494"/>
-            <w:shd w:val="clear" w:color="auto" w:fill="FFFFFF"/>
+            <w:shd w:val="clear" w:color="auto" w:fill="F7F9FC"/>
             <w:tcMar>
               <w:top w:w="60" w:type="dxa"/>
               <w:left w:w="80" w:type="dxa"/>
@@ -933,7 +996,7 @@
         <w:tc>
           <w:tcPr>
             <w:tcW w:type="dxa" w:w="7483"/>
-            <w:shd w:val="clear" w:color="auto" w:fill="FFFFFF"/>
+            <w:shd w:val="clear" w:color="auto" w:fill="F7F9FC"/>
             <w:tcMar>
               <w:top w:w="60" w:type="dxa"/>
               <w:left w:w="80" w:type="dxa"/>
@@ -967,7 +1030,7 @@
         <w:tc>
           <w:tcPr>
             <w:tcW w:type="dxa" w:w="2494"/>
-            <w:shd w:val="clear" w:color="auto" w:fill="F7F9FC"/>
+            <w:shd w:val="clear" w:color="auto" w:fill="FFFFFF"/>
             <w:tcMar>
               <w:top w:w="60" w:type="dxa"/>
               <w:left w:w="80" w:type="dxa"/>
@@ -996,7 +1059,7 @@
         <w:tc>
           <w:tcPr>
             <w:tcW w:type="dxa" w:w="7483"/>
-            <w:shd w:val="clear" w:color="auto" w:fill="F7F9FC"/>
+            <w:shd w:val="clear" w:color="auto" w:fill="FFFFFF"/>
             <w:tcMar>
               <w:top w:w="60" w:type="dxa"/>
               <w:left w:w="80" w:type="dxa"/>
@@ -1030,7 +1093,7 @@
         <w:tc>
           <w:tcPr>
             <w:tcW w:type="dxa" w:w="2494"/>
-            <w:shd w:val="clear" w:color="auto" w:fill="FFFFFF"/>
+            <w:shd w:val="clear" w:color="auto" w:fill="F7F9FC"/>
             <w:tcMar>
               <w:top w:w="60" w:type="dxa"/>
               <w:left w:w="80" w:type="dxa"/>
@@ -1059,7 +1122,7 @@
         <w:tc>
           <w:tcPr>
             <w:tcW w:type="dxa" w:w="7483"/>
-            <w:shd w:val="clear" w:color="auto" w:fill="FFFFFF"/>
+            <w:shd w:val="clear" w:color="auto" w:fill="F7F9FC"/>
             <w:tcMar>
               <w:top w:w="60" w:type="dxa"/>
               <w:left w:w="80" w:type="dxa"/>
@@ -1785,6 +1848,114 @@
                 <w:color w:val="1A1A1A"/>
                 <w:sz w:val="19"/>
               </w:rPr>
+              <w:t>미 10년 / 국고</w:t>
+            </w:r>
+          </w:p>
+        </w:tc>
+        <w:tc>
+          <w:tcPr>
+            <w:tcW w:type="dxa" w:w="3515"/>
+            <w:shd w:val="clear" w:color="auto" w:fill="F7F9FC"/>
+            <w:tcMar>
+              <w:top w:w="60" w:type="dxa"/>
+              <w:left w:w="80" w:type="dxa"/>
+              <w:bottom w:w="60" w:type="dxa"/>
+              <w:right w:w="80" w:type="dxa"/>
+            </w:tcMar>
+          </w:tcPr>
+          <w:p>
+            <w:pPr>
+              <w:spacing w:before="0" w:after="20" w:line="269" w:lineRule="auto"/>
+              <w:jc w:val="center"/>
+            </w:pPr>
+            <w:r/>
+            <w:r>
+              <w:rPr>
+                <w:rFonts w:ascii="맑은 고딕" w:hAnsi="맑은 고딕" w:eastAsia="맑은 고딕"/>
+                <w:b w:val="0"/>
+                <w:i w:val="0"/>
+                <w:color w:val="1A1A1A"/>
+                <w:sz w:val="19"/>
+              </w:rPr>
+              <w:t>주중 5.041 → 4.951</w:t>
+            </w:r>
+          </w:p>
+          <w:p>
+            <w:pPr>
+              <w:spacing w:before="0" w:after="0" w:line="269" w:lineRule="auto"/>
+              <w:jc w:val="center"/>
+            </w:pPr>
+            <w:r>
+              <w:rPr>
+                <w:rFonts w:ascii="맑은 고딕" w:hAnsi="맑은 고딕" w:eastAsia="맑은 고딕"/>
+                <w:b w:val="0"/>
+                <w:i w:val="0"/>
+                <w:color w:val="1A1A1A"/>
+                <w:sz w:val="19"/>
+              </w:rPr>
+              <w:t>국고 4.466%(−4bp)</w:t>
+            </w:r>
+          </w:p>
+        </w:tc>
+        <w:tc>
+          <w:tcPr>
+            <w:tcW w:type="dxa" w:w="4535"/>
+            <w:shd w:val="clear" w:color="auto" w:fill="F7F9FC"/>
+            <w:tcMar>
+              <w:top w:w="60" w:type="dxa"/>
+              <w:left w:w="80" w:type="dxa"/>
+              <w:bottom w:w="60" w:type="dxa"/>
+              <w:right w:w="80" w:type="dxa"/>
+            </w:tcMar>
+          </w:tcPr>
+          <w:p>
+            <w:pPr>
+              <w:spacing w:before="0" w:after="0" w:line="269" w:lineRule="auto"/>
+              <w:jc w:val="center"/>
+            </w:pPr>
+            <w:r/>
+            <w:r>
+              <w:rPr>
+                <w:rFonts w:ascii="맑은 고딕" w:hAnsi="맑은 고딕" w:eastAsia="맑은 고딕"/>
+                <w:b w:val="0"/>
+                <w:i w:val="0"/>
+                <w:color w:val="1A1A1A"/>
+                <w:sz w:val="19"/>
+              </w:rPr>
+              <w:t>터치 후 해제. AND 미충족</w:t>
+            </w:r>
+          </w:p>
+        </w:tc>
+      </w:tr>
+      <w:tr>
+        <w:trPr>
+          <w:cantSplit/>
+        </w:trPr>
+        <w:tc>
+          <w:tcPr>
+            <w:tcW w:type="dxa" w:w="1928"/>
+            <w:shd w:val="clear" w:color="auto" w:fill="FFFFFF"/>
+            <w:tcMar>
+              <w:top w:w="60" w:type="dxa"/>
+              <w:left w:w="80" w:type="dxa"/>
+              <w:bottom w:w="60" w:type="dxa"/>
+              <w:right w:w="80" w:type="dxa"/>
+            </w:tcMar>
+          </w:tcPr>
+          <w:p>
+            <w:pPr>
+              <w:spacing w:before="0" w:after="0" w:line="269" w:lineRule="auto"/>
+              <w:jc w:val="left"/>
+            </w:pPr>
+            <w:r/>
+            <w:r>
+              <w:rPr>
+                <w:rFonts w:ascii="맑은 고딕" w:hAnsi="맑은 고딕" w:eastAsia="맑은 고딕"/>
+                <w:b/>
+                <w:i w:val="0"/>
+                <w:color w:val="1A1A1A"/>
+                <w:sz w:val="19"/>
+              </w:rPr>
               <w:t>젠슨 9/17</w:t>
             </w:r>
           </w:p>
@@ -1792,7 +1963,7 @@
         <w:tc>
           <w:tcPr>
             <w:tcW w:type="dxa" w:w="3515"/>
-            <w:shd w:val="clear" w:color="auto" w:fill="F7F9FC"/>
+            <w:shd w:val="clear" w:color="auto" w:fill="FFFFFF"/>
             <w:tcMar>
               <w:top w:w="60" w:type="dxa"/>
               <w:left w:w="80" w:type="dxa"/>
@@ -1837,7 +2008,7 @@
         <w:tc>
           <w:tcPr>
             <w:tcW w:type="dxa" w:w="4535"/>
-            <w:shd w:val="clear" w:color="auto" w:fill="F7F9FC"/>
+            <w:shd w:val="clear" w:color="auto" w:fill="FFFFFF"/>
             <w:tcMar>
               <w:top w:w="60" w:type="dxa"/>
               <w:left w:w="80" w:type="dxa"/>
@@ -1871,7 +2042,7 @@
         <w:tc>
           <w:tcPr>
             <w:tcW w:type="dxa" w:w="1928"/>
-            <w:shd w:val="clear" w:color="auto" w:fill="FFFFFF"/>
+            <w:shd w:val="clear" w:color="auto" w:fill="F7F9FC"/>
             <w:tcMar>
               <w:top w:w="60" w:type="dxa"/>
               <w:left w:w="80" w:type="dxa"/>
@@ -1900,7 +2071,7 @@
         <w:tc>
           <w:tcPr>
             <w:tcW w:type="dxa" w:w="3515"/>
-            <w:shd w:val="clear" w:color="auto" w:fill="FFFFFF"/>
+            <w:shd w:val="clear" w:color="auto" w:fill="F7F9FC"/>
             <w:tcMar>
               <w:top w:w="60" w:type="dxa"/>
               <w:left w:w="80" w:type="dxa"/>
@@ -1945,7 +2116,7 @@
         <w:tc>
           <w:tcPr>
             <w:tcW w:type="dxa" w:w="4535"/>
-            <w:shd w:val="clear" w:color="auto" w:fill="FFFFFF"/>
+            <w:shd w:val="clear" w:color="auto" w:fill="F7F9FC"/>
             <w:tcMar>
               <w:top w:w="60" w:type="dxa"/>
               <w:left w:w="80" w:type="dxa"/>
@@ -1979,7 +2150,7 @@
         <w:tc>
           <w:tcPr>
             <w:tcW w:type="dxa" w:w="1928"/>
-            <w:shd w:val="clear" w:color="auto" w:fill="F7F9FC"/>
+            <w:shd w:val="clear" w:color="auto" w:fill="FFFFFF"/>
             <w:tcMar>
               <w:top w:w="60" w:type="dxa"/>
               <w:left w:w="80" w:type="dxa"/>
@@ -2008,7 +2179,7 @@
         <w:tc>
           <w:tcPr>
             <w:tcW w:type="dxa" w:w="3515"/>
-            <w:shd w:val="clear" w:color="auto" w:fill="F7F9FC"/>
+            <w:shd w:val="clear" w:color="auto" w:fill="FFFFFF"/>
             <w:tcMar>
               <w:top w:w="60" w:type="dxa"/>
               <w:left w:w="80" w:type="dxa"/>
@@ -2053,7 +2224,7 @@
         <w:tc>
           <w:tcPr>
             <w:tcW w:type="dxa" w:w="4535"/>
-            <w:shd w:val="clear" w:color="auto" w:fill="F7F9FC"/>
+            <w:shd w:val="clear" w:color="auto" w:fill="FFFFFF"/>
             <w:tcMar>
               <w:top w:w="60" w:type="dxa"/>
               <w:left w:w="80" w:type="dxa"/>
@@ -2217,7 +2388,7 @@
           <w:color w:val="1A1A1A"/>
           <w:sz w:val="22"/>
         </w:rPr>
-        <w:t>KOSPI 6,894.23, +178.82(+2.66%). 고가 6,914.08. 오른 종목보다 내린 종목이 많았다. 대형 전기전자가 지수를 끌었다.</w:t>
+        <w:t>KOSPI 6,894.23, +178.82(+2.66%). 고가 6,914.08. 오른 종목보다 내린 종목이 많았다. 대형 전기전자가 지수를 끌었다. 이은택은 이 반등을 ‘W의 두 번째 바닥 과정’으로 읽는다.</w:t>
       </w:r>
     </w:p>
     <w:p>
@@ -2614,6 +2785,2319 @@
           <w:color w:val="0F2043"/>
           <w:sz w:val="32"/>
         </w:rPr>
+        <w:t>이은택 — 바닥은 V가 아니라 W</w:t>
+      </w:r>
+    </w:p>
+    <w:p>
+      <w:pPr>
+        <w:spacing w:before="40" w:after="160"/>
+        <w:jc w:val="center"/>
+      </w:pPr>
+      <w:r>
+        <w:drawing>
+          <wp:inline xmlns:a="http://schemas.openxmlformats.org/drawingml/2006/main" xmlns:pic="http://schemas.openxmlformats.org/drawingml/2006/picture">
+            <wp:extent cx="5903999" cy="2749516"/>
+            <wp:docPr id="4" name="Picture 4"/>
+            <wp:cNvGraphicFramePr>
+              <a:graphicFrameLocks noChangeAspect="1"/>
+            </wp:cNvGraphicFramePr>
+            <a:graphic>
+              <a:graphicData uri="http://schemas.openxmlformats.org/drawingml/2006/picture">
+                <pic:pic>
+                  <pic:nvPicPr>
+                    <pic:cNvPr id="0" name="10_bottom_shapes.png"/>
+                    <pic:cNvPicPr/>
+                  </pic:nvPicPr>
+                  <pic:blipFill>
+                    <a:blip r:embed="rId14"/>
+                    <a:stretch>
+                      <a:fillRect/>
+                    </a:stretch>
+                  </pic:blipFill>
+                  <pic:spPr>
+                    <a:xfrm>
+                      <a:off x="0" y="0"/>
+                      <a:ext cx="5903999" cy="2749516"/>
+                    </a:xfrm>
+                    <a:prstGeom prst="rect"/>
+                  </pic:spPr>
+                </pic:pic>
+              </a:graphicData>
+            </a:graphic>
+          </wp:inline>
+        </w:drawing>
+      </w:r>
+    </w:p>
+    <w:p>
+      <w:pPr>
+        <w:spacing w:after="120" w:before="0" w:line="283" w:lineRule="auto"/>
+        <w:jc w:val="left"/>
+      </w:pPr>
+      <w:r>
+        <w:rPr>
+          <w:rFonts w:ascii="맑은 고딕" w:hAnsi="맑은 고딕" w:eastAsia="맑은 고딕"/>
+          <w:b w:val="0"/>
+          <w:i w:val="0"/>
+          <w:color w:val="1A1A1A"/>
+          <w:sz w:val="22"/>
+        </w:rPr>
+        <w:t>KB증권 자산배분 전략 이사 이은택. 방송 자막의 ‘이윤택’은 오역이다. 5월 하반기 전망 Gravity Rules의 연장선이다. 차트로 전망하지 않는다. 급락 뒤 투자자 심리가 어떤 바닥을 만드는지 보는 도구다.</w:t>
+      </w:r>
+    </w:p>
+    <w:p>
+      <w:pPr>
+        <w:spacing w:before="200" w:after="80"/>
+      </w:pPr>
+      <w:r>
+        <w:rPr>
+          <w:rFonts w:ascii="맑은 고딕" w:hAnsi="맑은 고딕" w:eastAsia="맑은 고딕"/>
+          <w:b/>
+          <w:i w:val="0"/>
+          <w:color w:val="1E407C"/>
+          <w:sz w:val="26"/>
+        </w:rPr>
+        <w:t>25%+ 급락은 드물다</w:t>
+      </w:r>
+    </w:p>
+    <w:p>
+      <w:pPr>
+        <w:spacing w:after="50" w:before="0" w:line="276" w:lineRule="auto"/>
+        <w:ind w:left="312" w:hanging="198"/>
+      </w:pPr>
+      <w:r>
+        <w:rPr>
+          <w:rFonts w:ascii="맑은 고딕" w:hAnsi="맑은 고딕" w:eastAsia="맑은 고딕"/>
+          <w:b w:val="0"/>
+          <w:i w:val="0"/>
+          <w:color w:val="1E407C"/>
+          <w:sz w:val="22"/>
+        </w:rPr>
+        <w:t xml:space="preserve">• </w:t>
+      </w:r>
+      <w:r>
+        <w:rPr>
+          <w:rFonts w:ascii="맑은 고딕" w:hAnsi="맑은 고딕" w:eastAsia="맑은 고딕"/>
+          <w:b w:val="0"/>
+          <w:i w:val="0"/>
+          <w:color w:val="1A1A1A"/>
+          <w:sz w:val="22"/>
+        </w:rPr>
+        <w:t>코스피가 25% 이상 빠지는 일은 10년에 세 번 안팎. 이번 낙폭은 그 드문 구간에 들어왔다.</w:t>
+      </w:r>
+    </w:p>
+    <w:p>
+      <w:pPr>
+        <w:spacing w:after="50" w:before="0" w:line="276" w:lineRule="auto"/>
+        <w:ind w:left="312" w:hanging="198"/>
+      </w:pPr>
+      <w:r>
+        <w:rPr>
+          <w:rFonts w:ascii="맑은 고딕" w:hAnsi="맑은 고딕" w:eastAsia="맑은 고딕"/>
+          <w:b w:val="0"/>
+          <w:i w:val="0"/>
+          <w:color w:val="1E407C"/>
+          <w:sz w:val="22"/>
+        </w:rPr>
+        <w:t xml:space="preserve">• </w:t>
+      </w:r>
+      <w:r>
+        <w:rPr>
+          <w:rFonts w:ascii="맑은 고딕" w:hAnsi="맑은 고딕" w:eastAsia="맑은 고딕"/>
+          <w:b w:val="0"/>
+          <w:i w:val="0"/>
+          <w:color w:val="1A1A1A"/>
+          <w:sz w:val="22"/>
+        </w:rPr>
+        <w:t>사실: 6/22 고점 9,114.55 → 7/30 저점 5,593.56 = −38.6%. 이사는 “30% 정도”로 말했다. 반올림이다.</w:t>
+      </w:r>
+    </w:p>
+    <w:p>
+      <w:pPr>
+        <w:spacing w:after="50" w:before="0" w:line="276" w:lineRule="auto"/>
+        <w:ind w:left="312" w:hanging="198"/>
+      </w:pPr>
+      <w:r>
+        <w:rPr>
+          <w:rFonts w:ascii="맑은 고딕" w:hAnsi="맑은 고딕" w:eastAsia="맑은 고딕"/>
+          <w:b w:val="0"/>
+          <w:i w:val="0"/>
+          <w:color w:val="1E407C"/>
+          <w:sz w:val="22"/>
+        </w:rPr>
+        <w:t xml:space="preserve">• </w:t>
+      </w:r>
+      <w:r>
+        <w:rPr>
+          <w:rFonts w:ascii="맑은 고딕" w:hAnsi="맑은 고딕" w:eastAsia="맑은 고딕"/>
+          <w:b w:val="0"/>
+          <w:i w:val="0"/>
+          <w:color w:val="1A1A1A"/>
+          <w:sz w:val="22"/>
+        </w:rPr>
+        <w:t>9/18 종가 6,894.23은 고점 대비 약 −24%. 첫 저점에서는 이미 반등한 자리다.</w:t>
+      </w:r>
+    </w:p>
+    <w:p>
+      <w:pPr>
+        <w:spacing w:before="200" w:after="80"/>
+      </w:pPr>
+      <w:r>
+        <w:rPr>
+          <w:rFonts w:ascii="맑은 고딕" w:hAnsi="맑은 고딕" w:eastAsia="맑은 고딕"/>
+          <w:b/>
+          <w:i w:val="0"/>
+          <w:color w:val="1E407C"/>
+          <w:sz w:val="26"/>
+        </w:rPr>
+        <w:t>바닥 세 종류</w:t>
+      </w:r>
+    </w:p>
+    <w:tbl>
+      <w:tblPr>
+        <w:tblW w:type="auto" w:w="0"/>
+        <w:jc w:val="center"/>
+        <w:tblLayout w:type="autofit"/>
+        <w:tblLook w:firstColumn="1" w:firstRow="1" w:lastColumn="0" w:lastRow="0" w:noHBand="0" w:noVBand="1" w:val="04A0"/>
+        <w:tblBorders>
+          <w:top w:val="single" w:sz="4" w:space="0" w:color="D5DCE6"/>
+          <w:left w:val="single" w:sz="4" w:space="0" w:color="D5DCE6"/>
+          <w:bottom w:val="single" w:sz="4" w:space="0" w:color="D5DCE6"/>
+          <w:right w:val="single" w:sz="4" w:space="0" w:color="D5DCE6"/>
+          <w:insideH w:val="single" w:sz="4" w:space="0" w:color="D5DCE6"/>
+          <w:insideV w:val="single" w:sz="4" w:space="0" w:color="D5DCE6"/>
+        </w:tblBorders>
+      </w:tblPr>
+      <w:tblGrid>
+        <w:gridCol w:w="2018"/>
+        <w:gridCol w:w="2018"/>
+        <w:gridCol w:w="2018"/>
+        <w:gridCol w:w="2018"/>
+        <w:gridCol w:w="2018"/>
+      </w:tblGrid>
+      <w:tr>
+        <w:trPr>
+          <w:cantSplit/>
+        </w:trPr>
+        <w:tc>
+          <w:tcPr>
+            <w:tcW w:type="dxa" w:w="2041"/>
+            <w:shd w:val="clear" w:color="auto" w:fill="0F2043"/>
+            <w:tcMar>
+              <w:top w:w="60" w:type="dxa"/>
+              <w:left w:w="80" w:type="dxa"/>
+              <w:bottom w:w="60" w:type="dxa"/>
+              <w:right w:w="80" w:type="dxa"/>
+            </w:tcMar>
+          </w:tcPr>
+          <w:p>
+            <w:pPr>
+              <w:spacing w:before="0" w:after="0" w:line="269" w:lineRule="auto"/>
+              <w:jc w:val="center"/>
+            </w:pPr>
+            <w:r/>
+            <w:r>
+              <w:rPr>
+                <w:rFonts w:ascii="맑은 고딕" w:hAnsi="맑은 고딕" w:eastAsia="맑은 고딕"/>
+                <w:b/>
+                <w:i w:val="0"/>
+                <w:color w:val="FFFFFF"/>
+                <w:sz w:val="19"/>
+              </w:rPr>
+              <w:t>형태</w:t>
+            </w:r>
+          </w:p>
+        </w:tc>
+        <w:tc>
+          <w:tcPr>
+            <w:tcW w:type="dxa" w:w="1814"/>
+            <w:shd w:val="clear" w:color="auto" w:fill="0F2043"/>
+            <w:tcMar>
+              <w:top w:w="60" w:type="dxa"/>
+              <w:left w:w="80" w:type="dxa"/>
+              <w:bottom w:w="60" w:type="dxa"/>
+              <w:right w:w="80" w:type="dxa"/>
+            </w:tcMar>
+          </w:tcPr>
+          <w:p>
+            <w:pPr>
+              <w:spacing w:before="0" w:after="0" w:line="269" w:lineRule="auto"/>
+              <w:jc w:val="center"/>
+            </w:pPr>
+            <w:r/>
+            <w:r>
+              <w:rPr>
+                <w:rFonts w:ascii="맑은 고딕" w:hAnsi="맑은 고딕" w:eastAsia="맑은 고딕"/>
+                <w:b/>
+                <w:i w:val="0"/>
+                <w:color w:val="FFFFFF"/>
+                <w:sz w:val="19"/>
+              </w:rPr>
+              <w:t>빈도</w:t>
+            </w:r>
+          </w:p>
+        </w:tc>
+        <w:tc>
+          <w:tcPr>
+            <w:tcW w:type="dxa" w:w="1928"/>
+            <w:shd w:val="clear" w:color="auto" w:fill="0F2043"/>
+            <w:tcMar>
+              <w:top w:w="60" w:type="dxa"/>
+              <w:left w:w="80" w:type="dxa"/>
+              <w:bottom w:w="60" w:type="dxa"/>
+              <w:right w:w="80" w:type="dxa"/>
+            </w:tcMar>
+          </w:tcPr>
+          <w:p>
+            <w:pPr>
+              <w:spacing w:before="0" w:after="0" w:line="269" w:lineRule="auto"/>
+              <w:jc w:val="center"/>
+            </w:pPr>
+            <w:r/>
+            <w:r>
+              <w:rPr>
+                <w:rFonts w:ascii="맑은 고딕" w:hAnsi="맑은 고딕" w:eastAsia="맑은 고딕"/>
+                <w:b/>
+                <w:i w:val="0"/>
+                <w:color w:val="FFFFFF"/>
+                <w:sz w:val="19"/>
+              </w:rPr>
+              <w:t>기간</w:t>
+            </w:r>
+          </w:p>
+        </w:tc>
+        <w:tc>
+          <w:tcPr>
+            <w:tcW w:type="dxa" w:w="2608"/>
+            <w:shd w:val="clear" w:color="auto" w:fill="0F2043"/>
+            <w:tcMar>
+              <w:top w:w="60" w:type="dxa"/>
+              <w:left w:w="80" w:type="dxa"/>
+              <w:bottom w:w="60" w:type="dxa"/>
+              <w:right w:w="80" w:type="dxa"/>
+            </w:tcMar>
+          </w:tcPr>
+          <w:p>
+            <w:pPr>
+              <w:spacing w:before="0" w:after="0" w:line="269" w:lineRule="auto"/>
+              <w:jc w:val="center"/>
+            </w:pPr>
+            <w:r/>
+            <w:r>
+              <w:rPr>
+                <w:rFonts w:ascii="맑은 고딕" w:hAnsi="맑은 고딕" w:eastAsia="맑은 고딕"/>
+                <w:b/>
+                <w:i w:val="0"/>
+                <w:color w:val="FFFFFF"/>
+                <w:sz w:val="19"/>
+              </w:rPr>
+              <w:t>사례</w:t>
+            </w:r>
+          </w:p>
+        </w:tc>
+        <w:tc>
+          <w:tcPr>
+            <w:tcW w:type="dxa" w:w="1587"/>
+            <w:shd w:val="clear" w:color="auto" w:fill="0F2043"/>
+            <w:tcMar>
+              <w:top w:w="60" w:type="dxa"/>
+              <w:left w:w="80" w:type="dxa"/>
+              <w:bottom w:w="60" w:type="dxa"/>
+              <w:right w:w="80" w:type="dxa"/>
+            </w:tcMar>
+          </w:tcPr>
+          <w:p>
+            <w:pPr>
+              <w:spacing w:before="0" w:after="0" w:line="269" w:lineRule="auto"/>
+              <w:jc w:val="center"/>
+            </w:pPr>
+            <w:r/>
+            <w:r>
+              <w:rPr>
+                <w:rFonts w:ascii="맑은 고딕" w:hAnsi="맑은 고딕" w:eastAsia="맑은 고딕"/>
+                <w:b/>
+                <w:i w:val="0"/>
+                <w:color w:val="FFFFFF"/>
+                <w:sz w:val="19"/>
+              </w:rPr>
+              <w:t>지금</w:t>
+            </w:r>
+          </w:p>
+        </w:tc>
+      </w:tr>
+      <w:tr>
+        <w:trPr>
+          <w:cantSplit/>
+        </w:trPr>
+        <w:tc>
+          <w:tcPr>
+            <w:tcW w:type="dxa" w:w="2041"/>
+            <w:shd w:val="clear" w:color="auto" w:fill="FFFFFF"/>
+            <w:tcMar>
+              <w:top w:w="60" w:type="dxa"/>
+              <w:left w:w="80" w:type="dxa"/>
+              <w:bottom w:w="60" w:type="dxa"/>
+              <w:right w:w="80" w:type="dxa"/>
+            </w:tcMar>
+          </w:tcPr>
+          <w:p>
+            <w:pPr>
+              <w:spacing w:before="0" w:after="0" w:line="269" w:lineRule="auto"/>
+              <w:jc w:val="left"/>
+            </w:pPr>
+            <w:r/>
+            <w:r>
+              <w:rPr>
+                <w:rFonts w:ascii="맑은 고딕" w:hAnsi="맑은 고딕" w:eastAsia="맑은 고딕"/>
+                <w:b/>
+                <w:i w:val="0"/>
+                <w:color w:val="1A1A1A"/>
+                <w:sz w:val="19"/>
+              </w:rPr>
+              <w:t>V자</w:t>
+            </w:r>
+          </w:p>
+        </w:tc>
+        <w:tc>
+          <w:tcPr>
+            <w:tcW w:type="dxa" w:w="1814"/>
+            <w:shd w:val="clear" w:color="auto" w:fill="FFFFFF"/>
+            <w:tcMar>
+              <w:top w:w="60" w:type="dxa"/>
+              <w:left w:w="80" w:type="dxa"/>
+              <w:bottom w:w="60" w:type="dxa"/>
+              <w:right w:w="80" w:type="dxa"/>
+            </w:tcMar>
+          </w:tcPr>
+          <w:p>
+            <w:pPr>
+              <w:spacing w:before="0" w:after="0" w:line="269" w:lineRule="auto"/>
+              <w:jc w:val="center"/>
+            </w:pPr>
+            <w:r/>
+            <w:r>
+              <w:rPr>
+                <w:rFonts w:ascii="맑은 고딕" w:hAnsi="맑은 고딕" w:eastAsia="맑은 고딕"/>
+                <w:b w:val="0"/>
+                <w:i w:val="0"/>
+                <w:color w:val="1A1A1A"/>
+                <w:sz w:val="19"/>
+              </w:rPr>
+              <w:t>제일 드묾</w:t>
+            </w:r>
+          </w:p>
+        </w:tc>
+        <w:tc>
+          <w:tcPr>
+            <w:tcW w:type="dxa" w:w="1928"/>
+            <w:shd w:val="clear" w:color="auto" w:fill="FFFFFF"/>
+            <w:tcMar>
+              <w:top w:w="60" w:type="dxa"/>
+              <w:left w:w="80" w:type="dxa"/>
+              <w:bottom w:w="60" w:type="dxa"/>
+              <w:right w:w="80" w:type="dxa"/>
+            </w:tcMar>
+          </w:tcPr>
+          <w:p>
+            <w:pPr>
+              <w:spacing w:before="0" w:after="0" w:line="269" w:lineRule="auto"/>
+              <w:jc w:val="center"/>
+            </w:pPr>
+            <w:r/>
+            <w:r>
+              <w:rPr>
+                <w:rFonts w:ascii="맑은 고딕" w:hAnsi="맑은 고딕" w:eastAsia="맑은 고딕"/>
+                <w:b w:val="0"/>
+                <w:i w:val="0"/>
+                <w:color w:val="1A1A1A"/>
+                <w:sz w:val="19"/>
+              </w:rPr>
+              <w:t>급락 직후</w:t>
+            </w:r>
+          </w:p>
+        </w:tc>
+        <w:tc>
+          <w:tcPr>
+            <w:tcW w:type="dxa" w:w="2608"/>
+            <w:shd w:val="clear" w:color="auto" w:fill="FFFFFF"/>
+            <w:tcMar>
+              <w:top w:w="60" w:type="dxa"/>
+              <w:left w:w="80" w:type="dxa"/>
+              <w:bottom w:w="60" w:type="dxa"/>
+              <w:right w:w="80" w:type="dxa"/>
+            </w:tcMar>
+          </w:tcPr>
+          <w:p>
+            <w:pPr>
+              <w:spacing w:before="0" w:after="0" w:line="269" w:lineRule="auto"/>
+              <w:jc w:val="center"/>
+            </w:pPr>
+            <w:r/>
+            <w:r>
+              <w:rPr>
+                <w:rFonts w:ascii="맑은 고딕" w:hAnsi="맑은 고딕" w:eastAsia="맑은 고딕"/>
+                <w:b w:val="0"/>
+                <w:i w:val="0"/>
+                <w:color w:val="1A1A1A"/>
+                <w:sz w:val="19"/>
+              </w:rPr>
+              <w:t>2003 이라크, 2020 팬데믹</w:t>
+            </w:r>
+          </w:p>
+        </w:tc>
+        <w:tc>
+          <w:tcPr>
+            <w:tcW w:type="dxa" w:w="1587"/>
+            <w:shd w:val="clear" w:color="auto" w:fill="FFFFFF"/>
+            <w:tcMar>
+              <w:top w:w="60" w:type="dxa"/>
+              <w:left w:w="80" w:type="dxa"/>
+              <w:bottom w:w="60" w:type="dxa"/>
+              <w:right w:w="80" w:type="dxa"/>
+            </w:tcMar>
+          </w:tcPr>
+          <w:p>
+            <w:pPr>
+              <w:spacing w:before="0" w:after="0" w:line="269" w:lineRule="auto"/>
+              <w:jc w:val="center"/>
+            </w:pPr>
+            <w:r/>
+            <w:r>
+              <w:rPr>
+                <w:rFonts w:ascii="맑은 고딕" w:hAnsi="맑은 고딕" w:eastAsia="맑은 고딕"/>
+                <w:b w:val="0"/>
+                <w:i w:val="0"/>
+                <w:color w:val="1A1A1A"/>
+                <w:sz w:val="19"/>
+              </w:rPr>
+              <w:t>가능성 낮음</w:t>
+            </w:r>
+          </w:p>
+        </w:tc>
+      </w:tr>
+      <w:tr>
+        <w:trPr>
+          <w:cantSplit/>
+        </w:trPr>
+        <w:tc>
+          <w:tcPr>
+            <w:tcW w:type="dxa" w:w="2041"/>
+            <w:shd w:val="clear" w:color="auto" w:fill="F7F9FC"/>
+            <w:tcMar>
+              <w:top w:w="60" w:type="dxa"/>
+              <w:left w:w="80" w:type="dxa"/>
+              <w:bottom w:w="60" w:type="dxa"/>
+              <w:right w:w="80" w:type="dxa"/>
+            </w:tcMar>
+          </w:tcPr>
+          <w:p>
+            <w:pPr>
+              <w:spacing w:before="0" w:after="0" w:line="269" w:lineRule="auto"/>
+              <w:jc w:val="left"/>
+            </w:pPr>
+            <w:r/>
+            <w:r>
+              <w:rPr>
+                <w:rFonts w:ascii="맑은 고딕" w:hAnsi="맑은 고딕" w:eastAsia="맑은 고딕"/>
+                <w:b/>
+                <w:i w:val="0"/>
+                <w:color w:val="1A1A1A"/>
+                <w:sz w:val="19"/>
+              </w:rPr>
+              <w:t>W자 · 쌍바닥</w:t>
+            </w:r>
+          </w:p>
+        </w:tc>
+        <w:tc>
+          <w:tcPr>
+            <w:tcW w:type="dxa" w:w="1814"/>
+            <w:shd w:val="clear" w:color="auto" w:fill="F7F9FC"/>
+            <w:tcMar>
+              <w:top w:w="60" w:type="dxa"/>
+              <w:left w:w="80" w:type="dxa"/>
+              <w:bottom w:w="60" w:type="dxa"/>
+              <w:right w:w="80" w:type="dxa"/>
+            </w:tcMar>
+          </w:tcPr>
+          <w:p>
+            <w:pPr>
+              <w:spacing w:before="0" w:after="0" w:line="269" w:lineRule="auto"/>
+              <w:jc w:val="center"/>
+            </w:pPr>
+            <w:r/>
+            <w:r>
+              <w:rPr>
+                <w:rFonts w:ascii="맑은 고딕" w:hAnsi="맑은 고딕" w:eastAsia="맑은 고딕"/>
+                <w:b w:val="0"/>
+                <w:i w:val="0"/>
+                <w:color w:val="1A1A1A"/>
+                <w:sz w:val="19"/>
+              </w:rPr>
+              <w:t>제일 많음</w:t>
+            </w:r>
+          </w:p>
+        </w:tc>
+        <w:tc>
+          <w:tcPr>
+            <w:tcW w:type="dxa" w:w="1928"/>
+            <w:shd w:val="clear" w:color="auto" w:fill="F7F9FC"/>
+            <w:tcMar>
+              <w:top w:w="60" w:type="dxa"/>
+              <w:left w:w="80" w:type="dxa"/>
+              <w:bottom w:w="60" w:type="dxa"/>
+              <w:right w:w="80" w:type="dxa"/>
+            </w:tcMar>
+          </w:tcPr>
+          <w:p>
+            <w:pPr>
+              <w:spacing w:before="0" w:after="0" w:line="269" w:lineRule="auto"/>
+              <w:jc w:val="center"/>
+            </w:pPr>
+            <w:r/>
+            <w:r>
+              <w:rPr>
+                <w:rFonts w:ascii="맑은 고딕" w:hAnsi="맑은 고딕" w:eastAsia="맑은 고딕"/>
+                <w:b w:val="0"/>
+                <w:i w:val="0"/>
+                <w:color w:val="1A1A1A"/>
+                <w:sz w:val="19"/>
+              </w:rPr>
+              <w:t>2~4개월 소화</w:t>
+            </w:r>
+          </w:p>
+        </w:tc>
+        <w:tc>
+          <w:tcPr>
+            <w:tcW w:type="dxa" w:w="2608"/>
+            <w:shd w:val="clear" w:color="auto" w:fill="F7F9FC"/>
+            <w:tcMar>
+              <w:top w:w="60" w:type="dxa"/>
+              <w:left w:w="80" w:type="dxa"/>
+              <w:bottom w:w="60" w:type="dxa"/>
+              <w:right w:w="80" w:type="dxa"/>
+            </w:tcMar>
+          </w:tcPr>
+          <w:p>
+            <w:pPr>
+              <w:spacing w:before="0" w:after="0" w:line="269" w:lineRule="auto"/>
+              <w:jc w:val="center"/>
+            </w:pPr>
+            <w:r/>
+            <w:r>
+              <w:rPr>
+                <w:rFonts w:ascii="맑은 고딕" w:hAnsi="맑은 고딕" w:eastAsia="맑은 고딕"/>
+                <w:b w:val="0"/>
+                <w:i w:val="0"/>
+                <w:color w:val="1A1A1A"/>
+                <w:sz w:val="19"/>
+              </w:rPr>
+              <w:t>전저점 재방문은 필수 아님</w:t>
+            </w:r>
+          </w:p>
+        </w:tc>
+        <w:tc>
+          <w:tcPr>
+            <w:tcW w:type="dxa" w:w="1587"/>
+            <w:shd w:val="clear" w:color="auto" w:fill="F7F9FC"/>
+            <w:tcMar>
+              <w:top w:w="60" w:type="dxa"/>
+              <w:left w:w="80" w:type="dxa"/>
+              <w:bottom w:w="60" w:type="dxa"/>
+              <w:right w:w="80" w:type="dxa"/>
+            </w:tcMar>
+          </w:tcPr>
+          <w:p>
+            <w:pPr>
+              <w:spacing w:before="0" w:after="0" w:line="269" w:lineRule="auto"/>
+              <w:jc w:val="center"/>
+            </w:pPr>
+            <w:r/>
+            <w:r>
+              <w:rPr>
+                <w:rFonts w:ascii="맑은 고딕" w:hAnsi="맑은 고딕" w:eastAsia="맑은 고딕"/>
+                <w:b w:val="0"/>
+                <w:i w:val="0"/>
+                <w:color w:val="1A1A1A"/>
+                <w:sz w:val="19"/>
+              </w:rPr>
+              <w:t>이은택: 여기</w:t>
+            </w:r>
+          </w:p>
+        </w:tc>
+      </w:tr>
+      <w:tr>
+        <w:trPr>
+          <w:cantSplit/>
+        </w:trPr>
+        <w:tc>
+          <w:tcPr>
+            <w:tcW w:type="dxa" w:w="2041"/>
+            <w:shd w:val="clear" w:color="auto" w:fill="FFFFFF"/>
+            <w:tcMar>
+              <w:top w:w="60" w:type="dxa"/>
+              <w:left w:w="80" w:type="dxa"/>
+              <w:bottom w:w="60" w:type="dxa"/>
+              <w:right w:w="80" w:type="dxa"/>
+            </w:tcMar>
+          </w:tcPr>
+          <w:p>
+            <w:pPr>
+              <w:spacing w:before="0" w:after="0" w:line="269" w:lineRule="auto"/>
+              <w:jc w:val="left"/>
+            </w:pPr>
+            <w:r/>
+            <w:r>
+              <w:rPr>
+                <w:rFonts w:ascii="맑은 고딕" w:hAnsi="맑은 고딕" w:eastAsia="맑은 고딕"/>
+                <w:b/>
+                <w:i w:val="0"/>
+                <w:color w:val="1A1A1A"/>
+                <w:sz w:val="19"/>
+              </w:rPr>
+              <w:t>트리플</w:t>
+            </w:r>
+          </w:p>
+        </w:tc>
+        <w:tc>
+          <w:tcPr>
+            <w:tcW w:type="dxa" w:w="1814"/>
+            <w:shd w:val="clear" w:color="auto" w:fill="FFFFFF"/>
+            <w:tcMar>
+              <w:top w:w="60" w:type="dxa"/>
+              <w:left w:w="80" w:type="dxa"/>
+              <w:bottom w:w="60" w:type="dxa"/>
+              <w:right w:w="80" w:type="dxa"/>
+            </w:tcMar>
+          </w:tcPr>
+          <w:p>
+            <w:pPr>
+              <w:spacing w:before="0" w:after="0" w:line="269" w:lineRule="auto"/>
+              <w:jc w:val="center"/>
+            </w:pPr>
+            <w:r/>
+            <w:r>
+              <w:rPr>
+                <w:rFonts w:ascii="맑은 고딕" w:hAnsi="맑은 고딕" w:eastAsia="맑은 고딕"/>
+                <w:b w:val="0"/>
+                <w:i w:val="0"/>
+                <w:color w:val="1A1A1A"/>
+                <w:sz w:val="19"/>
+              </w:rPr>
+              <w:t>위기형 세 번</w:t>
+            </w:r>
+          </w:p>
+        </w:tc>
+        <w:tc>
+          <w:tcPr>
+            <w:tcW w:type="dxa" w:w="1928"/>
+            <w:shd w:val="clear" w:color="auto" w:fill="FFFFFF"/>
+            <w:tcMar>
+              <w:top w:w="60" w:type="dxa"/>
+              <w:left w:w="80" w:type="dxa"/>
+              <w:bottom w:w="60" w:type="dxa"/>
+              <w:right w:w="80" w:type="dxa"/>
+            </w:tcMar>
+          </w:tcPr>
+          <w:p>
+            <w:pPr>
+              <w:spacing w:before="0" w:after="0" w:line="269" w:lineRule="auto"/>
+              <w:jc w:val="center"/>
+            </w:pPr>
+            <w:r/>
+            <w:r>
+              <w:rPr>
+                <w:rFonts w:ascii="맑은 고딕" w:hAnsi="맑은 고딕" w:eastAsia="맑은 고딕"/>
+                <w:b w:val="0"/>
+                <w:i w:val="0"/>
+                <w:color w:val="1A1A1A"/>
+                <w:sz w:val="19"/>
+              </w:rPr>
+              <w:t>2~3분기</w:t>
+            </w:r>
+          </w:p>
+        </w:tc>
+        <w:tc>
+          <w:tcPr>
+            <w:tcW w:type="dxa" w:w="2608"/>
+            <w:shd w:val="clear" w:color="auto" w:fill="FFFFFF"/>
+            <w:tcMar>
+              <w:top w:w="60" w:type="dxa"/>
+              <w:left w:w="80" w:type="dxa"/>
+              <w:bottom w:w="60" w:type="dxa"/>
+              <w:right w:w="80" w:type="dxa"/>
+            </w:tcMar>
+          </w:tcPr>
+          <w:p>
+            <w:pPr>
+              <w:spacing w:before="0" w:after="0" w:line="269" w:lineRule="auto"/>
+              <w:jc w:val="center"/>
+            </w:pPr>
+            <w:r/>
+            <w:r>
+              <w:rPr>
+                <w:rFonts w:ascii="맑은 고딕" w:hAnsi="맑은 고딕" w:eastAsia="맑은 고딕"/>
+                <w:b w:val="0"/>
+                <w:i w:val="0"/>
+                <w:color w:val="1A1A1A"/>
+                <w:sz w:val="19"/>
+              </w:rPr>
+              <w:t>1998 / 2000 / 2008</w:t>
+            </w:r>
+          </w:p>
+        </w:tc>
+        <w:tc>
+          <w:tcPr>
+            <w:tcW w:type="dxa" w:w="1587"/>
+            <w:shd w:val="clear" w:color="auto" w:fill="FFFFFF"/>
+            <w:tcMar>
+              <w:top w:w="60" w:type="dxa"/>
+              <w:left w:w="80" w:type="dxa"/>
+              <w:bottom w:w="60" w:type="dxa"/>
+              <w:right w:w="80" w:type="dxa"/>
+            </w:tcMar>
+          </w:tcPr>
+          <w:p>
+            <w:pPr>
+              <w:spacing w:before="0" w:after="0" w:line="269" w:lineRule="auto"/>
+              <w:jc w:val="center"/>
+            </w:pPr>
+            <w:r/>
+            <w:r>
+              <w:rPr>
+                <w:rFonts w:ascii="맑은 고딕" w:hAnsi="맑은 고딕" w:eastAsia="맑은 고딕"/>
+                <w:b w:val="0"/>
+                <w:i w:val="0"/>
+                <w:color w:val="1A1A1A"/>
+                <w:sz w:val="19"/>
+              </w:rPr>
+              <w:t>해당 없음</w:t>
+            </w:r>
+          </w:p>
+        </w:tc>
+      </w:tr>
+    </w:tbl>
+    <w:p>
+      <w:pPr>
+        <w:spacing w:after="160" w:before="40"/>
+      </w:pPr>
+    </w:p>
+    <w:p>
+      <w:pPr>
+        <w:spacing w:after="50" w:before="0" w:line="276" w:lineRule="auto"/>
+        <w:ind w:left="312" w:hanging="198"/>
+      </w:pPr>
+      <w:r>
+        <w:rPr>
+          <w:rFonts w:ascii="맑은 고딕" w:hAnsi="맑은 고딕" w:eastAsia="맑은 고딕"/>
+          <w:b w:val="0"/>
+          <w:i w:val="0"/>
+          <w:color w:val="1E407C"/>
+          <w:sz w:val="22"/>
+        </w:rPr>
+        <w:t xml:space="preserve">• </w:t>
+      </w:r>
+      <w:r>
+        <w:rPr>
+          <w:rFonts w:ascii="맑은 고딕" w:hAnsi="맑은 고딕" w:eastAsia="맑은 고딕"/>
+          <w:b w:val="0"/>
+          <w:i w:val="0"/>
+          <w:color w:val="1A1A1A"/>
+          <w:sz w:val="22"/>
+        </w:rPr>
+        <w:t>V가 안 나오는 이유: 급락 뒤에도 악재와 수급 부담이 남는다. 2020년 V는 대규모 양적완화 없이 설명하기 어렵다.</w:t>
+      </w:r>
+    </w:p>
+    <w:p>
+      <w:pPr>
+        <w:spacing w:after="50" w:before="0" w:line="276" w:lineRule="auto"/>
+        <w:ind w:left="312" w:hanging="198"/>
+      </w:pPr>
+      <w:r>
+        <w:rPr>
+          <w:rFonts w:ascii="맑은 고딕" w:hAnsi="맑은 고딕" w:eastAsia="맑은 고딕"/>
+          <w:b w:val="0"/>
+          <w:i w:val="0"/>
+          <w:color w:val="1E407C"/>
+          <w:sz w:val="22"/>
+        </w:rPr>
+        <w:t xml:space="preserve">• </w:t>
+      </w:r>
+      <w:r>
+        <w:rPr>
+          <w:rFonts w:ascii="맑은 고딕" w:hAnsi="맑은 고딕" w:eastAsia="맑은 고딕"/>
+          <w:b w:val="0"/>
+          <w:i w:val="0"/>
+          <w:color w:val="1A1A1A"/>
+          <w:sz w:val="22"/>
+        </w:rPr>
+        <w:t>W의 뜻은 ‘다시 전저점’이 아니다. 더 밑, 살짝 하회, 위에서 두 번째 바닥. 공통점은 기간 조정이다.</w:t>
+      </w:r>
+    </w:p>
+    <w:p>
+      <w:pPr>
+        <w:spacing w:after="50" w:before="0" w:line="276" w:lineRule="auto"/>
+        <w:ind w:left="312" w:hanging="198"/>
+      </w:pPr>
+      <w:r>
+        <w:rPr>
+          <w:rFonts w:ascii="맑은 고딕" w:hAnsi="맑은 고딕" w:eastAsia="맑은 고딕"/>
+          <w:b w:val="0"/>
+          <w:i w:val="0"/>
+          <w:color w:val="1E407C"/>
+          <w:sz w:val="22"/>
+        </w:rPr>
+        <w:t xml:space="preserve">• </w:t>
+      </w:r>
+      <w:r>
+        <w:rPr>
+          <w:rFonts w:ascii="맑은 고딕" w:hAnsi="맑은 고딕" w:eastAsia="맑은 고딕"/>
+          <w:b w:val="0"/>
+          <w:i w:val="0"/>
+          <w:color w:val="1A1A1A"/>
+          <w:sz w:val="22"/>
+        </w:rPr>
+        <w:t>심리: 첫 급락에서는 절반 미만만 판다. 두 번째 바닥에서 지쳐 ‘해방되고 싶다’며 판다. 그때 수급이 가벼워진다.</w:t>
+      </w:r>
+    </w:p>
+    <w:p>
+      <w:pPr>
+        <w:spacing w:after="50" w:before="0" w:line="276" w:lineRule="auto"/>
+        <w:ind w:left="312" w:hanging="198"/>
+      </w:pPr>
+      <w:r>
+        <w:rPr>
+          <w:rFonts w:ascii="맑은 고딕" w:hAnsi="맑은 고딕" w:eastAsia="맑은 고딕"/>
+          <w:b w:val="0"/>
+          <w:i w:val="0"/>
+          <w:color w:val="1E407C"/>
+          <w:sz w:val="22"/>
+        </w:rPr>
+        <w:t xml:space="preserve">• </w:t>
+      </w:r>
+      <w:r>
+        <w:rPr>
+          <w:rFonts w:ascii="맑은 고딕" w:hAnsi="맑은 고딕" w:eastAsia="맑은 고딕"/>
+          <w:b w:val="0"/>
+          <w:i w:val="0"/>
+          <w:color w:val="1A1A1A"/>
+          <w:sz w:val="22"/>
+        </w:rPr>
+        <w:t>사실: 9월 1–10일 개인 순매도 약 15.6조. “첫 바닥 이후 15~17조”와 맞는다. 오늘 −3.59조가 그 연장이다.</w:t>
+      </w:r>
+    </w:p>
+    <w:p>
+      <w:pPr>
+        <w:spacing w:after="50" w:before="0" w:line="276" w:lineRule="auto"/>
+        <w:ind w:left="312" w:hanging="198"/>
+      </w:pPr>
+      <w:r>
+        <w:rPr>
+          <w:rFonts w:ascii="맑은 고딕" w:hAnsi="맑은 고딕" w:eastAsia="맑은 고딕"/>
+          <w:b w:val="0"/>
+          <w:i w:val="0"/>
+          <w:color w:val="1E407C"/>
+          <w:sz w:val="22"/>
+        </w:rPr>
+        <w:t xml:space="preserve">• </w:t>
+      </w:r>
+      <w:r>
+        <w:rPr>
+          <w:rFonts w:ascii="맑은 고딕" w:hAnsi="맑은 고딕" w:eastAsia="맑은 고딕"/>
+          <w:b w:val="0"/>
+          <w:i w:val="0"/>
+          <w:color w:val="1A1A1A"/>
+          <w:sz w:val="22"/>
+        </w:rPr>
+        <w:t>트리플은 시스템 위기 때. 반년 동안 샀다 팔았다 하다 세 번째에서 인버스를 살 때 진짜 반등이 나온다. 이사는 ‘세 번째 뒤 1년에 두 배’까지 말했으나 공식은 아니다. 해석.</w:t>
+      </w:r>
+    </w:p>
+    <w:tbl>
+      <w:tblPr>
+        <w:tblW w:type="auto" w:w="0"/>
+        <w:jc w:val="center"/>
+        <w:tblLayout w:type="autofit"/>
+        <w:tblLook w:firstColumn="1" w:firstRow="1" w:lastColumn="0" w:lastRow="0" w:noHBand="0" w:noVBand="1" w:val="04A0"/>
+      </w:tblPr>
+      <w:tblGrid>
+        <w:gridCol w:w="10092"/>
+      </w:tblGrid>
+      <w:tr>
+        <w:tc>
+          <w:tcPr>
+            <w:tcW w:type="dxa" w:w="10092"/>
+            <w:shd w:val="clear" w:color="auto" w:fill="FFF8E7"/>
+            <w:tcBorders>
+              <w:top w:val="nil"/>
+              <w:left w:val="single" w:sz="28" w:space="0" w:color="B8943A"/>
+              <w:bottom w:val="nil"/>
+              <w:right w:val="nil"/>
+            </w:tcBorders>
+            <w:tcMar>
+              <w:top w:w="80" w:type="dxa"/>
+              <w:left w:w="120" w:type="dxa"/>
+              <w:bottom w:w="80" w:type="dxa"/>
+              <w:right w:w="120" w:type="dxa"/>
+            </w:tcMar>
+          </w:tcPr>
+          <w:p>
+            <w:pPr>
+              <w:spacing w:after="40" w:before="0"/>
+            </w:pPr>
+            <w:r/>
+            <w:r>
+              <w:rPr>
+                <w:rFonts w:ascii="맑은 고딕" w:hAnsi="맑은 고딕" w:eastAsia="맑은 고딕"/>
+                <w:b/>
+                <w:i w:val="0"/>
+                <w:color w:val="7A5C12"/>
+                <w:sz w:val="20"/>
+              </w:rPr>
+              <w:t>위치</w:t>
+            </w:r>
+          </w:p>
+          <w:p>
+            <w:pPr>
+              <w:spacing w:after="20" w:before="0" w:line="276" w:lineRule="auto"/>
+            </w:pPr>
+            <w:r>
+              <w:rPr>
+                <w:rFonts w:ascii="맑은 고딕" w:hAnsi="맑은 고딕" w:eastAsia="맑은 고딕"/>
+                <w:b w:val="0"/>
+                <w:i w:val="0"/>
+                <w:color w:val="1A1A1A"/>
+                <w:sz w:val="21"/>
+              </w:rPr>
+              <w:t>확률상 W. 두 번째 바닥을 형성하는 과정. 오늘의 반등이 시작인지는 모른다. 두 번째 바닥은 항상 힘든 자리다.</w:t>
+            </w:r>
+          </w:p>
+        </w:tc>
+      </w:tr>
+    </w:tbl>
+    <w:p>
+      <w:pPr>
+        <w:spacing w:after="120"/>
+      </w:pPr>
+    </w:p>
+    <w:p>
+      <w:pPr>
+        <w:spacing w:before="280" w:after="160" w:line="264" w:lineRule="auto"/>
+        <w:pBdr>
+          <w:bottom w:val="single" w:sz="12" w:space="4" w:color="0F2043"/>
+        </w:pBdr>
+      </w:pPr>
+      <w:r>
+        <w:rPr>
+          <w:rFonts w:ascii="맑은 고딕" w:hAnsi="맑은 고딕" w:eastAsia="맑은 고딕"/>
+          <w:b/>
+          <w:i w:val="0"/>
+          <w:color w:val="B8943A"/>
+          <w:sz w:val="32"/>
+        </w:rPr>
+        <w:t xml:space="preserve">4.  </w:t>
+      </w:r>
+      <w:r>
+        <w:rPr>
+          <w:rFonts w:ascii="맑은 고딕" w:hAnsi="맑은 고딕" w:eastAsia="맑은 고딕"/>
+          <w:b/>
+          <w:i w:val="0"/>
+          <w:color w:val="0F2043"/>
+          <w:sz w:val="32"/>
+        </w:rPr>
+        <w:t>Gravity Rules — 5%는 AND의 한쪽</w:t>
+      </w:r>
+    </w:p>
+    <w:p>
+      <w:pPr>
+        <w:spacing w:before="40" w:after="160"/>
+        <w:jc w:val="center"/>
+      </w:pPr>
+      <w:r>
+        <w:drawing>
+          <wp:inline xmlns:a="http://schemas.openxmlformats.org/drawingml/2006/main" xmlns:pic="http://schemas.openxmlformats.org/drawingml/2006/picture">
+            <wp:extent cx="5903999" cy="2726135"/>
+            <wp:docPr id="5" name="Picture 5"/>
+            <wp:cNvGraphicFramePr>
+              <a:graphicFrameLocks noChangeAspect="1"/>
+            </wp:cNvGraphicFramePr>
+            <a:graphic>
+              <a:graphicData uri="http://schemas.openxmlformats.org/drawingml/2006/picture">
+                <pic:pic>
+                  <pic:nvPicPr>
+                    <pic:cNvPr id="0" name="11_and_gate.png"/>
+                    <pic:cNvPicPr/>
+                  </pic:nvPicPr>
+                  <pic:blipFill>
+                    <a:blip r:embed="rId15"/>
+                    <a:stretch>
+                      <a:fillRect/>
+                    </a:stretch>
+                  </pic:blipFill>
+                  <pic:spPr>
+                    <a:xfrm>
+                      <a:off x="0" y="0"/>
+                      <a:ext cx="5903999" cy="2726135"/>
+                    </a:xfrm>
+                    <a:prstGeom prst="rect"/>
+                  </pic:spPr>
+                </pic:pic>
+              </a:graphicData>
+            </a:graphic>
+          </wp:inline>
+        </w:drawing>
+      </w:r>
+    </w:p>
+    <w:p>
+      <w:pPr>
+        <w:spacing w:before="200" w:after="80"/>
+      </w:pPr>
+      <w:r>
+        <w:rPr>
+          <w:rFonts w:ascii="맑은 고딕" w:hAnsi="맑은 고딕" w:eastAsia="맑은 고딕"/>
+          <w:b/>
+          <w:i w:val="0"/>
+          <w:color w:val="1E407C"/>
+          <w:sz w:val="26"/>
+        </w:rPr>
+        <w:t>누가 투자를 멈추나</w:t>
+      </w:r>
+    </w:p>
+    <w:p>
+      <w:pPr>
+        <w:spacing w:after="50" w:before="0" w:line="276" w:lineRule="auto"/>
+        <w:ind w:left="312" w:hanging="198"/>
+      </w:pPr>
+      <w:r>
+        <w:rPr>
+          <w:rFonts w:ascii="맑은 고딕" w:hAnsi="맑은 고딕" w:eastAsia="맑은 고딕"/>
+          <w:b w:val="0"/>
+          <w:i w:val="0"/>
+          <w:color w:val="1E407C"/>
+          <w:sz w:val="22"/>
+        </w:rPr>
+        <w:t xml:space="preserve">• </w:t>
+      </w:r>
+      <w:r>
+        <w:rPr>
+          <w:rFonts w:ascii="맑은 고딕" w:hAnsi="맑은 고딕" w:eastAsia="맑은 고딕"/>
+          <w:b w:val="0"/>
+          <w:i w:val="0"/>
+          <w:color w:val="1A1A1A"/>
+          <w:sz w:val="22"/>
+        </w:rPr>
+        <w:t>5월 29일 KB증권 하반기 전망 Gravity Rules. 130년, 세 번의 버블 붕괴(1930년대, 1970년대, 2000년).</w:t>
+      </w:r>
+    </w:p>
+    <w:p>
+      <w:pPr>
+        <w:spacing w:after="50" w:before="0" w:line="276" w:lineRule="auto"/>
+        <w:ind w:left="312" w:hanging="198"/>
+      </w:pPr>
+      <w:r>
+        <w:rPr>
+          <w:rFonts w:ascii="맑은 고딕" w:hAnsi="맑은 고딕" w:eastAsia="맑은 고딕"/>
+          <w:b w:val="0"/>
+          <w:i w:val="0"/>
+          <w:color w:val="1E407C"/>
+          <w:sz w:val="22"/>
+        </w:rPr>
+        <w:t xml:space="preserve">• </w:t>
+      </w:r>
+      <w:r>
+        <w:rPr>
+          <w:rFonts w:ascii="맑은 고딕" w:hAnsi="맑은 고딕" w:eastAsia="맑은 고딕"/>
+          <w:b w:val="0"/>
+          <w:i w:val="0"/>
+          <w:color w:val="1A1A1A"/>
+          <w:sz w:val="22"/>
+        </w:rPr>
+        <w:t>공통점은 추세적인 금리 상승. 기준금리보다 지금은 시장금리, 10년물이 낫다. 기준금리의 역할이 줄었다.</w:t>
+      </w:r>
+    </w:p>
+    <w:p>
+      <w:pPr>
+        <w:spacing w:after="50" w:before="0" w:line="276" w:lineRule="auto"/>
+        <w:ind w:left="312" w:hanging="198"/>
+      </w:pPr>
+      <w:r>
+        <w:rPr>
+          <w:rFonts w:ascii="맑은 고딕" w:hAnsi="맑은 고딕" w:eastAsia="맑은 고딕"/>
+          <w:b w:val="0"/>
+          <w:i w:val="0"/>
+          <w:color w:val="1E407C"/>
+          <w:sz w:val="22"/>
+        </w:rPr>
+        <w:t xml:space="preserve">• </w:t>
+      </w:r>
+      <w:r>
+        <w:rPr>
+          <w:rFonts w:ascii="맑은 고딕" w:hAnsi="맑은 고딕" w:eastAsia="맑은 고딕"/>
+          <w:b w:val="0"/>
+          <w:i w:val="0"/>
+          <w:color w:val="1A1A1A"/>
+          <w:sz w:val="22"/>
+        </w:rPr>
+        <w:t>빅테크는 스케일링·AGI 선점·플랫폼·매몰비용 때문에 캡엑스를 스스로 못 멈춘다. 꺾는 쪽은 자본공급자(은행·보험·국부펀드, 채권을 받아 주는 쪽).</w:t>
+      </w:r>
+    </w:p>
+    <w:p>
+      <w:pPr>
+        <w:spacing w:after="50" w:before="0" w:line="276" w:lineRule="auto"/>
+        <w:ind w:left="312" w:hanging="198"/>
+      </w:pPr>
+      <w:r>
+        <w:rPr>
+          <w:rFonts w:ascii="맑은 고딕" w:hAnsi="맑은 고딕" w:eastAsia="맑은 고딕"/>
+          <w:b w:val="0"/>
+          <w:i w:val="0"/>
+          <w:color w:val="1E407C"/>
+          <w:sz w:val="22"/>
+        </w:rPr>
+        <w:t xml:space="preserve">• </w:t>
+      </w:r>
+      <w:r>
+        <w:rPr>
+          <w:rFonts w:ascii="맑은 고딕" w:hAnsi="맑은 고딕" w:eastAsia="맑은 고딕"/>
+          <w:b w:val="0"/>
+          <w:i w:val="0"/>
+          <w:color w:val="1A1A1A"/>
+          <w:sz w:val="22"/>
+        </w:rPr>
+        <w:t>사실: 7/22 알파벳 2026 캡엑스 $180–190B → $195–205B, 2027도 더 늘린다. 다음날 주가 약 −7%. 캡엑스 증액이 안심이 되지 않은 날이다.</w:t>
+      </w:r>
+    </w:p>
+    <w:p>
+      <w:pPr>
+        <w:spacing w:after="50" w:before="0" w:line="276" w:lineRule="auto"/>
+        <w:ind w:left="312" w:hanging="198"/>
+      </w:pPr>
+      <w:r>
+        <w:rPr>
+          <w:rFonts w:ascii="맑은 고딕" w:hAnsi="맑은 고딕" w:eastAsia="맑은 고딕"/>
+          <w:b w:val="0"/>
+          <w:i w:val="0"/>
+          <w:color w:val="1E407C"/>
+          <w:sz w:val="22"/>
+        </w:rPr>
+        <w:t xml:space="preserve">• </w:t>
+      </w:r>
+      <w:r>
+        <w:rPr>
+          <w:rFonts w:ascii="맑은 고딕" w:hAnsi="맑은 고딕" w:eastAsia="맑은 고딕"/>
+          <w:b w:val="0"/>
+          <w:i w:val="0"/>
+          <w:color w:val="1A1A1A"/>
+          <w:sz w:val="22"/>
+        </w:rPr>
+        <w:t>그래서 앞으로 붕괴를 볼 때도 ‘AI 캡엑스를 줄이느냐’ ‘반도체 실적이 좋으냐’는 핵심 변수가 아니다.</w:t>
+      </w:r>
+    </w:p>
+    <w:p>
+      <w:pPr>
+        <w:spacing w:before="200" w:after="80"/>
+      </w:pPr>
+      <w:r>
+        <w:rPr>
+          <w:rFonts w:ascii="맑은 고딕" w:hAnsi="맑은 고딕" w:eastAsia="맑은 고딕"/>
+          <w:b/>
+          <w:i w:val="0"/>
+          <w:color w:val="1E407C"/>
+          <w:sz w:val="26"/>
+        </w:rPr>
+        <w:t>두 조건, 둘 다여야 한다</w:t>
+      </w:r>
+    </w:p>
+    <w:tbl>
+      <w:tblPr>
+        <w:tblW w:type="auto" w:w="0"/>
+        <w:jc w:val="center"/>
+        <w:tblLayout w:type="autofit"/>
+        <w:tblLook w:firstColumn="1" w:firstRow="1" w:lastColumn="0" w:lastRow="0" w:noHBand="0" w:noVBand="1" w:val="04A0"/>
+        <w:tblBorders>
+          <w:top w:val="single" w:sz="4" w:space="0" w:color="D5DCE6"/>
+          <w:left w:val="single" w:sz="4" w:space="0" w:color="D5DCE6"/>
+          <w:bottom w:val="single" w:sz="4" w:space="0" w:color="D5DCE6"/>
+          <w:right w:val="single" w:sz="4" w:space="0" w:color="D5DCE6"/>
+          <w:insideH w:val="single" w:sz="4" w:space="0" w:color="D5DCE6"/>
+          <w:insideV w:val="single" w:sz="4" w:space="0" w:color="D5DCE6"/>
+        </w:tblBorders>
+      </w:tblPr>
+      <w:tblGrid>
+        <w:gridCol w:w="3364"/>
+        <w:gridCol w:w="3364"/>
+        <w:gridCol w:w="3364"/>
+      </w:tblGrid>
+      <w:tr>
+        <w:trPr>
+          <w:cantSplit/>
+        </w:trPr>
+        <w:tc>
+          <w:tcPr>
+            <w:tcW w:type="dxa" w:w="2381"/>
+            <w:shd w:val="clear" w:color="auto" w:fill="0F2043"/>
+            <w:tcMar>
+              <w:top w:w="60" w:type="dxa"/>
+              <w:left w:w="80" w:type="dxa"/>
+              <w:bottom w:w="60" w:type="dxa"/>
+              <w:right w:w="80" w:type="dxa"/>
+            </w:tcMar>
+          </w:tcPr>
+          <w:p>
+            <w:pPr>
+              <w:spacing w:before="0" w:after="0" w:line="269" w:lineRule="auto"/>
+              <w:jc w:val="center"/>
+            </w:pPr>
+            <w:r/>
+            <w:r>
+              <w:rPr>
+                <w:rFonts w:ascii="맑은 고딕" w:hAnsi="맑은 고딕" w:eastAsia="맑은 고딕"/>
+                <w:b/>
+                <w:i w:val="0"/>
+                <w:color w:val="FFFFFF"/>
+                <w:sz w:val="19"/>
+              </w:rPr>
+              <w:t>조건</w:t>
+            </w:r>
+          </w:p>
+        </w:tc>
+        <w:tc>
+          <w:tcPr>
+            <w:tcW w:type="dxa" w:w="4082"/>
+            <w:shd w:val="clear" w:color="auto" w:fill="0F2043"/>
+            <w:tcMar>
+              <w:top w:w="60" w:type="dxa"/>
+              <w:left w:w="80" w:type="dxa"/>
+              <w:bottom w:w="60" w:type="dxa"/>
+              <w:right w:w="80" w:type="dxa"/>
+            </w:tcMar>
+          </w:tcPr>
+          <w:p>
+            <w:pPr>
+              <w:spacing w:before="0" w:after="0" w:line="269" w:lineRule="auto"/>
+              <w:jc w:val="center"/>
+            </w:pPr>
+            <w:r/>
+            <w:r>
+              <w:rPr>
+                <w:rFonts w:ascii="맑은 고딕" w:hAnsi="맑은 고딕" w:eastAsia="맑은 고딕"/>
+                <w:b/>
+                <w:i w:val="0"/>
+                <w:color w:val="FFFFFF"/>
+                <w:sz w:val="19"/>
+              </w:rPr>
+              <w:t>뜻</w:t>
+            </w:r>
+          </w:p>
+        </w:tc>
+        <w:tc>
+          <w:tcPr>
+            <w:tcW w:type="dxa" w:w="3515"/>
+            <w:shd w:val="clear" w:color="auto" w:fill="0F2043"/>
+            <w:tcMar>
+              <w:top w:w="60" w:type="dxa"/>
+              <w:left w:w="80" w:type="dxa"/>
+              <w:bottom w:w="60" w:type="dxa"/>
+              <w:right w:w="80" w:type="dxa"/>
+            </w:tcMar>
+          </w:tcPr>
+          <w:p>
+            <w:pPr>
+              <w:spacing w:before="0" w:after="0" w:line="269" w:lineRule="auto"/>
+              <w:jc w:val="center"/>
+            </w:pPr>
+            <w:r/>
+            <w:r>
+              <w:rPr>
+                <w:rFonts w:ascii="맑은 고딕" w:hAnsi="맑은 고딕" w:eastAsia="맑은 고딕"/>
+                <w:b/>
+                <w:i w:val="0"/>
+                <w:color w:val="FFFFFF"/>
+                <w:sz w:val="19"/>
+              </w:rPr>
+              <w:t>오늘</w:t>
+            </w:r>
+          </w:p>
+        </w:tc>
+      </w:tr>
+      <w:tr>
+        <w:trPr>
+          <w:cantSplit/>
+        </w:trPr>
+        <w:tc>
+          <w:tcPr>
+            <w:tcW w:type="dxa" w:w="2381"/>
+            <w:shd w:val="clear" w:color="auto" w:fill="FFFFFF"/>
+            <w:tcMar>
+              <w:top w:w="60" w:type="dxa"/>
+              <w:left w:w="80" w:type="dxa"/>
+              <w:bottom w:w="60" w:type="dxa"/>
+              <w:right w:w="80" w:type="dxa"/>
+            </w:tcMar>
+          </w:tcPr>
+          <w:p>
+            <w:pPr>
+              <w:spacing w:before="0" w:after="0" w:line="269" w:lineRule="auto"/>
+              <w:jc w:val="left"/>
+            </w:pPr>
+            <w:r/>
+            <w:r>
+              <w:rPr>
+                <w:rFonts w:ascii="맑은 고딕" w:hAnsi="맑은 고딕" w:eastAsia="맑은 고딕"/>
+                <w:b/>
+                <w:i w:val="0"/>
+                <w:color w:val="1A1A1A"/>
+                <w:sz w:val="19"/>
+              </w:rPr>
+              <w:t>Breaking New Highs</w:t>
+            </w:r>
+          </w:p>
+        </w:tc>
+        <w:tc>
+          <w:tcPr>
+            <w:tcW w:type="dxa" w:w="4082"/>
+            <w:shd w:val="clear" w:color="auto" w:fill="FFFFFF"/>
+            <w:tcMar>
+              <w:top w:w="60" w:type="dxa"/>
+              <w:left w:w="80" w:type="dxa"/>
+              <w:bottom w:w="60" w:type="dxa"/>
+              <w:right w:w="80" w:type="dxa"/>
+            </w:tcMar>
+          </w:tcPr>
+          <w:p>
+            <w:pPr>
+              <w:spacing w:before="0" w:after="0" w:line="269" w:lineRule="auto"/>
+              <w:jc w:val="center"/>
+            </w:pPr>
+            <w:r/>
+            <w:r>
+              <w:rPr>
+                <w:rFonts w:ascii="맑은 고딕" w:hAnsi="맑은 고딕" w:eastAsia="맑은 고딕"/>
+                <w:b w:val="0"/>
+                <w:i w:val="0"/>
+                <w:color w:val="1A1A1A"/>
+                <w:sz w:val="19"/>
+              </w:rPr>
+              <w:t>10~20년 만에 처음 보는 금리. 5.0~5.3%를 추세로</w:t>
+            </w:r>
+          </w:p>
+        </w:tc>
+        <w:tc>
+          <w:tcPr>
+            <w:tcW w:type="dxa" w:w="3515"/>
+            <w:shd w:val="clear" w:color="auto" w:fill="FFFFFF"/>
+            <w:tcMar>
+              <w:top w:w="60" w:type="dxa"/>
+              <w:left w:w="80" w:type="dxa"/>
+              <w:bottom w:w="60" w:type="dxa"/>
+              <w:right w:w="80" w:type="dxa"/>
+            </w:tcMar>
+          </w:tcPr>
+          <w:p>
+            <w:pPr>
+              <w:spacing w:before="0" w:after="0" w:line="269" w:lineRule="auto"/>
+              <w:jc w:val="center"/>
+            </w:pPr>
+            <w:r/>
+            <w:r>
+              <w:rPr>
+                <w:rFonts w:ascii="맑은 고딕" w:hAnsi="맑은 고딕" w:eastAsia="맑은 고딕"/>
+                <w:b w:val="0"/>
+                <w:i w:val="0"/>
+                <w:color w:val="1A1A1A"/>
+                <w:sz w:val="19"/>
+              </w:rPr>
+              <w:t>주중 5.041 터치, 금 4.951. 해제</w:t>
+            </w:r>
+          </w:p>
+        </w:tc>
+      </w:tr>
+      <w:tr>
+        <w:trPr>
+          <w:cantSplit/>
+        </w:trPr>
+        <w:tc>
+          <w:tcPr>
+            <w:tcW w:type="dxa" w:w="2381"/>
+            <w:shd w:val="clear" w:color="auto" w:fill="F7F9FC"/>
+            <w:tcMar>
+              <w:top w:w="60" w:type="dxa"/>
+              <w:left w:w="80" w:type="dxa"/>
+              <w:bottom w:w="60" w:type="dxa"/>
+              <w:right w:w="80" w:type="dxa"/>
+            </w:tcMar>
+          </w:tcPr>
+          <w:p>
+            <w:pPr>
+              <w:spacing w:before="0" w:after="0" w:line="269" w:lineRule="auto"/>
+              <w:jc w:val="left"/>
+            </w:pPr>
+            <w:r/>
+            <w:r>
+              <w:rPr>
+                <w:rFonts w:ascii="맑은 고딕" w:hAnsi="맑은 고딕" w:eastAsia="맑은 고딕"/>
+                <w:b/>
+                <w:i w:val="0"/>
+                <w:color w:val="1A1A1A"/>
+                <w:sz w:val="19"/>
+              </w:rPr>
+              <w:t>No Way Back</w:t>
+            </w:r>
+          </w:p>
+        </w:tc>
+        <w:tc>
+          <w:tcPr>
+            <w:tcW w:type="dxa" w:w="4082"/>
+            <w:shd w:val="clear" w:color="auto" w:fill="F7F9FC"/>
+            <w:tcMar>
+              <w:top w:w="60" w:type="dxa"/>
+              <w:left w:w="80" w:type="dxa"/>
+              <w:bottom w:w="60" w:type="dxa"/>
+              <w:right w:w="80" w:type="dxa"/>
+            </w:tcMar>
+          </w:tcPr>
+          <w:p>
+            <w:pPr>
+              <w:spacing w:before="0" w:after="0" w:line="269" w:lineRule="auto"/>
+              <w:jc w:val="center"/>
+            </w:pPr>
+            <w:r/>
+            <w:r>
+              <w:rPr>
+                <w:rFonts w:ascii="맑은 고딕" w:hAnsi="맑은 고딕" w:eastAsia="맑은 고딕"/>
+                <w:b w:val="0"/>
+                <w:i w:val="0"/>
+                <w:color w:val="1A1A1A"/>
+                <w:sz w:val="19"/>
+              </w:rPr>
+              <w:t>금리가 다시 못 내려온다. 인플레가 외통수</w:t>
+            </w:r>
+          </w:p>
+        </w:tc>
+        <w:tc>
+          <w:tcPr>
+            <w:tcW w:type="dxa" w:w="3515"/>
+            <w:shd w:val="clear" w:color="auto" w:fill="F7F9FC"/>
+            <w:tcMar>
+              <w:top w:w="60" w:type="dxa"/>
+              <w:left w:w="80" w:type="dxa"/>
+              <w:bottom w:w="60" w:type="dxa"/>
+              <w:right w:w="80" w:type="dxa"/>
+            </w:tcMar>
+          </w:tcPr>
+          <w:p>
+            <w:pPr>
+              <w:spacing w:before="0" w:after="0" w:line="269" w:lineRule="auto"/>
+              <w:jc w:val="center"/>
+            </w:pPr>
+            <w:r/>
+            <w:r>
+              <w:rPr>
+                <w:rFonts w:ascii="맑은 고딕" w:hAnsi="맑은 고딕" w:eastAsia="맑은 고딕"/>
+                <w:b w:val="0"/>
+                <w:i w:val="0"/>
+                <w:color w:val="1A1A1A"/>
+                <w:sz w:val="19"/>
+              </w:rPr>
+              <w:t>아직 아님. 코어는 하향</w:t>
+            </w:r>
+          </w:p>
+        </w:tc>
+      </w:tr>
+    </w:tbl>
+    <w:p>
+      <w:pPr>
+        <w:spacing w:after="160" w:before="40"/>
+      </w:pPr>
+    </w:p>
+    <w:p>
+      <w:pPr>
+        <w:spacing w:after="50" w:before="0" w:line="276" w:lineRule="auto"/>
+        <w:ind w:left="312" w:hanging="198"/>
+      </w:pPr>
+      <w:r>
+        <w:rPr>
+          <w:rFonts w:ascii="맑은 고딕" w:hAnsi="맑은 고딕" w:eastAsia="맑은 고딕"/>
+          <w:b w:val="0"/>
+          <w:i w:val="0"/>
+          <w:color w:val="1E407C"/>
+          <w:sz w:val="22"/>
+        </w:rPr>
+        <w:t xml:space="preserve">• </w:t>
+      </w:r>
+      <w:r>
+        <w:rPr>
+          <w:rFonts w:ascii="맑은 고딕" w:hAnsi="맑은 고딕" w:eastAsia="맑은 고딕"/>
+          <w:b w:val="0"/>
+          <w:i w:val="0"/>
+          <w:color w:val="1A1A1A"/>
+          <w:sz w:val="22"/>
+        </w:rPr>
+        <w:t>5.0은 터치가 아니다. 레인지를 추세로 넘어야 한다. 5.3은 20년 고점 + 주식 밸류가 나빠지기 시작하는 구간.</w:t>
+      </w:r>
+    </w:p>
+    <w:p>
+      <w:pPr>
+        <w:spacing w:after="50" w:before="0" w:line="276" w:lineRule="auto"/>
+        <w:ind w:left="312" w:hanging="198"/>
+      </w:pPr>
+      <w:r>
+        <w:rPr>
+          <w:rFonts w:ascii="맑은 고딕" w:hAnsi="맑은 고딕" w:eastAsia="맑은 고딕"/>
+          <w:b w:val="0"/>
+          <w:i w:val="0"/>
+          <w:color w:val="1E407C"/>
+          <w:sz w:val="22"/>
+        </w:rPr>
+        <w:t xml:space="preserve">• </w:t>
+      </w:r>
+      <w:r>
+        <w:rPr>
+          <w:rFonts w:ascii="맑은 고딕" w:hAnsi="맑은 고딕" w:eastAsia="맑은 고딕"/>
+          <w:b w:val="0"/>
+          <w:i w:val="0"/>
+          <w:color w:val="1A1A1A"/>
+          <w:sz w:val="22"/>
+        </w:rPr>
+        <w:t>5.0만 넘어도 레인지 안에서는 위험 신호다. 그러나 AND다. 하나만으로는 안 된다.</w:t>
+      </w:r>
+    </w:p>
+    <w:p>
+      <w:pPr>
+        <w:spacing w:after="50" w:before="0" w:line="276" w:lineRule="auto"/>
+        <w:ind w:left="312" w:hanging="198"/>
+      </w:pPr>
+      <w:r>
+        <w:rPr>
+          <w:rFonts w:ascii="맑은 고딕" w:hAnsi="맑은 고딕" w:eastAsia="맑은 고딕"/>
+          <w:b w:val="0"/>
+          <w:i w:val="0"/>
+          <w:color w:val="1E407C"/>
+          <w:sz w:val="22"/>
+        </w:rPr>
+        <w:t xml:space="preserve">• </w:t>
+      </w:r>
+      <w:r>
+        <w:rPr>
+          <w:rFonts w:ascii="맑은 고딕" w:hAnsi="맑은 고딕" w:eastAsia="맑은 고딕"/>
+          <w:b w:val="0"/>
+          <w:i w:val="0"/>
+          <w:color w:val="1A1A1A"/>
+          <w:sz w:val="22"/>
+        </w:rPr>
+        <w:t>5.5를 찍고도 전쟁·유가가 끝나면 내려온다고 보면 주가는 다시 오른다. 일시적 충격은 붕괴가 아니다.</w:t>
+      </w:r>
+    </w:p>
+    <w:p>
+      <w:pPr>
+        <w:spacing w:after="50" w:before="0" w:line="276" w:lineRule="auto"/>
+        <w:ind w:left="312" w:hanging="198"/>
+      </w:pPr>
+      <w:r>
+        <w:rPr>
+          <w:rFonts w:ascii="맑은 고딕" w:hAnsi="맑은 고딕" w:eastAsia="맑은 고딕"/>
+          <w:b w:val="0"/>
+          <w:i w:val="0"/>
+          <w:color w:val="1E407C"/>
+          <w:sz w:val="22"/>
+        </w:rPr>
+        <w:t xml:space="preserve">• </w:t>
+      </w:r>
+      <w:r>
+        <w:rPr>
+          <w:rFonts w:ascii="맑은 고딕" w:hAnsi="맑은 고딕" w:eastAsia="맑은 고딕"/>
+          <w:b w:val="0"/>
+          <w:i w:val="0"/>
+          <w:color w:val="1A1A1A"/>
+          <w:sz w:val="22"/>
+        </w:rPr>
+        <w:t>과거 세 번 중 두 번의 No Way Back은 인플레였다. 물가가 치고 올라오면 완화로 풀 수 없다. 바둑의 외통수.</w:t>
+      </w:r>
+    </w:p>
+    <w:p>
+      <w:pPr>
+        <w:spacing w:after="50" w:before="0" w:line="276" w:lineRule="auto"/>
+        <w:ind w:left="312" w:hanging="198"/>
+      </w:pPr>
+      <w:r>
+        <w:rPr>
+          <w:rFonts w:ascii="맑은 고딕" w:hAnsi="맑은 고딕" w:eastAsia="맑은 고딕"/>
+          <w:b w:val="0"/>
+          <w:i w:val="0"/>
+          <w:color w:val="1E407C"/>
+          <w:sz w:val="22"/>
+        </w:rPr>
+        <w:t xml:space="preserve">• </w:t>
+      </w:r>
+      <w:r>
+        <w:rPr>
+          <w:rFonts w:ascii="맑은 고딕" w:hAnsi="맑은 고딕" w:eastAsia="맑은 고딕"/>
+          <w:b w:val="0"/>
+          <w:i w:val="0"/>
+          <w:color w:val="1A1A1A"/>
+          <w:sz w:val="22"/>
+        </w:rPr>
+        <w:t>부분: 이사는 물가가 3.0→2.8→2.7→2.6으로 내려간다고 했다. 8월 헤드라인 CPI는 3.4% 횡보. 코어만 2.5→2.4. 유가 뺀 그림이다.</w:t>
+      </w:r>
+    </w:p>
+    <w:p>
+      <w:pPr>
+        <w:spacing w:after="50" w:before="0" w:line="276" w:lineRule="auto"/>
+        <w:ind w:left="312" w:hanging="198"/>
+      </w:pPr>
+      <w:r>
+        <w:rPr>
+          <w:rFonts w:ascii="맑은 고딕" w:hAnsi="맑은 고딕" w:eastAsia="맑은 고딕"/>
+          <w:b w:val="0"/>
+          <w:i w:val="0"/>
+          <w:color w:val="1E407C"/>
+          <w:sz w:val="22"/>
+        </w:rPr>
+        <w:t xml:space="preserve">• </w:t>
+      </w:r>
+      <w:r>
+        <w:rPr>
+          <w:rFonts w:ascii="맑은 고딕" w:hAnsi="맑은 고딕" w:eastAsia="맑은 고딕"/>
+          <w:b w:val="0"/>
+          <w:i w:val="0"/>
+          <w:color w:val="1A1A1A"/>
+          <w:sz w:val="22"/>
+        </w:rPr>
+        <w:t>워시는 인플레 파이터로 말했지만, 시장 컨센서스는 연내 한 번 더 하고 내년 동결. 유가 빼면 2%대 중반으로 안정된다는 전제.</w:t>
+      </w:r>
+    </w:p>
+    <w:p>
+      <w:pPr>
+        <w:spacing w:after="50" w:before="0" w:line="276" w:lineRule="auto"/>
+        <w:ind w:left="312" w:hanging="198"/>
+      </w:pPr>
+      <w:r>
+        <w:rPr>
+          <w:rFonts w:ascii="맑은 고딕" w:hAnsi="맑은 고딕" w:eastAsia="맑은 고딕"/>
+          <w:b w:val="0"/>
+          <w:i w:val="0"/>
+          <w:color w:val="1E407C"/>
+          <w:sz w:val="22"/>
+        </w:rPr>
+        <w:t xml:space="preserve">• </w:t>
+      </w:r>
+      <w:r>
+        <w:rPr>
+          <w:rFonts w:ascii="맑은 고딕" w:hAnsi="맑은 고딕" w:eastAsia="맑은 고딕"/>
+          <w:b w:val="0"/>
+          <w:i w:val="0"/>
+          <w:color w:val="1A1A1A"/>
+          <w:sz w:val="22"/>
+        </w:rPr>
+        <w:t>5월 노트에는 세 번째 시그널도 있다. OpenAI IPO 실패. 오늘 방송에는 안 나왔다. 쓰지 말 것.</w:t>
+      </w:r>
+    </w:p>
+    <w:tbl>
+      <w:tblPr>
+        <w:tblW w:type="auto" w:w="0"/>
+        <w:jc w:val="center"/>
+        <w:tblLayout w:type="autofit"/>
+        <w:tblLook w:firstColumn="1" w:firstRow="1" w:lastColumn="0" w:lastRow="0" w:noHBand="0" w:noVBand="1" w:val="04A0"/>
+      </w:tblPr>
+      <w:tblGrid>
+        <w:gridCol w:w="10092"/>
+      </w:tblGrid>
+      <w:tr>
+        <w:tc>
+          <w:tcPr>
+            <w:tcW w:type="dxa" w:w="10092"/>
+            <w:shd w:val="clear" w:color="auto" w:fill="EEF2F8"/>
+            <w:tcBorders>
+              <w:top w:val="nil"/>
+              <w:left w:val="single" w:sz="28" w:space="0" w:color="0F2043"/>
+              <w:bottom w:val="nil"/>
+              <w:right w:val="nil"/>
+            </w:tcBorders>
+            <w:tcMar>
+              <w:top w:w="80" w:type="dxa"/>
+              <w:left w:w="120" w:type="dxa"/>
+              <w:bottom w:w="80" w:type="dxa"/>
+              <w:right w:w="120" w:type="dxa"/>
+            </w:tcMar>
+          </w:tcPr>
+          <w:p>
+            <w:pPr>
+              <w:spacing w:after="40" w:before="0"/>
+            </w:pPr>
+            <w:r/>
+            <w:r>
+              <w:rPr>
+                <w:rFonts w:ascii="맑은 고딕" w:hAnsi="맑은 고딕" w:eastAsia="맑은 고딕"/>
+                <w:b/>
+                <w:i w:val="0"/>
+                <w:color w:val="0F2043"/>
+                <w:sz w:val="20"/>
+              </w:rPr>
+              <w:t>결론</w:t>
+            </w:r>
+          </w:p>
+          <w:p>
+            <w:pPr>
+              <w:spacing w:after="20" w:before="0" w:line="276" w:lineRule="auto"/>
+            </w:pPr>
+            <w:r>
+              <w:rPr>
+                <w:rFonts w:ascii="맑은 고딕" w:hAnsi="맑은 고딕" w:eastAsia="맑은 고딕"/>
+                <w:b w:val="0"/>
+                <w:i w:val="0"/>
+                <w:color w:val="1A1A1A"/>
+                <w:sz w:val="21"/>
+              </w:rPr>
+              <w:t>지금은 붕괴 조건이 아니다. 5%는 위험 신호이지 방아쇠가 아니다. 빈센트의 ‘5% 집착 말 것’과 같은 방향, 다른 문법이다.</w:t>
+            </w:r>
+          </w:p>
+        </w:tc>
+      </w:tr>
+    </w:tbl>
+    <w:p>
+      <w:pPr>
+        <w:spacing w:after="120"/>
+      </w:pPr>
+    </w:p>
+    <w:p>
+      <w:pPr>
+        <w:spacing w:before="280" w:after="160" w:line="264" w:lineRule="auto"/>
+        <w:pBdr>
+          <w:bottom w:val="single" w:sz="12" w:space="4" w:color="0F2043"/>
+        </w:pBdr>
+      </w:pPr>
+      <w:r>
+        <w:rPr>
+          <w:rFonts w:ascii="맑은 고딕" w:hAnsi="맑은 고딕" w:eastAsia="맑은 고딕"/>
+          <w:b/>
+          <w:i w:val="0"/>
+          <w:color w:val="B8943A"/>
+          <w:sz w:val="32"/>
+        </w:rPr>
+        <w:t xml:space="preserve">5.  </w:t>
+      </w:r>
+      <w:r>
+        <w:rPr>
+          <w:rFonts w:ascii="맑은 고딕" w:hAnsi="맑은 고딕" w:eastAsia="맑은 고딕"/>
+          <w:b/>
+          <w:i w:val="0"/>
+          <w:color w:val="0F2043"/>
+          <w:sz w:val="32"/>
+        </w:rPr>
+        <w:t>꿀팁 — 고통지수의 왕, 주가가 GDP를 선행</w:t>
+      </w:r>
+    </w:p>
+    <w:p>
+      <w:pPr>
+        <w:spacing w:before="40" w:after="160"/>
+        <w:jc w:val="center"/>
+      </w:pPr>
+      <w:r>
+        <w:drawing>
+          <wp:inline xmlns:a="http://schemas.openxmlformats.org/drawingml/2006/main" xmlns:pic="http://schemas.openxmlformats.org/drawingml/2006/picture">
+            <wp:extent cx="5903999" cy="2726135"/>
+            <wp:docPr id="6" name="Picture 6"/>
+            <wp:cNvGraphicFramePr>
+              <a:graphicFrameLocks noChangeAspect="1"/>
+            </wp:cNvGraphicFramePr>
+            <a:graphic>
+              <a:graphicData uri="http://schemas.openxmlformats.org/drawingml/2006/picture">
+                <pic:pic>
+                  <pic:nvPicPr>
+                    <pic:cNvPr id="0" name="12_misery_lead.png"/>
+                    <pic:cNvPicPr/>
+                  </pic:nvPicPr>
+                  <pic:blipFill>
+                    <a:blip r:embed="rId16"/>
+                    <a:stretch>
+                      <a:fillRect/>
+                    </a:stretch>
+                  </pic:blipFill>
+                  <pic:spPr>
+                    <a:xfrm>
+                      <a:off x="0" y="0"/>
+                      <a:ext cx="5903999" cy="2726135"/>
+                    </a:xfrm>
+                    <a:prstGeom prst="rect"/>
+                  </pic:spPr>
+                </pic:pic>
+              </a:graphicData>
+            </a:graphic>
+          </wp:inline>
+        </w:drawing>
+      </w:r>
+    </w:p>
+    <w:p>
+      <w:pPr>
+        <w:spacing w:before="40" w:after="160"/>
+        <w:jc w:val="center"/>
+      </w:pPr>
+      <w:r>
+        <w:drawing>
+          <wp:inline xmlns:a="http://schemas.openxmlformats.org/drawingml/2006/main" xmlns:pic="http://schemas.openxmlformats.org/drawingml/2006/picture">
+            <wp:extent cx="5903999" cy="2815603"/>
+            <wp:docPr id="7" name="Picture 7"/>
+            <wp:cNvGraphicFramePr>
+              <a:graphicFrameLocks noChangeAspect="1"/>
+            </wp:cNvGraphicFramePr>
+            <a:graphic>
+              <a:graphicData uri="http://schemas.openxmlformats.org/drawingml/2006/picture">
+                <pic:pic>
+                  <pic:nvPicPr>
+                    <pic:cNvPr id="0" name="07_korea_gdp.png"/>
+                    <pic:cNvPicPr/>
+                  </pic:nvPicPr>
+                  <pic:blipFill>
+                    <a:blip r:embed="rId17"/>
+                    <a:stretch>
+                      <a:fillRect/>
+                    </a:stretch>
+                  </pic:blipFill>
+                  <pic:spPr>
+                    <a:xfrm>
+                      <a:off x="0" y="0"/>
+                      <a:ext cx="5903999" cy="2815603"/>
+                    </a:xfrm>
+                    <a:prstGeom prst="rect"/>
+                  </pic:spPr>
+                </pic:pic>
+              </a:graphicData>
+            </a:graphic>
+          </wp:inline>
+        </w:drawing>
+      </w:r>
+    </w:p>
+    <w:p>
+      <w:pPr>
+        <w:spacing w:before="200" w:after="80"/>
+      </w:pPr>
+      <w:r>
+        <w:rPr>
+          <w:rFonts w:ascii="맑은 고딕" w:hAnsi="맑은 고딕" w:eastAsia="맑은 고딕"/>
+          <w:b/>
+          <w:i w:val="0"/>
+          <w:color w:val="1E407C"/>
+          <w:sz w:val="26"/>
+        </w:rPr>
+        <w:t>주식용: 오쿤 고통지수</w:t>
+      </w:r>
+    </w:p>
+    <w:p>
+      <w:pPr>
+        <w:spacing w:after="50" w:before="0" w:line="276" w:lineRule="auto"/>
+        <w:ind w:left="312" w:hanging="198"/>
+      </w:pPr>
+      <w:r>
+        <w:rPr>
+          <w:rFonts w:ascii="맑은 고딕" w:hAnsi="맑은 고딕" w:eastAsia="맑은 고딕"/>
+          <w:b w:val="0"/>
+          <w:i w:val="0"/>
+          <w:color w:val="1E407C"/>
+          <w:sz w:val="22"/>
+        </w:rPr>
+        <w:t xml:space="preserve">• </w:t>
+      </w:r>
+      <w:r>
+        <w:rPr>
+          <w:rFonts w:ascii="맑은 고딕" w:hAnsi="맑은 고딕" w:eastAsia="맑은 고딕"/>
+          <w:b w:val="0"/>
+          <w:i w:val="0"/>
+          <w:color w:val="1A1A1A"/>
+          <w:sz w:val="22"/>
+        </w:rPr>
+        <w:t>탑다운에서 제일 중요한 데이터 둘. 실업률과 인플레. 고통지수(Arthur Okun) = 둘의 합.</w:t>
+      </w:r>
+    </w:p>
+    <w:p>
+      <w:pPr>
+        <w:spacing w:after="50" w:before="0" w:line="276" w:lineRule="auto"/>
+        <w:ind w:left="312" w:hanging="198"/>
+      </w:pPr>
+      <w:r>
+        <w:rPr>
+          <w:rFonts w:ascii="맑은 고딕" w:hAnsi="맑은 고딕" w:eastAsia="맑은 고딕"/>
+          <w:b w:val="0"/>
+          <w:i w:val="0"/>
+          <w:color w:val="1E407C"/>
+          <w:sz w:val="22"/>
+        </w:rPr>
+        <w:t xml:space="preserve">• </w:t>
+      </w:r>
+      <w:r>
+        <w:rPr>
+          <w:rFonts w:ascii="맑은 고딕" w:hAnsi="맑은 고딕" w:eastAsia="맑은 고딕"/>
+          <w:b w:val="0"/>
+          <w:i w:val="0"/>
+          <w:color w:val="1A1A1A"/>
+          <w:sz w:val="22"/>
+        </w:rPr>
+        <w:t>GDP가 좋은지보다, 잘리고 물가가 높을 때 사람이 고통스럽다. 그 고통이 주식으로 온다.</w:t>
+      </w:r>
+    </w:p>
+    <w:p>
+      <w:pPr>
+        <w:spacing w:after="50" w:before="0" w:line="276" w:lineRule="auto"/>
+        <w:ind w:left="312" w:hanging="198"/>
+      </w:pPr>
+      <w:r>
+        <w:rPr>
+          <w:rFonts w:ascii="맑은 고딕" w:hAnsi="맑은 고딕" w:eastAsia="맑은 고딕"/>
+          <w:b w:val="0"/>
+          <w:i w:val="0"/>
+          <w:color w:val="1E407C"/>
+          <w:sz w:val="22"/>
+        </w:rPr>
+        <w:t xml:space="preserve">• </w:t>
+      </w:r>
+      <w:r>
+        <w:rPr>
+          <w:rFonts w:ascii="맑은 고딕" w:hAnsi="맑은 고딕" w:eastAsia="맑은 고딕"/>
+          <w:b w:val="0"/>
+          <w:i w:val="0"/>
+          <w:color w:val="1A1A1A"/>
+          <w:sz w:val="22"/>
+        </w:rPr>
+        <w:t>저물가 시대에는 실업률이 왕. 실업이 오르면 판다. 2000, 2008, 팬데믹을 이 규칙만으로도 붕괴 수개월 전에 팔 수 있었다는 주장.</w:t>
+      </w:r>
+    </w:p>
+    <w:p>
+      <w:pPr>
+        <w:spacing w:after="50" w:before="0" w:line="276" w:lineRule="auto"/>
+        <w:ind w:left="312" w:hanging="198"/>
+      </w:pPr>
+      <w:r>
+        <w:rPr>
+          <w:rFonts w:ascii="맑은 고딕" w:hAnsi="맑은 고딕" w:eastAsia="맑은 고딕"/>
+          <w:b w:val="0"/>
+          <w:i w:val="0"/>
+          <w:color w:val="1E407C"/>
+          <w:sz w:val="22"/>
+        </w:rPr>
+        <w:t xml:space="preserve">• </w:t>
+      </w:r>
+      <w:r>
+        <w:rPr>
+          <w:rFonts w:ascii="맑은 고딕" w:hAnsi="맑은 고딕" w:eastAsia="맑은 고딕"/>
+          <w:b w:val="0"/>
+          <w:i w:val="0"/>
+          <w:color w:val="1A1A1A"/>
+          <w:sz w:val="22"/>
+        </w:rPr>
+        <w:t>질문은 ‘GDP가 얼마나 깎이나’가 아니라 ‘실업률이 오르겠나’다. 팬데믹 당시 확진자 → 미국 고용 유연 → 실업↑ → 매도. 4월 이후 언택트·보조금 → 실업↓ → 매수.</w:t>
+      </w:r>
+    </w:p>
+    <w:p>
+      <w:pPr>
+        <w:spacing w:after="50" w:before="0" w:line="276" w:lineRule="auto"/>
+        <w:ind w:left="312" w:hanging="198"/>
+      </w:pPr>
+      <w:r>
+        <w:rPr>
+          <w:rFonts w:ascii="맑은 고딕" w:hAnsi="맑은 고딕" w:eastAsia="맑은 고딕"/>
+          <w:b w:val="0"/>
+          <w:i w:val="0"/>
+          <w:color w:val="1E407C"/>
+          <w:sz w:val="22"/>
+        </w:rPr>
+        <w:t xml:space="preserve">• </w:t>
+      </w:r>
+      <w:r>
+        <w:rPr>
+          <w:rFonts w:ascii="맑은 고딕" w:hAnsi="맑은 고딕" w:eastAsia="맑은 고딕"/>
+          <w:b w:val="0"/>
+          <w:i w:val="0"/>
+          <w:color w:val="1A1A1A"/>
+          <w:sz w:val="22"/>
+        </w:rPr>
+        <w:t>시차는 있다. 2007년 5월 실업 바닥, 6월 발표, 7–8월에 팔아도 11월 붕괴 전이다. 2008에 팔아도 늦지 않다.</w:t>
+      </w:r>
+    </w:p>
+    <w:p>
+      <w:pPr>
+        <w:spacing w:after="50" w:before="0" w:line="276" w:lineRule="auto"/>
+        <w:ind w:left="312" w:hanging="198"/>
+      </w:pPr>
+      <w:r>
+        <w:rPr>
+          <w:rFonts w:ascii="맑은 고딕" w:hAnsi="맑은 고딕" w:eastAsia="맑은 고딕"/>
+          <w:b w:val="0"/>
+          <w:i w:val="0"/>
+          <w:color w:val="1E407C"/>
+          <w:sz w:val="22"/>
+        </w:rPr>
+        <w:t xml:space="preserve">• </w:t>
+      </w:r>
+      <w:r>
+        <w:rPr>
+          <w:rFonts w:ascii="맑은 고딕" w:hAnsi="맑은 고딕" w:eastAsia="맑은 고딕"/>
+          <w:b w:val="0"/>
+          <w:i w:val="0"/>
+          <w:color w:val="1A1A1A"/>
+          <w:sz w:val="22"/>
+        </w:rPr>
+        <w:t>2022년부터는 고물가. 왕이 바뀐다. 2023년 실업이 올라도 주가가 같이 올랐다. 경기침체 논란을 인플레 기준으로 다시 읽어야 한다.</w:t>
+      </w:r>
+    </w:p>
+    <w:p>
+      <w:pPr>
+        <w:spacing w:after="50" w:before="0" w:line="276" w:lineRule="auto"/>
+        <w:ind w:left="312" w:hanging="198"/>
+      </w:pPr>
+      <w:r>
+        <w:rPr>
+          <w:rFonts w:ascii="맑은 고딕" w:hAnsi="맑은 고딕" w:eastAsia="맑은 고딕"/>
+          <w:b w:val="0"/>
+          <w:i w:val="0"/>
+          <w:color w:val="1E407C"/>
+          <w:sz w:val="22"/>
+        </w:rPr>
+        <w:t xml:space="preserve">• </w:t>
+      </w:r>
+      <w:r>
+        <w:rPr>
+          <w:rFonts w:ascii="맑은 고딕" w:hAnsi="맑은 고딕" w:eastAsia="맑은 고딕"/>
+          <w:b w:val="0"/>
+          <w:i w:val="0"/>
+          <w:color w:val="1A1A1A"/>
+          <w:sz w:val="22"/>
+        </w:rPr>
+        <w:t>부분: 2022 공식 — CPI 고점 다음 분기에 산다. 이사는 7월 전후. 실제 고점은 6월 9.1%. S&amp;P 저점 10/12(3,577), 코스피 종가 저점 9/30(2,155.49). 방향은 맞다.</w:t>
+      </w:r>
+    </w:p>
+    <w:p>
+      <w:pPr>
+        <w:spacing w:before="200" w:after="80"/>
+      </w:pPr>
+      <w:r>
+        <w:rPr>
+          <w:rFonts w:ascii="맑은 고딕" w:hAnsi="맑은 고딕" w:eastAsia="맑은 고딕"/>
+          <w:b/>
+          <w:i w:val="0"/>
+          <w:color w:val="1E407C"/>
+          <w:sz w:val="26"/>
+        </w:rPr>
+        <w:t>채권용: 주가가 GDP를 선행</w:t>
+      </w:r>
+    </w:p>
+    <w:p>
+      <w:pPr>
+        <w:spacing w:after="50" w:before="0" w:line="276" w:lineRule="auto"/>
+        <w:ind w:left="312" w:hanging="198"/>
+      </w:pPr>
+      <w:r>
+        <w:rPr>
+          <w:rFonts w:ascii="맑은 고딕" w:hAnsi="맑은 고딕" w:eastAsia="맑은 고딕"/>
+          <w:b w:val="0"/>
+          <w:i w:val="0"/>
+          <w:color w:val="1E407C"/>
+          <w:sz w:val="22"/>
+        </w:rPr>
+        <w:t xml:space="preserve">• </w:t>
+      </w:r>
+      <w:r>
+        <w:rPr>
+          <w:rFonts w:ascii="맑은 고딕" w:hAnsi="맑은 고딕" w:eastAsia="맑은 고딕"/>
+          <w:b w:val="0"/>
+          <w:i w:val="0"/>
+          <w:color w:val="1A1A1A"/>
+          <w:sz w:val="22"/>
+        </w:rPr>
+        <w:t>같은 해 코스피 상승률과 그해 GDP는 약하거나 역의 관계. 경제가 좋다고 그해 주식을 사면 안 된다.</w:t>
+      </w:r>
+    </w:p>
+    <w:p>
+      <w:pPr>
+        <w:spacing w:after="50" w:before="0" w:line="276" w:lineRule="auto"/>
+        <w:ind w:left="312" w:hanging="198"/>
+      </w:pPr>
+      <w:r>
+        <w:rPr>
+          <w:rFonts w:ascii="맑은 고딕" w:hAnsi="맑은 고딕" w:eastAsia="맑은 고딕"/>
+          <w:b w:val="0"/>
+          <w:i w:val="0"/>
+          <w:color w:val="1E407C"/>
+          <w:sz w:val="22"/>
+        </w:rPr>
+        <w:t xml:space="preserve">• </w:t>
+      </w:r>
+      <w:r>
+        <w:rPr>
+          <w:rFonts w:ascii="맑은 고딕" w:hAnsi="맑은 고딕" w:eastAsia="맑은 고딕"/>
+          <w:b w:val="0"/>
+          <w:i w:val="0"/>
+          <w:color w:val="1A1A1A"/>
+          <w:sz w:val="22"/>
+        </w:rPr>
+        <w:t>작년 주가와 올해 GDP는 잘 맞는다. 주가가 6~12개월 선행한다.</w:t>
+      </w:r>
+    </w:p>
+    <w:p>
+      <w:pPr>
+        <w:spacing w:after="50" w:before="0" w:line="276" w:lineRule="auto"/>
+        <w:ind w:left="312" w:hanging="198"/>
+      </w:pPr>
+      <w:r>
+        <w:rPr>
+          <w:rFonts w:ascii="맑은 고딕" w:hAnsi="맑은 고딕" w:eastAsia="맑은 고딕"/>
+          <w:b w:val="0"/>
+          <w:i w:val="0"/>
+          <w:color w:val="1E407C"/>
+          <w:sz w:val="22"/>
+        </w:rPr>
+        <w:t xml:space="preserve">• </w:t>
+      </w:r>
+      <w:r>
+        <w:rPr>
+          <w:rFonts w:ascii="맑은 고딕" w:hAnsi="맑은 고딕" w:eastAsia="맑은 고딕"/>
+          <w:b w:val="0"/>
+          <w:i w:val="0"/>
+          <w:color w:val="1A1A1A"/>
+          <w:sz w:val="22"/>
+        </w:rPr>
+        <w:t>부분: 이사는 작년 코스피 +70%면 연초 한은 1.6~1.8은 낮다고 했다. 실제 2025년은 +75.6%(종가 4,214.17). 한은은 25년 8월 1.6 → 11월 1.8 → 26년 2월 2.0. Citi는 지금 3.7.</w:t>
+      </w:r>
+    </w:p>
+    <w:p>
+      <w:pPr>
+        <w:spacing w:after="50" w:before="0" w:line="276" w:lineRule="auto"/>
+        <w:ind w:left="312" w:hanging="198"/>
+      </w:pPr>
+      <w:r>
+        <w:rPr>
+          <w:rFonts w:ascii="맑은 고딕" w:hAnsi="맑은 고딕" w:eastAsia="맑은 고딕"/>
+          <w:b w:val="0"/>
+          <w:i w:val="0"/>
+          <w:color w:val="1E407C"/>
+          <w:sz w:val="22"/>
+        </w:rPr>
+        <w:t xml:space="preserve">• </w:t>
+      </w:r>
+      <w:r>
+        <w:rPr>
+          <w:rFonts w:ascii="맑은 고딕" w:hAnsi="맑은 고딕" w:eastAsia="맑은 고딕"/>
+          <w:b w:val="0"/>
+          <w:i w:val="0"/>
+          <w:color w:val="1A1A1A"/>
+          <w:sz w:val="22"/>
+        </w:rPr>
+        <w:t>금리는 그 성장 추정치가 올라가는 과정에서 같이 오른다. 한국 10년은 “8부능선”. 국고 종가 4.466%.</w:t>
+      </w:r>
+    </w:p>
+    <w:p>
+      <w:pPr>
+        <w:spacing w:after="50" w:before="0" w:line="276" w:lineRule="auto"/>
+        <w:ind w:left="312" w:hanging="198"/>
+      </w:pPr>
+      <w:r>
+        <w:rPr>
+          <w:rFonts w:ascii="맑은 고딕" w:hAnsi="맑은 고딕" w:eastAsia="맑은 고딕"/>
+          <w:b w:val="0"/>
+          <w:i w:val="0"/>
+          <w:color w:val="1E407C"/>
+          <w:sz w:val="22"/>
+        </w:rPr>
+        <w:t xml:space="preserve">• </w:t>
+      </w:r>
+      <w:r>
+        <w:rPr>
+          <w:rFonts w:ascii="맑은 고딕" w:hAnsi="맑은 고딕" w:eastAsia="맑은 고딕"/>
+          <w:b w:val="0"/>
+          <w:i w:val="0"/>
+          <w:color w:val="1A1A1A"/>
+          <w:sz w:val="22"/>
+        </w:rPr>
+        <w:t>반대로 주가가 폭락하면 이후 6~12개월 성장이 약해진다 → 장기채. 내년 GDP로 지금 주가를 끌 수는 없다. 후행으로 선형을 만들 수 없다.</w:t>
+      </w:r>
+    </w:p>
+    <w:tbl>
+      <w:tblPr>
+        <w:tblW w:type="auto" w:w="0"/>
+        <w:jc w:val="center"/>
+        <w:tblLayout w:type="autofit"/>
+        <w:tblLook w:firstColumn="1" w:firstRow="1" w:lastColumn="0" w:lastRow="0" w:noHBand="0" w:noVBand="1" w:val="04A0"/>
+      </w:tblPr>
+      <w:tblGrid>
+        <w:gridCol w:w="10092"/>
+      </w:tblGrid>
+      <w:tr>
+        <w:tc>
+          <w:tcPr>
+            <w:tcW w:type="dxa" w:w="10092"/>
+            <w:shd w:val="clear" w:color="auto" w:fill="E8F1FB"/>
+            <w:tcBorders>
+              <w:top w:val="nil"/>
+              <w:left w:val="single" w:sz="28" w:space="0" w:color="1E407C"/>
+              <w:bottom w:val="nil"/>
+              <w:right w:val="nil"/>
+            </w:tcBorders>
+            <w:tcMar>
+              <w:top w:w="80" w:type="dxa"/>
+              <w:left w:w="120" w:type="dxa"/>
+              <w:bottom w:w="80" w:type="dxa"/>
+              <w:right w:w="120" w:type="dxa"/>
+            </w:tcMar>
+          </w:tcPr>
+          <w:p>
+            <w:pPr>
+              <w:spacing w:after="40" w:before="0"/>
+            </w:pPr>
+            <w:r/>
+            <w:r>
+              <w:rPr>
+                <w:rFonts w:ascii="맑은 고딕" w:hAnsi="맑은 고딕" w:eastAsia="맑은 고딕"/>
+                <w:b/>
+                <w:i w:val="0"/>
+                <w:color w:val="1E407C"/>
+                <w:sz w:val="20"/>
+              </w:rPr>
+              <w:t>금융주</w:t>
+            </w:r>
+          </w:p>
+          <w:p>
+            <w:pPr>
+              <w:spacing w:after="20" w:before="0" w:line="276" w:lineRule="auto"/>
+            </w:pPr>
+            <w:r>
+              <w:rPr>
+                <w:rFonts w:ascii="맑은 고딕" w:hAnsi="맑은 고딕" w:eastAsia="맑은 고딕"/>
+                <w:b w:val="0"/>
+                <w:i w:val="0"/>
+                <w:color w:val="1A1A1A"/>
+                <w:sz w:val="21"/>
+              </w:rPr>
+              <w:t>주식하는 사람이 채권 금리를 보는 때는 보통 문제가 생겼을 때다. 금리 방향은 은행·보험 트레이딩에 바로 쓴다.</w:t>
+            </w:r>
+          </w:p>
+        </w:tc>
+      </w:tr>
+    </w:tbl>
+    <w:p>
+      <w:pPr>
+        <w:spacing w:after="120"/>
+      </w:pPr>
+    </w:p>
+    <w:p>
+      <w:pPr>
+        <w:spacing w:before="280" w:after="160" w:line="264" w:lineRule="auto"/>
+        <w:pBdr>
+          <w:bottom w:val="single" w:sz="12" w:space="4" w:color="0F2043"/>
+        </w:pBdr>
+      </w:pPr>
+      <w:r>
+        <w:rPr>
+          <w:rFonts w:ascii="맑은 고딕" w:hAnsi="맑은 고딕" w:eastAsia="맑은 고딕"/>
+          <w:b/>
+          <w:i w:val="0"/>
+          <w:color w:val="B8943A"/>
+          <w:sz w:val="32"/>
+        </w:rPr>
+        <w:t xml:space="preserve">6.  </w:t>
+      </w:r>
+      <w:r>
+        <w:rPr>
+          <w:rFonts w:ascii="맑은 고딕" w:hAnsi="맑은 고딕" w:eastAsia="맑은 고딕"/>
+          <w:b/>
+          <w:i w:val="0"/>
+          <w:color w:val="0F2043"/>
+          <w:sz w:val="32"/>
+        </w:rPr>
         <w:t>노드와 플라이휠 — 정지훈</w:t>
       </w:r>
     </w:p>
@@ -2626,7 +5110,7 @@
         <w:drawing>
           <wp:inline xmlns:a="http://schemas.openxmlformats.org/drawingml/2006/main" xmlns:pic="http://schemas.openxmlformats.org/drawingml/2006/picture">
             <wp:extent cx="5903999" cy="2694619"/>
-            <wp:docPr id="4" name="Picture 4"/>
+            <wp:docPr id="8" name="Picture 8"/>
             <wp:cNvGraphicFramePr>
               <a:graphicFrameLocks noChangeAspect="1"/>
             </wp:cNvGraphicFramePr>
@@ -2638,7 +5122,7 @@
                     <pic:cNvPicPr/>
                   </pic:nvPicPr>
                   <pic:blipFill>
-                    <a:blip r:embed="rId14"/>
+                    <a:blip r:embed="rId18"/>
                     <a:stretch>
                       <a:fillRect/>
                     </a:stretch>
@@ -2666,7 +5150,7 @@
         <w:drawing>
           <wp:inline xmlns:a="http://schemas.openxmlformats.org/drawingml/2006/main" xmlns:pic="http://schemas.openxmlformats.org/drawingml/2006/picture">
             <wp:extent cx="5903999" cy="2726135"/>
-            <wp:docPr id="5" name="Picture 5"/>
+            <wp:docPr id="9" name="Picture 9"/>
             <wp:cNvGraphicFramePr>
               <a:graphicFrameLocks noChangeAspect="1"/>
             </wp:cNvGraphicFramePr>
@@ -2678,7 +5162,7 @@
                     <pic:cNvPicPr/>
                   </pic:nvPicPr>
                   <pic:blipFill>
-                    <a:blip r:embed="rId15"/>
+                    <a:blip r:embed="rId19"/>
                     <a:stretch>
                       <a:fillRect/>
                     </a:stretch>
@@ -3170,7 +5654,7 @@
           <w:color w:val="B8943A"/>
           <w:sz w:val="32"/>
         </w:rPr>
-        <w:t xml:space="preserve">4.  </w:t>
+        <w:t xml:space="preserve">7.  </w:t>
       </w:r>
       <w:r>
         <w:rPr>
@@ -3192,7 +5676,7 @@
         <w:drawing>
           <wp:inline xmlns:a="http://schemas.openxmlformats.org/drawingml/2006/main" xmlns:pic="http://schemas.openxmlformats.org/drawingml/2006/picture">
             <wp:extent cx="5903999" cy="2853270"/>
-            <wp:docPr id="6" name="Picture 6"/>
+            <wp:docPr id="10" name="Picture 10"/>
             <wp:cNvGraphicFramePr>
               <a:graphicFrameLocks noChangeAspect="1"/>
             </wp:cNvGraphicFramePr>
@@ -3204,7 +5688,7 @@
                     <pic:cNvPicPr/>
                   </pic:nvPicPr>
                   <pic:blipFill>
-                    <a:blip r:embed="rId16"/>
+                    <a:blip r:embed="rId20"/>
                     <a:stretch>
                       <a:fillRect/>
                     </a:stretch>
@@ -3394,7 +5878,7 @@
           <w:color w:val="B8943A"/>
           <w:sz w:val="32"/>
         </w:rPr>
-        <w:t xml:space="preserve">5.  </w:t>
+        <w:t xml:space="preserve">8.  </w:t>
       </w:r>
       <w:r>
         <w:rPr>
@@ -3416,7 +5900,7 @@
         <w:drawing>
           <wp:inline xmlns:a="http://schemas.openxmlformats.org/drawingml/2006/main" xmlns:pic="http://schemas.openxmlformats.org/drawingml/2006/picture">
             <wp:extent cx="5903999" cy="2694619"/>
-            <wp:docPr id="7" name="Picture 7"/>
+            <wp:docPr id="11" name="Picture 11"/>
             <wp:cNvGraphicFramePr>
               <a:graphicFrameLocks noChangeAspect="1"/>
             </wp:cNvGraphicFramePr>
@@ -3428,7 +5912,7 @@
                     <pic:cNvPicPr/>
                   </pic:nvPicPr>
                   <pic:blipFill>
-                    <a:blip r:embed="rId17"/>
+                    <a:blip r:embed="rId21"/>
                     <a:stretch>
                       <a:fillRect/>
                     </a:stretch>
@@ -4172,7 +6656,7 @@
           <w:color w:val="B8943A"/>
           <w:sz w:val="32"/>
         </w:rPr>
-        <w:t xml:space="preserve">6.  </w:t>
+        <w:t xml:space="preserve">9.  </w:t>
       </w:r>
       <w:r>
         <w:rPr>
@@ -4194,7 +6678,7 @@
         <w:drawing>
           <wp:inline xmlns:a="http://schemas.openxmlformats.org/drawingml/2006/main" xmlns:pic="http://schemas.openxmlformats.org/drawingml/2006/picture">
             <wp:extent cx="5903999" cy="2996954"/>
-            <wp:docPr id="8" name="Picture 8"/>
+            <wp:docPr id="12" name="Picture 12"/>
             <wp:cNvGraphicFramePr>
               <a:graphicFrameLocks noChangeAspect="1"/>
             </wp:cNvGraphicFramePr>
@@ -4206,7 +6690,7 @@
                     <pic:cNvPicPr/>
                   </pic:nvPicPr>
                   <pic:blipFill>
-                    <a:blip r:embed="rId18"/>
+                    <a:blip r:embed="rId22"/>
                     <a:stretch>
                       <a:fillRect/>
                     </a:stretch>
@@ -4411,7 +6895,7 @@
           <w:color w:val="B8943A"/>
           <w:sz w:val="32"/>
         </w:rPr>
-        <w:t xml:space="preserve">7.  </w:t>
+        <w:t xml:space="preserve">10.  </w:t>
       </w:r>
       <w:r>
         <w:rPr>
@@ -4422,46 +6906,6 @@
           <w:sz w:val="32"/>
         </w:rPr>
         <w:t>한국 성장과 환율</w:t>
-      </w:r>
-    </w:p>
-    <w:p>
-      <w:pPr>
-        <w:spacing w:before="40" w:after="160"/>
-        <w:jc w:val="center"/>
-      </w:pPr>
-      <w:r>
-        <w:drawing>
-          <wp:inline xmlns:a="http://schemas.openxmlformats.org/drawingml/2006/main" xmlns:pic="http://schemas.openxmlformats.org/drawingml/2006/picture">
-            <wp:extent cx="5903999" cy="2815603"/>
-            <wp:docPr id="9" name="Picture 9"/>
-            <wp:cNvGraphicFramePr>
-              <a:graphicFrameLocks noChangeAspect="1"/>
-            </wp:cNvGraphicFramePr>
-            <a:graphic>
-              <a:graphicData uri="http://schemas.openxmlformats.org/drawingml/2006/picture">
-                <pic:pic>
-                  <pic:nvPicPr>
-                    <pic:cNvPr id="0" name="07_korea_gdp.png"/>
-                    <pic:cNvPicPr/>
-                  </pic:nvPicPr>
-                  <pic:blipFill>
-                    <a:blip r:embed="rId19"/>
-                    <a:stretch>
-                      <a:fillRect/>
-                    </a:stretch>
-                  </pic:blipFill>
-                  <pic:spPr>
-                    <a:xfrm>
-                      <a:off x="0" y="0"/>
-                      <a:ext cx="5903999" cy="2815603"/>
-                    </a:xfrm>
-                    <a:prstGeom prst="rect"/>
-                  </pic:spPr>
-                </pic:pic>
-              </a:graphicData>
-            </a:graphic>
-          </wp:inline>
-        </w:drawing>
       </w:r>
     </w:p>
     <w:p>
@@ -4487,7 +6931,7 @@
           <w:color w:val="1A1A1A"/>
           <w:sz w:val="22"/>
         </w:rPr>
-        <w:t>Citi 9/18: 실질 GDP 3.7 / 3.1 / 3.0. 한은 8월 3.3 / 2.9보다 위. 반도체 수출 +175% / +41%.</w:t>
+        <w:t>Citi 9/18: 실질 GDP 3.7 / 3.1 / 3.0. 한은 8월 3.3 / 2.9보다 위. 이은택 프레임으로는 작년 주가(+75.6%)가 이미 올해 성장을 당겨 쓴 숫자다.</w:t>
       </w:r>
     </w:p>
     <w:p>
@@ -4609,7 +7053,7 @@
           <w:color w:val="B8943A"/>
           <w:sz w:val="32"/>
         </w:rPr>
-        <w:t xml:space="preserve">8.  </w:t>
+        <w:t xml:space="preserve">11.  </w:t>
       </w:r>
       <w:r>
         <w:rPr>
@@ -4819,7 +7263,7 @@
           <w:color w:val="B8943A"/>
           <w:sz w:val="32"/>
         </w:rPr>
-        <w:t xml:space="preserve">9.  </w:t>
+        <w:t xml:space="preserve">12.  </w:t>
       </w:r>
       <w:r>
         <w:rPr>
@@ -5003,7 +7447,7 @@
                 <w:color w:val="1A1A1A"/>
                 <w:sz w:val="19"/>
               </w:rPr>
-              <w:t>문남중</w:t>
+              <w:t>이은택</w:t>
             </w:r>
           </w:p>
         </w:tc>
@@ -5032,7 +7476,7 @@
                 <w:color w:val="1A1A1A"/>
                 <w:sz w:val="19"/>
               </w:rPr>
-              <w:t>불확실성 제거 후 안도</w:t>
+              <w:t>W 2차 바닥 과정. 붕괴 아님</w:t>
             </w:r>
           </w:p>
         </w:tc>
@@ -5061,6 +7505,127 @@
                 <w:color w:val="1A1A1A"/>
                 <w:sz w:val="19"/>
               </w:rPr>
+              <w:t>AND 게이트, 고통지수, 주가 선행</w:t>
+            </w:r>
+          </w:p>
+        </w:tc>
+        <w:tc>
+          <w:tcPr>
+            <w:tcW w:type="dxa" w:w="2948"/>
+            <w:shd w:val="clear" w:color="auto" w:fill="FFFFFF"/>
+            <w:tcMar>
+              <w:top w:w="60" w:type="dxa"/>
+              <w:left w:w="80" w:type="dxa"/>
+              <w:bottom w:w="60" w:type="dxa"/>
+              <w:right w:w="80" w:type="dxa"/>
+            </w:tcMar>
+          </w:tcPr>
+          <w:p>
+            <w:pPr>
+              <w:spacing w:before="0" w:after="0" w:line="269" w:lineRule="auto"/>
+              <w:jc w:val="center"/>
+            </w:pPr>
+            <w:r/>
+            <w:r>
+              <w:rPr>
+                <w:rFonts w:ascii="맑은 고딕" w:hAnsi="맑은 고딕" w:eastAsia="맑은 고딕"/>
+                <w:b w:val="0"/>
+                <w:i w:val="0"/>
+                <w:color w:val="1A1A1A"/>
+                <w:sz w:val="19"/>
+              </w:rPr>
+              <w:t>두 번째 바닥은 힘들다. 5% 재돌파</w:t>
+            </w:r>
+          </w:p>
+        </w:tc>
+      </w:tr>
+      <w:tr>
+        <w:trPr>
+          <w:cantSplit/>
+        </w:trPr>
+        <w:tc>
+          <w:tcPr>
+            <w:tcW w:type="dxa" w:w="1587"/>
+            <w:shd w:val="clear" w:color="auto" w:fill="F7F9FC"/>
+            <w:tcMar>
+              <w:top w:w="60" w:type="dxa"/>
+              <w:left w:w="80" w:type="dxa"/>
+              <w:bottom w:w="60" w:type="dxa"/>
+              <w:right w:w="80" w:type="dxa"/>
+            </w:tcMar>
+          </w:tcPr>
+          <w:p>
+            <w:pPr>
+              <w:spacing w:before="0" w:after="0" w:line="269" w:lineRule="auto"/>
+              <w:jc w:val="left"/>
+            </w:pPr>
+            <w:r/>
+            <w:r>
+              <w:rPr>
+                <w:rFonts w:ascii="맑은 고딕" w:hAnsi="맑은 고딕" w:eastAsia="맑은 고딕"/>
+                <w:b/>
+                <w:i w:val="0"/>
+                <w:color w:val="1A1A1A"/>
+                <w:sz w:val="19"/>
+              </w:rPr>
+              <w:t>문남중</w:t>
+            </w:r>
+          </w:p>
+        </w:tc>
+        <w:tc>
+          <w:tcPr>
+            <w:tcW w:type="dxa" w:w="2381"/>
+            <w:shd w:val="clear" w:color="auto" w:fill="F7F9FC"/>
+            <w:tcMar>
+              <w:top w:w="60" w:type="dxa"/>
+              <w:left w:w="80" w:type="dxa"/>
+              <w:bottom w:w="60" w:type="dxa"/>
+              <w:right w:w="80" w:type="dxa"/>
+            </w:tcMar>
+          </w:tcPr>
+          <w:p>
+            <w:pPr>
+              <w:spacing w:before="0" w:after="0" w:line="269" w:lineRule="auto"/>
+              <w:jc w:val="center"/>
+            </w:pPr>
+            <w:r/>
+            <w:r>
+              <w:rPr>
+                <w:rFonts w:ascii="맑은 고딕" w:hAnsi="맑은 고딕" w:eastAsia="맑은 고딕"/>
+                <w:b w:val="0"/>
+                <w:i w:val="0"/>
+                <w:color w:val="1A1A1A"/>
+                <w:sz w:val="19"/>
+              </w:rPr>
+              <w:t>불확실성 제거 후 안도</w:t>
+            </w:r>
+          </w:p>
+        </w:tc>
+        <w:tc>
+          <w:tcPr>
+            <w:tcW w:type="dxa" w:w="3061"/>
+            <w:shd w:val="clear" w:color="auto" w:fill="F7F9FC"/>
+            <w:tcMar>
+              <w:top w:w="60" w:type="dxa"/>
+              <w:left w:w="80" w:type="dxa"/>
+              <w:bottom w:w="60" w:type="dxa"/>
+              <w:right w:w="80" w:type="dxa"/>
+            </w:tcMar>
+          </w:tcPr>
+          <w:p>
+            <w:pPr>
+              <w:spacing w:before="0" w:after="0" w:line="269" w:lineRule="auto"/>
+              <w:jc w:val="center"/>
+            </w:pPr>
+            <w:r/>
+            <w:r>
+              <w:rPr>
+                <w:rFonts w:ascii="맑은 고딕" w:hAnsi="맑은 고딕" w:eastAsia="맑은 고딕"/>
+                <w:b w:val="0"/>
+                <w:i w:val="0"/>
+                <w:color w:val="1A1A1A"/>
+                <w:sz w:val="19"/>
+              </w:rPr>
               <w:t>HBM·전력·DC. 한·미 반도체 같이</w:t>
             </w:r>
           </w:p>
@@ -5068,7 +7633,7 @@
         <w:tc>
           <w:tcPr>
             <w:tcW w:type="dxa" w:w="2948"/>
-            <w:shd w:val="clear" w:color="auto" w:fill="FFFFFF"/>
+            <w:shd w:val="clear" w:color="auto" w:fill="F7F9FC"/>
             <w:tcMar>
               <w:top w:w="60" w:type="dxa"/>
               <w:left w:w="80" w:type="dxa"/>
@@ -5102,7 +7667,7 @@
         <w:tc>
           <w:tcPr>
             <w:tcW w:type="dxa" w:w="1587"/>
-            <w:shd w:val="clear" w:color="auto" w:fill="F7F9FC"/>
+            <w:shd w:val="clear" w:color="auto" w:fill="FFFFFF"/>
             <w:tcMar>
               <w:top w:w="60" w:type="dxa"/>
               <w:left w:w="80" w:type="dxa"/>
@@ -5131,7 +7696,7 @@
         <w:tc>
           <w:tcPr>
             <w:tcW w:type="dxa" w:w="2381"/>
-            <w:shd w:val="clear" w:color="auto" w:fill="F7F9FC"/>
+            <w:shd w:val="clear" w:color="auto" w:fill="FFFFFF"/>
             <w:tcMar>
               <w:top w:w="60" w:type="dxa"/>
               <w:left w:w="80" w:type="dxa"/>
@@ -5160,7 +7725,7 @@
         <w:tc>
           <w:tcPr>
             <w:tcW w:type="dxa" w:w="3061"/>
-            <w:shd w:val="clear" w:color="auto" w:fill="F7F9FC"/>
+            <w:shd w:val="clear" w:color="auto" w:fill="FFFFFF"/>
             <w:tcMar>
               <w:top w:w="60" w:type="dxa"/>
               <w:left w:w="80" w:type="dxa"/>
@@ -5189,7 +7754,7 @@
         <w:tc>
           <w:tcPr>
             <w:tcW w:type="dxa" w:w="2948"/>
-            <w:shd w:val="clear" w:color="auto" w:fill="F7F9FC"/>
+            <w:shd w:val="clear" w:color="auto" w:fill="FFFFFF"/>
             <w:tcMar>
               <w:top w:w="60" w:type="dxa"/>
               <w:left w:w="80" w:type="dxa"/>
@@ -5223,7 +7788,7 @@
         <w:tc>
           <w:tcPr>
             <w:tcW w:type="dxa" w:w="1587"/>
-            <w:shd w:val="clear" w:color="auto" w:fill="FFFFFF"/>
+            <w:shd w:val="clear" w:color="auto" w:fill="F7F9FC"/>
             <w:tcMar>
               <w:top w:w="60" w:type="dxa"/>
               <w:left w:w="80" w:type="dxa"/>
@@ -5252,7 +7817,7 @@
         <w:tc>
           <w:tcPr>
             <w:tcW w:type="dxa" w:w="2381"/>
-            <w:shd w:val="clear" w:color="auto" w:fill="FFFFFF"/>
+            <w:shd w:val="clear" w:color="auto" w:fill="F7F9FC"/>
             <w:tcMar>
               <w:top w:w="60" w:type="dxa"/>
               <w:left w:w="80" w:type="dxa"/>
@@ -5281,7 +7846,7 @@
         <w:tc>
           <w:tcPr>
             <w:tcW w:type="dxa" w:w="3061"/>
-            <w:shd w:val="clear" w:color="auto" w:fill="FFFFFF"/>
+            <w:shd w:val="clear" w:color="auto" w:fill="F7F9FC"/>
             <w:tcMar>
               <w:top w:w="60" w:type="dxa"/>
               <w:left w:w="80" w:type="dxa"/>
@@ -5310,7 +7875,7 @@
         <w:tc>
           <w:tcPr>
             <w:tcW w:type="dxa" w:w="2948"/>
-            <w:shd w:val="clear" w:color="auto" w:fill="FFFFFF"/>
+            <w:shd w:val="clear" w:color="auto" w:fill="F7F9FC"/>
             <w:tcMar>
               <w:top w:w="60" w:type="dxa"/>
               <w:left w:w="80" w:type="dxa"/>
@@ -5344,7 +7909,7 @@
         <w:tc>
           <w:tcPr>
             <w:tcW w:type="dxa" w:w="1587"/>
-            <w:shd w:val="clear" w:color="auto" w:fill="F7F9FC"/>
+            <w:shd w:val="clear" w:color="auto" w:fill="FFFFFF"/>
             <w:tcMar>
               <w:top w:w="60" w:type="dxa"/>
               <w:left w:w="80" w:type="dxa"/>
@@ -5373,7 +7938,7 @@
         <w:tc>
           <w:tcPr>
             <w:tcW w:type="dxa" w:w="2381"/>
-            <w:shd w:val="clear" w:color="auto" w:fill="F7F9FC"/>
+            <w:shd w:val="clear" w:color="auto" w:fill="FFFFFF"/>
             <w:tcMar>
               <w:top w:w="60" w:type="dxa"/>
               <w:left w:w="80" w:type="dxa"/>
@@ -5402,7 +7967,7 @@
         <w:tc>
           <w:tcPr>
             <w:tcW w:type="dxa" w:w="3061"/>
-            <w:shd w:val="clear" w:color="auto" w:fill="F7F9FC"/>
+            <w:shd w:val="clear" w:color="auto" w:fill="FFFFFF"/>
             <w:tcMar>
               <w:top w:w="60" w:type="dxa"/>
               <w:left w:w="80" w:type="dxa"/>
@@ -5431,7 +7996,7 @@
         <w:tc>
           <w:tcPr>
             <w:tcW w:type="dxa" w:w="2948"/>
-            <w:shd w:val="clear" w:color="auto" w:fill="F7F9FC"/>
+            <w:shd w:val="clear" w:color="auto" w:fill="FFFFFF"/>
             <w:tcMar>
               <w:top w:w="60" w:type="dxa"/>
               <w:left w:w="80" w:type="dxa"/>
@@ -5465,7 +8030,7 @@
         <w:tc>
           <w:tcPr>
             <w:tcW w:type="dxa" w:w="1587"/>
-            <w:shd w:val="clear" w:color="auto" w:fill="FFFFFF"/>
+            <w:shd w:val="clear" w:color="auto" w:fill="F7F9FC"/>
             <w:tcMar>
               <w:top w:w="60" w:type="dxa"/>
               <w:left w:w="80" w:type="dxa"/>
@@ -5494,7 +8059,7 @@
         <w:tc>
           <w:tcPr>
             <w:tcW w:type="dxa" w:w="2381"/>
-            <w:shd w:val="clear" w:color="auto" w:fill="FFFFFF"/>
+            <w:shd w:val="clear" w:color="auto" w:fill="F7F9FC"/>
             <w:tcMar>
               <w:top w:w="60" w:type="dxa"/>
               <w:left w:w="80" w:type="dxa"/>
@@ -5523,7 +8088,7 @@
         <w:tc>
           <w:tcPr>
             <w:tcW w:type="dxa" w:w="3061"/>
-            <w:shd w:val="clear" w:color="auto" w:fill="FFFFFF"/>
+            <w:shd w:val="clear" w:color="auto" w:fill="F7F9FC"/>
             <w:tcMar>
               <w:top w:w="60" w:type="dxa"/>
               <w:left w:w="80" w:type="dxa"/>
@@ -5552,7 +8117,7 @@
         <w:tc>
           <w:tcPr>
             <w:tcW w:type="dxa" w:w="2948"/>
-            <w:shd w:val="clear" w:color="auto" w:fill="FFFFFF"/>
+            <w:shd w:val="clear" w:color="auto" w:fill="F7F9FC"/>
             <w:tcMar>
               <w:top w:w="60" w:type="dxa"/>
               <w:left w:w="80" w:type="dxa"/>
@@ -5704,7 +8269,7 @@
           <w:color w:val="B8943A"/>
           <w:sz w:val="32"/>
         </w:rPr>
-        <w:t xml:space="preserve">10.  </w:t>
+        <w:t xml:space="preserve">13.  </w:t>
       </w:r>
       <w:r>
         <w:rPr>
@@ -5825,6 +8390,558 @@
                 <w:sz w:val="19"/>
               </w:rPr>
               <w:t>이유</w:t>
+            </w:r>
+          </w:p>
+        </w:tc>
+      </w:tr>
+      <w:tr>
+        <w:trPr>
+          <w:cantSplit/>
+        </w:trPr>
+        <w:tc>
+          <w:tcPr>
+            <w:tcW w:type="dxa" w:w="2608"/>
+            <w:shd w:val="clear" w:color="auto" w:fill="FFFFFF"/>
+            <w:tcMar>
+              <w:top w:w="60" w:type="dxa"/>
+              <w:left w:w="80" w:type="dxa"/>
+              <w:bottom w:w="60" w:type="dxa"/>
+              <w:right w:w="80" w:type="dxa"/>
+            </w:tcMar>
+          </w:tcPr>
+          <w:p>
+            <w:pPr>
+              <w:spacing w:before="0" w:after="0" w:line="269" w:lineRule="auto"/>
+              <w:jc w:val="left"/>
+            </w:pPr>
+            <w:r/>
+            <w:r>
+              <w:rPr>
+                <w:rFonts w:ascii="맑은 고딕" w:hAnsi="맑은 고딕" w:eastAsia="맑은 고딕"/>
+                <w:b/>
+                <w:i w:val="0"/>
+                <w:color w:val="1A1A1A"/>
+                <w:sz w:val="19"/>
+              </w:rPr>
+              <w:t>이윤택 이사</w:t>
+            </w:r>
+          </w:p>
+        </w:tc>
+        <w:tc>
+          <w:tcPr>
+            <w:tcW w:type="dxa" w:w="3628"/>
+            <w:shd w:val="clear" w:color="auto" w:fill="FFFFFF"/>
+            <w:tcMar>
+              <w:top w:w="60" w:type="dxa"/>
+              <w:left w:w="80" w:type="dxa"/>
+              <w:bottom w:w="60" w:type="dxa"/>
+              <w:right w:w="80" w:type="dxa"/>
+            </w:tcMar>
+          </w:tcPr>
+          <w:p>
+            <w:pPr>
+              <w:spacing w:before="0" w:after="0" w:line="269" w:lineRule="auto"/>
+              <w:jc w:val="center"/>
+            </w:pPr>
+            <w:r/>
+            <w:r>
+              <w:rPr>
+                <w:rFonts w:ascii="맑은 고딕" w:hAnsi="맑은 고딕" w:eastAsia="맑은 고딕"/>
+                <w:b w:val="0"/>
+                <w:i w:val="0"/>
+                <w:color w:val="1A1A1A"/>
+                <w:sz w:val="19"/>
+              </w:rPr>
+              <w:t>이은택 (KB 자산배분)</w:t>
+            </w:r>
+          </w:p>
+        </w:tc>
+        <w:tc>
+          <w:tcPr>
+            <w:tcW w:type="dxa" w:w="3742"/>
+            <w:shd w:val="clear" w:color="auto" w:fill="FFFFFF"/>
+            <w:tcMar>
+              <w:top w:w="60" w:type="dxa"/>
+              <w:left w:w="80" w:type="dxa"/>
+              <w:bottom w:w="60" w:type="dxa"/>
+              <w:right w:w="80" w:type="dxa"/>
+            </w:tcMar>
+          </w:tcPr>
+          <w:p>
+            <w:pPr>
+              <w:spacing w:before="0" w:after="0" w:line="269" w:lineRule="auto"/>
+              <w:jc w:val="center"/>
+            </w:pPr>
+            <w:r/>
+            <w:r>
+              <w:rPr>
+                <w:rFonts w:ascii="맑은 고딕" w:hAnsi="맑은 고딕" w:eastAsia="맑은 고딕"/>
+                <w:b w:val="0"/>
+                <w:i w:val="0"/>
+                <w:color w:val="1A1A1A"/>
+                <w:sz w:val="19"/>
+              </w:rPr>
+              <w:t>자막 오역</w:t>
+            </w:r>
+          </w:p>
+        </w:tc>
+      </w:tr>
+      <w:tr>
+        <w:trPr>
+          <w:cantSplit/>
+        </w:trPr>
+        <w:tc>
+          <w:tcPr>
+            <w:tcW w:type="dxa" w:w="2608"/>
+            <w:shd w:val="clear" w:color="auto" w:fill="F7F9FC"/>
+            <w:tcMar>
+              <w:top w:w="60" w:type="dxa"/>
+              <w:left w:w="80" w:type="dxa"/>
+              <w:bottom w:w="60" w:type="dxa"/>
+              <w:right w:w="80" w:type="dxa"/>
+            </w:tcMar>
+          </w:tcPr>
+          <w:p>
+            <w:pPr>
+              <w:spacing w:before="0" w:after="0" w:line="269" w:lineRule="auto"/>
+              <w:jc w:val="left"/>
+            </w:pPr>
+            <w:r/>
+            <w:r>
+              <w:rPr>
+                <w:rFonts w:ascii="맑은 고딕" w:hAnsi="맑은 고딕" w:eastAsia="맑은 고딕"/>
+                <w:b/>
+                <w:i w:val="0"/>
+                <w:color w:val="1A1A1A"/>
+                <w:sz w:val="19"/>
+              </w:rPr>
+              <w:t>이번 30% 하락</w:t>
+            </w:r>
+          </w:p>
+        </w:tc>
+        <w:tc>
+          <w:tcPr>
+            <w:tcW w:type="dxa" w:w="3628"/>
+            <w:shd w:val="clear" w:color="auto" w:fill="F7F9FC"/>
+            <w:tcMar>
+              <w:top w:w="60" w:type="dxa"/>
+              <w:left w:w="80" w:type="dxa"/>
+              <w:bottom w:w="60" w:type="dxa"/>
+              <w:right w:w="80" w:type="dxa"/>
+            </w:tcMar>
+          </w:tcPr>
+          <w:p>
+            <w:pPr>
+              <w:spacing w:before="0" w:after="0" w:line="269" w:lineRule="auto"/>
+              <w:jc w:val="center"/>
+            </w:pPr>
+            <w:r/>
+            <w:r>
+              <w:rPr>
+                <w:rFonts w:ascii="맑은 고딕" w:hAnsi="맑은 고딕" w:eastAsia="맑은 고딕"/>
+                <w:b w:val="0"/>
+                <w:i w:val="0"/>
+                <w:color w:val="1A1A1A"/>
+                <w:sz w:val="19"/>
+              </w:rPr>
+              <w:t>고점 대비 −38.6% (7/30)</w:t>
+            </w:r>
+          </w:p>
+        </w:tc>
+        <w:tc>
+          <w:tcPr>
+            <w:tcW w:type="dxa" w:w="3742"/>
+            <w:shd w:val="clear" w:color="auto" w:fill="F7F9FC"/>
+            <w:tcMar>
+              <w:top w:w="60" w:type="dxa"/>
+              <w:left w:w="80" w:type="dxa"/>
+              <w:bottom w:w="60" w:type="dxa"/>
+              <w:right w:w="80" w:type="dxa"/>
+            </w:tcMar>
+          </w:tcPr>
+          <w:p>
+            <w:pPr>
+              <w:spacing w:before="0" w:after="0" w:line="269" w:lineRule="auto"/>
+              <w:jc w:val="center"/>
+            </w:pPr>
+            <w:r/>
+            <w:r>
+              <w:rPr>
+                <w:rFonts w:ascii="맑은 고딕" w:hAnsi="맑은 고딕" w:eastAsia="맑은 고딕"/>
+                <w:b w:val="0"/>
+                <w:i w:val="0"/>
+                <w:color w:val="1A1A1A"/>
+                <w:sz w:val="19"/>
+              </w:rPr>
+              <w:t>반올림</w:t>
+            </w:r>
+          </w:p>
+        </w:tc>
+      </w:tr>
+      <w:tr>
+        <w:trPr>
+          <w:cantSplit/>
+        </w:trPr>
+        <w:tc>
+          <w:tcPr>
+            <w:tcW w:type="dxa" w:w="2608"/>
+            <w:shd w:val="clear" w:color="auto" w:fill="FFFFFF"/>
+            <w:tcMar>
+              <w:top w:w="60" w:type="dxa"/>
+              <w:left w:w="80" w:type="dxa"/>
+              <w:bottom w:w="60" w:type="dxa"/>
+              <w:right w:w="80" w:type="dxa"/>
+            </w:tcMar>
+          </w:tcPr>
+          <w:p>
+            <w:pPr>
+              <w:spacing w:before="0" w:after="0" w:line="269" w:lineRule="auto"/>
+              <w:jc w:val="left"/>
+            </w:pPr>
+            <w:r/>
+            <w:r>
+              <w:rPr>
+                <w:rFonts w:ascii="맑은 고딕" w:hAnsi="맑은 고딕" w:eastAsia="맑은 고딕"/>
+                <w:b/>
+                <w:i w:val="0"/>
+                <w:color w:val="1A1A1A"/>
+                <w:sz w:val="19"/>
+              </w:rPr>
+              <w:t>작년 코스피 +70%</w:t>
+            </w:r>
+          </w:p>
+        </w:tc>
+        <w:tc>
+          <w:tcPr>
+            <w:tcW w:type="dxa" w:w="3628"/>
+            <w:shd w:val="clear" w:color="auto" w:fill="FFFFFF"/>
+            <w:tcMar>
+              <w:top w:w="60" w:type="dxa"/>
+              <w:left w:w="80" w:type="dxa"/>
+              <w:bottom w:w="60" w:type="dxa"/>
+              <w:right w:w="80" w:type="dxa"/>
+            </w:tcMar>
+          </w:tcPr>
+          <w:p>
+            <w:pPr>
+              <w:spacing w:before="0" w:after="0" w:line="269" w:lineRule="auto"/>
+              <w:jc w:val="center"/>
+            </w:pPr>
+            <w:r/>
+            <w:r>
+              <w:rPr>
+                <w:rFonts w:ascii="맑은 고딕" w:hAnsi="맑은 고딕" w:eastAsia="맑은 고딕"/>
+                <w:b w:val="0"/>
+                <w:i w:val="0"/>
+                <w:color w:val="1A1A1A"/>
+                <w:sz w:val="19"/>
+              </w:rPr>
+              <w:t>+75.6% (2025 종가)</w:t>
+            </w:r>
+          </w:p>
+        </w:tc>
+        <w:tc>
+          <w:tcPr>
+            <w:tcW w:type="dxa" w:w="3742"/>
+            <w:shd w:val="clear" w:color="auto" w:fill="FFFFFF"/>
+            <w:tcMar>
+              <w:top w:w="60" w:type="dxa"/>
+              <w:left w:w="80" w:type="dxa"/>
+              <w:bottom w:w="60" w:type="dxa"/>
+              <w:right w:w="80" w:type="dxa"/>
+            </w:tcMar>
+          </w:tcPr>
+          <w:p>
+            <w:pPr>
+              <w:spacing w:before="0" w:after="0" w:line="269" w:lineRule="auto"/>
+              <w:jc w:val="center"/>
+            </w:pPr>
+            <w:r/>
+            <w:r>
+              <w:rPr>
+                <w:rFonts w:ascii="맑은 고딕" w:hAnsi="맑은 고딕" w:eastAsia="맑은 고딕"/>
+                <w:b w:val="0"/>
+                <w:i w:val="0"/>
+                <w:color w:val="1A1A1A"/>
+                <w:sz w:val="19"/>
+              </w:rPr>
+              <w:t>대략치</w:t>
+            </w:r>
+          </w:p>
+        </w:tc>
+      </w:tr>
+      <w:tr>
+        <w:trPr>
+          <w:cantSplit/>
+        </w:trPr>
+        <w:tc>
+          <w:tcPr>
+            <w:tcW w:type="dxa" w:w="2608"/>
+            <w:shd w:val="clear" w:color="auto" w:fill="F7F9FC"/>
+            <w:tcMar>
+              <w:top w:w="60" w:type="dxa"/>
+              <w:left w:w="80" w:type="dxa"/>
+              <w:bottom w:w="60" w:type="dxa"/>
+              <w:right w:w="80" w:type="dxa"/>
+            </w:tcMar>
+          </w:tcPr>
+          <w:p>
+            <w:pPr>
+              <w:spacing w:before="0" w:after="0" w:line="269" w:lineRule="auto"/>
+              <w:jc w:val="left"/>
+            </w:pPr>
+            <w:r/>
+            <w:r>
+              <w:rPr>
+                <w:rFonts w:ascii="맑은 고딕" w:hAnsi="맑은 고딕" w:eastAsia="맑은 고딕"/>
+                <w:b/>
+                <w:i w:val="0"/>
+                <w:color w:val="1A1A1A"/>
+                <w:sz w:val="19"/>
+              </w:rPr>
+              <w:t>CPI 고점 7월 전후</w:t>
+            </w:r>
+          </w:p>
+        </w:tc>
+        <w:tc>
+          <w:tcPr>
+            <w:tcW w:type="dxa" w:w="3628"/>
+            <w:shd w:val="clear" w:color="auto" w:fill="F7F9FC"/>
+            <w:tcMar>
+              <w:top w:w="60" w:type="dxa"/>
+              <w:left w:w="80" w:type="dxa"/>
+              <w:bottom w:w="60" w:type="dxa"/>
+              <w:right w:w="80" w:type="dxa"/>
+            </w:tcMar>
+          </w:tcPr>
+          <w:p>
+            <w:pPr>
+              <w:spacing w:before="0" w:after="0" w:line="269" w:lineRule="auto"/>
+              <w:jc w:val="center"/>
+            </w:pPr>
+            <w:r/>
+            <w:r>
+              <w:rPr>
+                <w:rFonts w:ascii="맑은 고딕" w:hAnsi="맑은 고딕" w:eastAsia="맑은 고딕"/>
+                <w:b w:val="0"/>
+                <w:i w:val="0"/>
+                <w:color w:val="1A1A1A"/>
+                <w:sz w:val="19"/>
+              </w:rPr>
+              <w:t>2022년 6월 9.1%</w:t>
+            </w:r>
+          </w:p>
+        </w:tc>
+        <w:tc>
+          <w:tcPr>
+            <w:tcW w:type="dxa" w:w="3742"/>
+            <w:shd w:val="clear" w:color="auto" w:fill="F7F9FC"/>
+            <w:tcMar>
+              <w:top w:w="60" w:type="dxa"/>
+              <w:left w:w="80" w:type="dxa"/>
+              <w:bottom w:w="60" w:type="dxa"/>
+              <w:right w:w="80" w:type="dxa"/>
+            </w:tcMar>
+          </w:tcPr>
+          <w:p>
+            <w:pPr>
+              <w:spacing w:before="0" w:after="0" w:line="269" w:lineRule="auto"/>
+              <w:jc w:val="center"/>
+            </w:pPr>
+            <w:r/>
+            <w:r>
+              <w:rPr>
+                <w:rFonts w:ascii="맑은 고딕" w:hAnsi="맑은 고딕" w:eastAsia="맑은 고딕"/>
+                <w:b w:val="0"/>
+                <w:i w:val="0"/>
+                <w:color w:val="1A1A1A"/>
+                <w:sz w:val="19"/>
+              </w:rPr>
+              <w:t>기억 오류</w:t>
+            </w:r>
+          </w:p>
+        </w:tc>
+      </w:tr>
+      <w:tr>
+        <w:trPr>
+          <w:cantSplit/>
+        </w:trPr>
+        <w:tc>
+          <w:tcPr>
+            <w:tcW w:type="dxa" w:w="2608"/>
+            <w:shd w:val="clear" w:color="auto" w:fill="FFFFFF"/>
+            <w:tcMar>
+              <w:top w:w="60" w:type="dxa"/>
+              <w:left w:w="80" w:type="dxa"/>
+              <w:bottom w:w="60" w:type="dxa"/>
+              <w:right w:w="80" w:type="dxa"/>
+            </w:tcMar>
+          </w:tcPr>
+          <w:p>
+            <w:pPr>
+              <w:spacing w:before="0" w:after="0" w:line="269" w:lineRule="auto"/>
+              <w:jc w:val="left"/>
+            </w:pPr>
+            <w:r/>
+            <w:r>
+              <w:rPr>
+                <w:rFonts w:ascii="맑은 고딕" w:hAnsi="맑은 고딕" w:eastAsia="맑은 고딕"/>
+                <w:b/>
+                <w:i w:val="0"/>
+                <w:color w:val="1A1A1A"/>
+                <w:sz w:val="19"/>
+              </w:rPr>
+              <w:t>코스피 저점 10월</w:t>
+            </w:r>
+          </w:p>
+        </w:tc>
+        <w:tc>
+          <w:tcPr>
+            <w:tcW w:type="dxa" w:w="3628"/>
+            <w:shd w:val="clear" w:color="auto" w:fill="FFFFFF"/>
+            <w:tcMar>
+              <w:top w:w="60" w:type="dxa"/>
+              <w:left w:w="80" w:type="dxa"/>
+              <w:bottom w:w="60" w:type="dxa"/>
+              <w:right w:w="80" w:type="dxa"/>
+            </w:tcMar>
+          </w:tcPr>
+          <w:p>
+            <w:pPr>
+              <w:spacing w:before="0" w:after="0" w:line="269" w:lineRule="auto"/>
+              <w:jc w:val="center"/>
+            </w:pPr>
+            <w:r/>
+            <w:r>
+              <w:rPr>
+                <w:rFonts w:ascii="맑은 고딕" w:hAnsi="맑은 고딕" w:eastAsia="맑은 고딕"/>
+                <w:b w:val="0"/>
+                <w:i w:val="0"/>
+                <w:color w:val="1A1A1A"/>
+                <w:sz w:val="19"/>
+              </w:rPr>
+              <w:t>종가 저점 9/30, S&amp;P는 10/12</w:t>
+            </w:r>
+          </w:p>
+        </w:tc>
+        <w:tc>
+          <w:tcPr>
+            <w:tcW w:type="dxa" w:w="3742"/>
+            <w:shd w:val="clear" w:color="auto" w:fill="FFFFFF"/>
+            <w:tcMar>
+              <w:top w:w="60" w:type="dxa"/>
+              <w:left w:w="80" w:type="dxa"/>
+              <w:bottom w:w="60" w:type="dxa"/>
+              <w:right w:w="80" w:type="dxa"/>
+            </w:tcMar>
+          </w:tcPr>
+          <w:p>
+            <w:pPr>
+              <w:spacing w:before="0" w:after="0" w:line="269" w:lineRule="auto"/>
+              <w:jc w:val="center"/>
+            </w:pPr>
+            <w:r/>
+            <w:r>
+              <w:rPr>
+                <w:rFonts w:ascii="맑은 고딕" w:hAnsi="맑은 고딕" w:eastAsia="맑은 고딕"/>
+                <w:b w:val="0"/>
+                <w:i w:val="0"/>
+                <w:color w:val="1A1A1A"/>
+                <w:sz w:val="19"/>
+              </w:rPr>
+              <w:t>한 달 경계</w:t>
+            </w:r>
+          </w:p>
+        </w:tc>
+      </w:tr>
+      <w:tr>
+        <w:trPr>
+          <w:cantSplit/>
+        </w:trPr>
+        <w:tc>
+          <w:tcPr>
+            <w:tcW w:type="dxa" w:w="2608"/>
+            <w:shd w:val="clear" w:color="auto" w:fill="F7F9FC"/>
+            <w:tcMar>
+              <w:top w:w="60" w:type="dxa"/>
+              <w:left w:w="80" w:type="dxa"/>
+              <w:bottom w:w="60" w:type="dxa"/>
+              <w:right w:w="80" w:type="dxa"/>
+            </w:tcMar>
+          </w:tcPr>
+          <w:p>
+            <w:pPr>
+              <w:spacing w:before="0" w:after="0" w:line="269" w:lineRule="auto"/>
+              <w:jc w:val="left"/>
+            </w:pPr>
+            <w:r/>
+            <w:r>
+              <w:rPr>
+                <w:rFonts w:ascii="맑은 고딕" w:hAnsi="맑은 고딕" w:eastAsia="맑은 고딕"/>
+                <w:b/>
+                <w:i w:val="0"/>
+                <w:color w:val="1A1A1A"/>
+                <w:sz w:val="19"/>
+              </w:rPr>
+              <w:t>물가 3.0→2.6 하향</w:t>
+            </w:r>
+          </w:p>
+        </w:tc>
+        <w:tc>
+          <w:tcPr>
+            <w:tcW w:type="dxa" w:w="3628"/>
+            <w:shd w:val="clear" w:color="auto" w:fill="F7F9FC"/>
+            <w:tcMar>
+              <w:top w:w="60" w:type="dxa"/>
+              <w:left w:w="80" w:type="dxa"/>
+              <w:bottom w:w="60" w:type="dxa"/>
+              <w:right w:w="80" w:type="dxa"/>
+            </w:tcMar>
+          </w:tcPr>
+          <w:p>
+            <w:pPr>
+              <w:spacing w:before="0" w:after="0" w:line="269" w:lineRule="auto"/>
+              <w:jc w:val="center"/>
+            </w:pPr>
+            <w:r/>
+            <w:r>
+              <w:rPr>
+                <w:rFonts w:ascii="맑은 고딕" w:hAnsi="맑은 고딕" w:eastAsia="맑은 고딕"/>
+                <w:b w:val="0"/>
+                <w:i w:val="0"/>
+                <w:color w:val="1A1A1A"/>
+                <w:sz w:val="19"/>
+              </w:rPr>
+              <w:t>헤드라인 3.4% 횡보, 코어 2.4</w:t>
+            </w:r>
+          </w:p>
+        </w:tc>
+        <w:tc>
+          <w:tcPr>
+            <w:tcW w:type="dxa" w:w="3742"/>
+            <w:shd w:val="clear" w:color="auto" w:fill="F7F9FC"/>
+            <w:tcMar>
+              <w:top w:w="60" w:type="dxa"/>
+              <w:left w:w="80" w:type="dxa"/>
+              <w:bottom w:w="60" w:type="dxa"/>
+              <w:right w:w="80" w:type="dxa"/>
+            </w:tcMar>
+          </w:tcPr>
+          <w:p>
+            <w:pPr>
+              <w:spacing w:before="0" w:after="0" w:line="269" w:lineRule="auto"/>
+              <w:jc w:val="center"/>
+            </w:pPr>
+            <w:r/>
+            <w:r>
+              <w:rPr>
+                <w:rFonts w:ascii="맑은 고딕" w:hAnsi="맑은 고딕" w:eastAsia="맑은 고딕"/>
+                <w:b w:val="0"/>
+                <w:i w:val="0"/>
+                <w:color w:val="1A1A1A"/>
+                <w:sz w:val="19"/>
+              </w:rPr>
+              <w:t>유가 제외 그림</w:t>
             </w:r>
           </w:p>
         </w:tc>
@@ -6627,6 +9744,21 @@
                 <w:color w:val="1A1A1A"/>
                 <w:sz w:val="21"/>
               </w:rPr>
+              <w:t>10년 5.0~5.3%를 추세로 다시 넘는지, 헤드라인 물가가 3.4에서 재가속하는지. AND가 켜지는지.</w:t>
+            </w:r>
+          </w:p>
+          <w:p>
+            <w:pPr>
+              <w:spacing w:after="20" w:before="0" w:line="276" w:lineRule="auto"/>
+            </w:pPr>
+            <w:r>
+              <w:rPr>
+                <w:rFonts w:ascii="맑은 고딕" w:hAnsi="맑은 고딕" w:eastAsia="맑은 고딕"/>
+                <w:b w:val="0"/>
+                <w:i w:val="0"/>
+                <w:color w:val="1A1A1A"/>
+                <w:sz w:val="21"/>
+              </w:rPr>
               <w:t>10/1 마이크론 마진이 80%대 후반 스토리를 받쳐 주는지.</w:t>
             </w:r>
           </w:p>
@@ -6658,21 +9790,6 @@
                 <w:sz w:val="21"/>
               </w:rPr>
               <w:t>Ohio·New York이 탐색에서 계약으로 넘어가는지. Indiana는 이미 별축.</w:t>
-            </w:r>
-          </w:p>
-          <w:p>
-            <w:pPr>
-              <w:spacing w:after="20" w:before="0" w:line="276" w:lineRule="auto"/>
-            </w:pPr>
-            <w:r>
-              <w:rPr>
-                <w:rFonts w:ascii="맑은 고딕" w:hAnsi="맑은 고딕" w:eastAsia="맑은 고딕"/>
-                <w:b w:val="0"/>
-                <w:i w:val="0"/>
-                <w:color w:val="1A1A1A"/>
-                <w:sz w:val="21"/>
-              </w:rPr>
-              <w:t>10년 5%와 WTI $100–110이 다시 붙는지. 붙으면 같은 조정 논리가 반복된다.</w:t>
             </w:r>
           </w:p>
         </w:tc>
@@ -6726,7 +9843,7 @@
         <w:color w:val="4B5563"/>
         <w:sz w:val="16"/>
       </w:rPr>
-      <w:t xml:space="preserve">영상 5편 + 퀵코멘트를 주제별로 재구성  ·  숫자는 공개 자료로 교차검증  ·  </w:t>
+      <w:t xml:space="preserve">영상 6편 + 퀵코멘트를 주제별로 재구성  ·  숫자는 공개 자료로 교차검증  ·  </w:t>
     </w:r>
     <w:fldSimple w:instr=" PAGE ">
       <w:r>
@@ -6757,7 +9874,7 @@
         <w:color w:val="4B5563"/>
         <w:sz w:val="17"/>
       </w:rPr>
-      <w:t>9/18  AI·반도체 시장 코멘트  ·  BOJ 인상일  ·  강의노트</w:t>
+      <w:t>9/18  AI·반도체 시장 코멘트  ·  BOJ + 이은택  ·  강의노트</w:t>
     </w:r>
   </w:p>
 </w:hdr>

</xml_diff>

<commit_message>
Add Friday box, NVIDIA cash, and token P↓Q↑ to Sep 18 brief
Fold Yun Jiho, Infomax weekly, Hwang Yuhyun, and the materials
roundtable into the one-board and lecture notes with fact tags.

Co-authored-by: choijunh-cloud <choijunh-cloud@users.noreply.github.com>
</commit_message>
<xml_diff>
--- a/lectures/9월 18일 AI·반도체 시장 코멘트.docx
+++ b/lectures/9월 18일 AI·반도체 시장 코멘트.docx
@@ -15,7 +15,7 @@
           <w:color w:val="4B5563"/>
           <w:sz w:val="21"/>
         </w:rPr>
-        <w:t>2026. 9. 18. 강의노트  ·  FOMC 다음날 + BOJ 인상일  ·  영상 6편 + 퀵코멘트</w:t>
+        <w:t>2026. 9. 18. 강의노트  ·  FOMC 다음날 + BOJ 인상일  ·  영상 10편 + 퀵코멘트</w:t>
       </w:r>
     </w:p>
     <w:p>
@@ -31,7 +31,7 @@
           <w:color w:val="B8943A"/>
           <w:sz w:val="26"/>
         </w:rPr>
-        <w:t>산은 넘었다. 바닥은 W. 5%는 터치일 뿐 AND가 안 켜졌다</w:t>
+        <w:t>산은 넘었다. 바닥은 W. 박스는 6,000–7,150. 현금이 답을 안 냈다</w:t>
       </w:r>
     </w:p>
     <w:p>
@@ -63,7 +63,7 @@
           <w:color w:val="1E407C"/>
           <w:sz w:val="24"/>
         </w:rPr>
-        <w:t>이은택 W바닥  ·  Gravity Rules  ·  노드  ·  메모리 2031  ·  Generac</w:t>
+        <w:t>이은택 W바닥  ·  윤지호 박스  ·  엔비디아 현금 40%  ·  토큰 P↓Q↑</w:t>
       </w:r>
     </w:p>
     <w:tbl>
@@ -137,6 +137,36 @@
                 <w:color w:val="1A1A1A"/>
                 <w:sz w:val="21"/>
               </w:rPr>
+              <w:t>윤지호: 위로도 아래로도 쉽지 않은 박스. 8,000은 아직 안 연다. 상단은 하이퍼스케일러가 토큰으로 현금을 다시 만들어야 열린다.</w:t>
+            </w:r>
+          </w:p>
+          <w:p>
+            <w:pPr>
+              <w:spacing w:after="20" w:before="0" w:line="276" w:lineRule="auto"/>
+            </w:pPr>
+            <w:r>
+              <w:rPr>
+                <w:rFonts w:ascii="맑은 고딕" w:hAnsi="맑은 고딕" w:eastAsia="맑은 고딕"/>
+                <w:b w:val="0"/>
+                <w:i w:val="0"/>
+                <w:color w:val="1A1A1A"/>
+                <w:sz w:val="21"/>
+              </w:rPr>
+              <w:t>엔비디아 Q2 마진은 75%인데 영업현금 전환은 40.3%. 매출채권 DSO 60일. 지분평가를 ‘2분기 상당액’으로 쓰면 과장이다.</w:t>
+            </w:r>
+          </w:p>
+          <w:p>
+            <w:pPr>
+              <w:spacing w:after="20" w:before="0" w:line="276" w:lineRule="auto"/>
+            </w:pPr>
+            <w:r>
+              <w:rPr>
+                <w:rFonts w:ascii="맑은 고딕" w:hAnsi="맑은 고딕" w:eastAsia="맑은 고딕"/>
+                <w:b w:val="0"/>
+                <w:i w:val="0"/>
+                <w:color w:val="1A1A1A"/>
+                <w:sz w:val="21"/>
+              </w:rPr>
               <w:t>버블 붕괴는 미 10년 5.0~5.3% 추세 돌파와 인플레 No Way Back의 AND다. 이번 주 5.04 터치는 금요일 4.95로 해제됐다.</w:t>
             </w:r>
           </w:p>
@@ -152,37 +182,7 @@
                 <w:color w:val="1A1A1A"/>
                 <w:sz w:val="21"/>
               </w:rPr>
-              <w:t>빅테크는 캡엑스를 못 멈춘다. 꺾는 쪽은 자본공급자다. 7월 알파벳이 그 증거(캡엑스 상향, 주가 −7%).</w:t>
-            </w:r>
-          </w:p>
-          <w:p>
-            <w:pPr>
-              <w:spacing w:after="20" w:before="0" w:line="276" w:lineRule="auto"/>
-            </w:pPr>
-            <w:r>
-              <w:rPr>
-                <w:rFonts w:ascii="맑은 고딕" w:hAnsi="맑은 고딕" w:eastAsia="맑은 고딕"/>
-                <w:b w:val="0"/>
-                <w:i w:val="0"/>
-                <w:color w:val="1A1A1A"/>
-                <w:sz w:val="21"/>
-              </w:rPr>
-              <w:t>정지훈의 프레임은 그대로다. 병목=노드=돈. 연산은 풀렸고 지금은 메모리, 다음 영수증은 전력이다.</w:t>
-            </w:r>
-          </w:p>
-          <w:p>
-            <w:pPr>
-              <w:spacing w:after="20" w:before="0" w:line="276" w:lineRule="auto"/>
-            </w:pPr>
-            <w:r>
-              <w:rPr>
-                <w:rFonts w:ascii="맑은 고딕" w:hAnsi="맑은 고딕" w:eastAsia="맑은 고딕"/>
-                <w:b w:val="0"/>
-                <w:i w:val="0"/>
-                <w:color w:val="1A1A1A"/>
-                <w:sz w:val="21"/>
-              </w:rPr>
-              <w:t>하이닉스 미국은 Indiana(확정) · Ohio(협의) · New York(검토). Citi는 메모리 부족을 2031까지 볼 수 있다.</w:t>
+              <w:t>정지훈의 프레임은 그대로다. 병목=노드=돈. 연산은 풀렸고 지금은 메모리, 다음 영수증은 전력·후공정이다.</w:t>
             </w:r>
           </w:p>
         </w:tc>
@@ -537,7 +537,7 @@
                 <w:color w:val="1A1A1A"/>
                 <w:sz w:val="19"/>
               </w:rPr>
-              <w:t>Ohio/NY 확정, 젠슨 2배=매출 2배, 원/달러 1,587, 5% 터치=붕괴, 코스피 −30%를 정확한 낙폭, 이윤택</w:t>
+              <w:t>Ohio/NY 확정, 젠슨 2배=매출 2배, 원/달러 1,587, 5% 터치=붕괴, PER 역수=20%, CDS 7월 급등, 토큰 2,400%, 하나마이크론=삼성 확정 파트너, 이윤택</w:t>
             </w:r>
           </w:p>
         </w:tc>
@@ -767,6 +767,258 @@
                 <w:sz w:val="19"/>
               </w:rPr>
               <w:t>V/W/트리플, Gravity Rules AND, 자본공급자, 고통지수, 주가 선행</w:t>
+            </w:r>
+          </w:p>
+        </w:tc>
+      </w:tr>
+      <w:tr>
+        <w:trPr>
+          <w:cantSplit/>
+        </w:trPr>
+        <w:tc>
+          <w:tcPr>
+            <w:tcW w:type="dxa" w:w="2494"/>
+            <w:shd w:val="clear" w:color="auto" w:fill="FFFFFF"/>
+            <w:tcMar>
+              <w:top w:w="60" w:type="dxa"/>
+              <w:left w:w="80" w:type="dxa"/>
+              <w:bottom w:w="60" w:type="dxa"/>
+              <w:right w:w="80" w:type="dxa"/>
+            </w:tcMar>
+          </w:tcPr>
+          <w:p>
+            <w:pPr>
+              <w:spacing w:before="0" w:after="0" w:line="269" w:lineRule="auto"/>
+              <w:jc w:val="left"/>
+            </w:pPr>
+            <w:r/>
+            <w:r>
+              <w:rPr>
+                <w:rFonts w:ascii="맑은 고딕" w:hAnsi="맑은 고딕" w:eastAsia="맑은 고딕"/>
+                <w:b/>
+                <w:i w:val="0"/>
+                <w:color w:val="1A1A1A"/>
+                <w:sz w:val="19"/>
+              </w:rPr>
+              <w:t>윤지호 (FN 대담)</w:t>
+            </w:r>
+          </w:p>
+        </w:tc>
+        <w:tc>
+          <w:tcPr>
+            <w:tcW w:type="dxa" w:w="7483"/>
+            <w:shd w:val="clear" w:color="auto" w:fill="FFFFFF"/>
+            <w:tcMar>
+              <w:top w:w="60" w:type="dxa"/>
+              <w:left w:w="80" w:type="dxa"/>
+              <w:bottom w:w="60" w:type="dxa"/>
+              <w:right w:w="80" w:type="dxa"/>
+            </w:tcMar>
+          </w:tcPr>
+          <w:p>
+            <w:pPr>
+              <w:spacing w:before="0" w:after="0" w:line="269" w:lineRule="auto"/>
+              <w:jc w:val="center"/>
+            </w:pPr>
+            <w:r/>
+            <w:r>
+              <w:rPr>
+                <w:rFonts w:ascii="맑은 고딕" w:hAnsi="맑은 고딕" w:eastAsia="맑은 고딕"/>
+                <w:b w:val="0"/>
+                <w:i w:val="0"/>
+                <w:color w:val="1A1A1A"/>
+                <w:sz w:val="19"/>
+              </w:rPr>
+              <w:t>박스, 하이퍼스케일러 현금, 엔비디아 75/40, 토큰·속도조절</w:t>
+            </w:r>
+          </w:p>
+        </w:tc>
+      </w:tr>
+      <w:tr>
+        <w:trPr>
+          <w:cantSplit/>
+        </w:trPr>
+        <w:tc>
+          <w:tcPr>
+            <w:tcW w:type="dxa" w:w="2494"/>
+            <w:shd w:val="clear" w:color="auto" w:fill="F7F9FC"/>
+            <w:tcMar>
+              <w:top w:w="60" w:type="dxa"/>
+              <w:left w:w="80" w:type="dxa"/>
+              <w:bottom w:w="60" w:type="dxa"/>
+              <w:right w:w="80" w:type="dxa"/>
+            </w:tcMar>
+          </w:tcPr>
+          <w:p>
+            <w:pPr>
+              <w:spacing w:before="0" w:after="0" w:line="269" w:lineRule="auto"/>
+              <w:jc w:val="left"/>
+            </w:pPr>
+            <w:r/>
+            <w:r>
+              <w:rPr>
+                <w:rFonts w:ascii="맑은 고딕" w:hAnsi="맑은 고딕" w:eastAsia="맑은 고딕"/>
+                <w:b/>
+                <w:i w:val="0"/>
+                <w:color w:val="1A1A1A"/>
+                <w:sz w:val="19"/>
+              </w:rPr>
+              <w:t>인포맥스 라이브 주간</w:t>
+            </w:r>
+          </w:p>
+        </w:tc>
+        <w:tc>
+          <w:tcPr>
+            <w:tcW w:type="dxa" w:w="7483"/>
+            <w:shd w:val="clear" w:color="auto" w:fill="F7F9FC"/>
+            <w:tcMar>
+              <w:top w:w="60" w:type="dxa"/>
+              <w:left w:w="80" w:type="dxa"/>
+              <w:bottom w:w="60" w:type="dxa"/>
+              <w:right w:w="80" w:type="dxa"/>
+            </w:tcMar>
+          </w:tcPr>
+          <w:p>
+            <w:pPr>
+              <w:spacing w:before="0" w:after="0" w:line="269" w:lineRule="auto"/>
+              <w:jc w:val="center"/>
+            </w:pPr>
+            <w:r/>
+            <w:r>
+              <w:rPr>
+                <w:rFonts w:ascii="맑은 고딕" w:hAnsi="맑은 고딕" w:eastAsia="맑은 고딕"/>
+                <w:b w:val="0"/>
+                <w:i w:val="0"/>
+                <w:color w:val="1A1A1A"/>
+                <w:sz w:val="19"/>
+              </w:rPr>
+              <w:t>FOMC 둘째 날, 7,150 네 번째, P↓Q↑, 삼성 EPS 조건, 송유관</w:t>
+            </w:r>
+          </w:p>
+        </w:tc>
+      </w:tr>
+      <w:tr>
+        <w:trPr>
+          <w:cantSplit/>
+        </w:trPr>
+        <w:tc>
+          <w:tcPr>
+            <w:tcW w:type="dxa" w:w="2494"/>
+            <w:shd w:val="clear" w:color="auto" w:fill="FFFFFF"/>
+            <w:tcMar>
+              <w:top w:w="60" w:type="dxa"/>
+              <w:left w:w="80" w:type="dxa"/>
+              <w:bottom w:w="60" w:type="dxa"/>
+              <w:right w:w="80" w:type="dxa"/>
+            </w:tcMar>
+          </w:tcPr>
+          <w:p>
+            <w:pPr>
+              <w:spacing w:before="0" w:after="0" w:line="269" w:lineRule="auto"/>
+              <w:jc w:val="left"/>
+            </w:pPr>
+            <w:r/>
+            <w:r>
+              <w:rPr>
+                <w:rFonts w:ascii="맑은 고딕" w:hAnsi="맑은 고딕" w:eastAsia="맑은 고딕"/>
+                <w:b/>
+                <w:i w:val="0"/>
+                <w:color w:val="1A1A1A"/>
+                <w:sz w:val="19"/>
+              </w:rPr>
+              <w:t>황유현 (신한, 주린이구조대)</w:t>
+            </w:r>
+          </w:p>
+        </w:tc>
+        <w:tc>
+          <w:tcPr>
+            <w:tcW w:type="dxa" w:w="7483"/>
+            <w:shd w:val="clear" w:color="auto" w:fill="FFFFFF"/>
+            <w:tcMar>
+              <w:top w:w="60" w:type="dxa"/>
+              <w:left w:w="80" w:type="dxa"/>
+              <w:bottom w:w="60" w:type="dxa"/>
+              <w:right w:w="80" w:type="dxa"/>
+            </w:tcMar>
+          </w:tcPr>
+          <w:p>
+            <w:pPr>
+              <w:spacing w:before="0" w:after="0" w:line="269" w:lineRule="auto"/>
+              <w:jc w:val="center"/>
+            </w:pPr>
+            <w:r/>
+            <w:r>
+              <w:rPr>
+                <w:rFonts w:ascii="맑은 고딕" w:hAnsi="맑은 고딕" w:eastAsia="맑은 고딕"/>
+                <w:b w:val="0"/>
+                <w:i w:val="0"/>
+                <w:color w:val="1A1A1A"/>
+                <w:sz w:val="19"/>
+              </w:rPr>
+              <w:t>기정사실화, 유가 퍼즐, 순환매, 닉스 210만(해석)</w:t>
+            </w:r>
+          </w:p>
+        </w:tc>
+      </w:tr>
+      <w:tr>
+        <w:trPr>
+          <w:cantSplit/>
+        </w:trPr>
+        <w:tc>
+          <w:tcPr>
+            <w:tcW w:type="dxa" w:w="2494"/>
+            <w:shd w:val="clear" w:color="auto" w:fill="F7F9FC"/>
+            <w:tcMar>
+              <w:top w:w="60" w:type="dxa"/>
+              <w:left w:w="80" w:type="dxa"/>
+              <w:bottom w:w="60" w:type="dxa"/>
+              <w:right w:w="80" w:type="dxa"/>
+            </w:tcMar>
+          </w:tcPr>
+          <w:p>
+            <w:pPr>
+              <w:spacing w:before="0" w:after="0" w:line="269" w:lineRule="auto"/>
+              <w:jc w:val="left"/>
+            </w:pPr>
+            <w:r/>
+            <w:r>
+              <w:rPr>
+                <w:rFonts w:ascii="맑은 고딕" w:hAnsi="맑은 고딕" w:eastAsia="맑은 고딕"/>
+                <w:b/>
+                <w:i w:val="0"/>
+                <w:color w:val="1A1A1A"/>
+                <w:sz w:val="19"/>
+              </w:rPr>
+              <w:t>소부장 좌담</w:t>
+            </w:r>
+          </w:p>
+        </w:tc>
+        <w:tc>
+          <w:tcPr>
+            <w:tcW w:type="dxa" w:w="7483"/>
+            <w:shd w:val="clear" w:color="auto" w:fill="F7F9FC"/>
+            <w:tcMar>
+              <w:top w:w="60" w:type="dxa"/>
+              <w:left w:w="80" w:type="dxa"/>
+              <w:bottom w:w="60" w:type="dxa"/>
+              <w:right w:w="80" w:type="dxa"/>
+            </w:tcMar>
+          </w:tcPr>
+          <w:p>
+            <w:pPr>
+              <w:spacing w:before="0" w:after="0" w:line="269" w:lineRule="auto"/>
+              <w:jc w:val="center"/>
+            </w:pPr>
+            <w:r/>
+            <w:r>
+              <w:rPr>
+                <w:rFonts w:ascii="맑은 고딕" w:hAnsi="맑은 고딕" w:eastAsia="맑은 고딕"/>
+                <w:b w:val="0"/>
+                <w:i w:val="0"/>
+                <w:color w:val="1A1A1A"/>
+                <w:sz w:val="19"/>
+              </w:rPr>
+              <w:t>HBM4 외주, Q사이클 28년, 원전/전지/광통신, 코스닥 시총</w:t>
             </w:r>
           </w:p>
         </w:tc>
@@ -2247,6 +2499,222 @@
                 <w:sz w:val="19"/>
               </w:rPr>
               <w:t>지속학습 → 2031까지 연장 가능</w:t>
+            </w:r>
+          </w:p>
+        </w:tc>
+      </w:tr>
+      <w:tr>
+        <w:trPr>
+          <w:cantSplit/>
+        </w:trPr>
+        <w:tc>
+          <w:tcPr>
+            <w:tcW w:type="dxa" w:w="1928"/>
+            <w:shd w:val="clear" w:color="auto" w:fill="F7F9FC"/>
+            <w:tcMar>
+              <w:top w:w="60" w:type="dxa"/>
+              <w:left w:w="80" w:type="dxa"/>
+              <w:bottom w:w="60" w:type="dxa"/>
+              <w:right w:w="80" w:type="dxa"/>
+            </w:tcMar>
+          </w:tcPr>
+          <w:p>
+            <w:pPr>
+              <w:spacing w:before="0" w:after="0" w:line="269" w:lineRule="auto"/>
+              <w:jc w:val="left"/>
+            </w:pPr>
+            <w:r/>
+            <w:r>
+              <w:rPr>
+                <w:rFonts w:ascii="맑은 고딕" w:hAnsi="맑은 고딕" w:eastAsia="맑은 고딕"/>
+                <w:b/>
+                <w:i w:val="0"/>
+                <w:color w:val="1A1A1A"/>
+                <w:sz w:val="19"/>
+              </w:rPr>
+              <w:t>엔비디아 Q2</w:t>
+            </w:r>
+          </w:p>
+        </w:tc>
+        <w:tc>
+          <w:tcPr>
+            <w:tcW w:type="dxa" w:w="3515"/>
+            <w:shd w:val="clear" w:color="auto" w:fill="F7F9FC"/>
+            <w:tcMar>
+              <w:top w:w="60" w:type="dxa"/>
+              <w:left w:w="80" w:type="dxa"/>
+              <w:bottom w:w="60" w:type="dxa"/>
+              <w:right w:w="80" w:type="dxa"/>
+            </w:tcMar>
+          </w:tcPr>
+          <w:p>
+            <w:pPr>
+              <w:spacing w:before="0" w:after="20" w:line="269" w:lineRule="auto"/>
+              <w:jc w:val="center"/>
+            </w:pPr>
+            <w:r/>
+            <w:r>
+              <w:rPr>
+                <w:rFonts w:ascii="맑은 고딕" w:hAnsi="맑은 고딕" w:eastAsia="맑은 고딕"/>
+                <w:b w:val="0"/>
+                <w:i w:val="0"/>
+                <w:color w:val="1A1A1A"/>
+                <w:sz w:val="19"/>
+              </w:rPr>
+              <w:t>GM 75.0%</w:t>
+            </w:r>
+          </w:p>
+          <w:p>
+            <w:pPr>
+              <w:spacing w:before="0" w:after="0" w:line="269" w:lineRule="auto"/>
+              <w:jc w:val="center"/>
+            </w:pPr>
+            <w:r>
+              <w:rPr>
+                <w:rFonts w:ascii="맑은 고딕" w:hAnsi="맑은 고딕" w:eastAsia="맑은 고딕"/>
+                <w:b w:val="0"/>
+                <w:i w:val="0"/>
+                <w:color w:val="1A1A1A"/>
+                <w:sz w:val="19"/>
+              </w:rPr>
+              <w:t>OCF/NI 40.3%</w:t>
+            </w:r>
+          </w:p>
+        </w:tc>
+        <w:tc>
+          <w:tcPr>
+            <w:tcW w:type="dxa" w:w="4535"/>
+            <w:shd w:val="clear" w:color="auto" w:fill="F7F9FC"/>
+            <w:tcMar>
+              <w:top w:w="60" w:type="dxa"/>
+              <w:left w:w="80" w:type="dxa"/>
+              <w:bottom w:w="60" w:type="dxa"/>
+              <w:right w:w="80" w:type="dxa"/>
+            </w:tcMar>
+          </w:tcPr>
+          <w:p>
+            <w:pPr>
+              <w:spacing w:before="0" w:after="0" w:line="269" w:lineRule="auto"/>
+              <w:jc w:val="center"/>
+            </w:pPr>
+            <w:r/>
+            <w:r>
+              <w:rPr>
+                <w:rFonts w:ascii="맑은 고딕" w:hAnsi="맑은 고딕" w:eastAsia="맑은 고딕"/>
+                <w:b w:val="0"/>
+                <w:i w:val="0"/>
+                <w:color w:val="1A1A1A"/>
+                <w:sz w:val="19"/>
+              </w:rPr>
+              <w:t>매출채권 $63.1B · DSO 60일</w:t>
+            </w:r>
+          </w:p>
+        </w:tc>
+      </w:tr>
+      <w:tr>
+        <w:trPr>
+          <w:cantSplit/>
+        </w:trPr>
+        <w:tc>
+          <w:tcPr>
+            <w:tcW w:type="dxa" w:w="1928"/>
+            <w:shd w:val="clear" w:color="auto" w:fill="FFFFFF"/>
+            <w:tcMar>
+              <w:top w:w="60" w:type="dxa"/>
+              <w:left w:w="80" w:type="dxa"/>
+              <w:bottom w:w="60" w:type="dxa"/>
+              <w:right w:w="80" w:type="dxa"/>
+            </w:tcMar>
+          </w:tcPr>
+          <w:p>
+            <w:pPr>
+              <w:spacing w:before="0" w:after="0" w:line="269" w:lineRule="auto"/>
+              <w:jc w:val="left"/>
+            </w:pPr>
+            <w:r/>
+            <w:r>
+              <w:rPr>
+                <w:rFonts w:ascii="맑은 고딕" w:hAnsi="맑은 고딕" w:eastAsia="맑은 고딕"/>
+                <w:b/>
+                <w:i w:val="0"/>
+                <w:color w:val="1A1A1A"/>
+                <w:sz w:val="19"/>
+              </w:rPr>
+              <w:t>토큰 8월</w:t>
+            </w:r>
+          </w:p>
+        </w:tc>
+        <w:tc>
+          <w:tcPr>
+            <w:tcW w:type="dxa" w:w="3515"/>
+            <w:shd w:val="clear" w:color="auto" w:fill="FFFFFF"/>
+            <w:tcMar>
+              <w:top w:w="60" w:type="dxa"/>
+              <w:left w:w="80" w:type="dxa"/>
+              <w:bottom w:w="60" w:type="dxa"/>
+              <w:right w:w="80" w:type="dxa"/>
+            </w:tcMar>
+          </w:tcPr>
+          <w:p>
+            <w:pPr>
+              <w:spacing w:before="0" w:after="20" w:line="269" w:lineRule="auto"/>
+              <w:jc w:val="center"/>
+            </w:pPr>
+            <w:r/>
+            <w:r>
+              <w:rPr>
+                <w:rFonts w:ascii="맑은 고딕" w:hAnsi="맑은 고딕" w:eastAsia="맑은 고딕"/>
+                <w:b w:val="0"/>
+                <w:i w:val="0"/>
+                <w:color w:val="1A1A1A"/>
+                <w:sz w:val="19"/>
+              </w:rPr>
+              <w:t>볼륨 YoY 28배</w:t>
+            </w:r>
+          </w:p>
+          <w:p>
+            <w:pPr>
+              <w:spacing w:before="0" w:after="0" w:line="269" w:lineRule="auto"/>
+              <w:jc w:val="center"/>
+            </w:pPr>
+            <w:r>
+              <w:rPr>
+                <w:rFonts w:ascii="맑은 고딕" w:hAnsi="맑은 고딕" w:eastAsia="맑은 고딕"/>
+                <w:b w:val="0"/>
+                <w:i w:val="0"/>
+                <w:color w:val="1A1A1A"/>
+                <w:sz w:val="19"/>
+              </w:rPr>
+              <w:t>지출 12배</w:t>
+            </w:r>
+          </w:p>
+        </w:tc>
+        <w:tc>
+          <w:tcPr>
+            <w:tcW w:type="dxa" w:w="4535"/>
+            <w:shd w:val="clear" w:color="auto" w:fill="FFFFFF"/>
+            <w:tcMar>
+              <w:top w:w="60" w:type="dxa"/>
+              <w:left w:w="80" w:type="dxa"/>
+              <w:bottom w:w="60" w:type="dxa"/>
+              <w:right w:w="80" w:type="dxa"/>
+            </w:tcMar>
+          </w:tcPr>
+          <w:p>
+            <w:pPr>
+              <w:spacing w:before="0" w:after="0" w:line="269" w:lineRule="auto"/>
+              <w:jc w:val="center"/>
+            </w:pPr>
+            <w:r/>
+            <w:r>
+              <w:rPr>
+                <w:rFonts w:ascii="맑은 고딕" w:hAnsi="맑은 고딕" w:eastAsia="맑은 고딕"/>
+                <w:b w:val="0"/>
+                <w:i w:val="0"/>
+                <w:color w:val="1A1A1A"/>
+                <w:sz w:val="19"/>
+              </w:rPr>
+              <w:t>가중단가 −28%. 방송 2,400%는 부분</w:t>
             </w:r>
           </w:p>
         </w:tc>
@@ -8144,6 +8612,490 @@
           </w:p>
         </w:tc>
       </w:tr>
+      <w:tr>
+        <w:trPr>
+          <w:cantSplit/>
+        </w:trPr>
+        <w:tc>
+          <w:tcPr>
+            <w:tcW w:type="dxa" w:w="1587"/>
+            <w:shd w:val="clear" w:color="auto" w:fill="FFFFFF"/>
+            <w:tcMar>
+              <w:top w:w="60" w:type="dxa"/>
+              <w:left w:w="80" w:type="dxa"/>
+              <w:bottom w:w="60" w:type="dxa"/>
+              <w:right w:w="80" w:type="dxa"/>
+            </w:tcMar>
+          </w:tcPr>
+          <w:p>
+            <w:pPr>
+              <w:spacing w:before="0" w:after="0" w:line="269" w:lineRule="auto"/>
+              <w:jc w:val="left"/>
+            </w:pPr>
+            <w:r/>
+            <w:r>
+              <w:rPr>
+                <w:rFonts w:ascii="맑은 고딕" w:hAnsi="맑은 고딕" w:eastAsia="맑은 고딕"/>
+                <w:b/>
+                <w:i w:val="0"/>
+                <w:color w:val="1A1A1A"/>
+                <w:sz w:val="19"/>
+              </w:rPr>
+              <w:t>윤지호</w:t>
+            </w:r>
+          </w:p>
+        </w:tc>
+        <w:tc>
+          <w:tcPr>
+            <w:tcW w:type="dxa" w:w="2381"/>
+            <w:shd w:val="clear" w:color="auto" w:fill="FFFFFF"/>
+            <w:tcMar>
+              <w:top w:w="60" w:type="dxa"/>
+              <w:left w:w="80" w:type="dxa"/>
+              <w:bottom w:w="60" w:type="dxa"/>
+              <w:right w:w="80" w:type="dxa"/>
+            </w:tcMar>
+          </w:tcPr>
+          <w:p>
+            <w:pPr>
+              <w:spacing w:before="0" w:after="0" w:line="269" w:lineRule="auto"/>
+              <w:jc w:val="center"/>
+            </w:pPr>
+            <w:r/>
+            <w:r>
+              <w:rPr>
+                <w:rFonts w:ascii="맑은 고딕" w:hAnsi="맑은 고딕" w:eastAsia="맑은 고딕"/>
+                <w:b w:val="0"/>
+                <w:i w:val="0"/>
+                <w:color w:val="1A1A1A"/>
+                <w:sz w:val="19"/>
+              </w:rPr>
+              <w:t>박스. 8,000 아님</w:t>
+            </w:r>
+          </w:p>
+        </w:tc>
+        <w:tc>
+          <w:tcPr>
+            <w:tcW w:type="dxa" w:w="3061"/>
+            <w:shd w:val="clear" w:color="auto" w:fill="FFFFFF"/>
+            <w:tcMar>
+              <w:top w:w="60" w:type="dxa"/>
+              <w:left w:w="80" w:type="dxa"/>
+              <w:bottom w:w="60" w:type="dxa"/>
+              <w:right w:w="80" w:type="dxa"/>
+            </w:tcMar>
+          </w:tcPr>
+          <w:p>
+            <w:pPr>
+              <w:spacing w:before="0" w:after="0" w:line="269" w:lineRule="auto"/>
+              <w:jc w:val="center"/>
+            </w:pPr>
+            <w:r/>
+            <w:r>
+              <w:rPr>
+                <w:rFonts w:ascii="맑은 고딕" w:hAnsi="맑은 고딕" w:eastAsia="맑은 고딕"/>
+                <w:b w:val="0"/>
+                <w:i w:val="0"/>
+                <w:color w:val="1A1A1A"/>
+                <w:sz w:val="19"/>
+              </w:rPr>
+              <w:t>하이퍼스케일러 현금·토큰</w:t>
+            </w:r>
+          </w:p>
+        </w:tc>
+        <w:tc>
+          <w:tcPr>
+            <w:tcW w:type="dxa" w:w="2948"/>
+            <w:shd w:val="clear" w:color="auto" w:fill="FFFFFF"/>
+            <w:tcMar>
+              <w:top w:w="60" w:type="dxa"/>
+              <w:left w:w="80" w:type="dxa"/>
+              <w:bottom w:w="60" w:type="dxa"/>
+              <w:right w:w="80" w:type="dxa"/>
+            </w:tcMar>
+          </w:tcPr>
+          <w:p>
+            <w:pPr>
+              <w:spacing w:before="0" w:after="0" w:line="269" w:lineRule="auto"/>
+              <w:jc w:val="center"/>
+            </w:pPr>
+            <w:r/>
+            <w:r>
+              <w:rPr>
+                <w:rFonts w:ascii="맑은 고딕" w:hAnsi="맑은 고딕" w:eastAsia="맑은 고딕"/>
+                <w:b w:val="0"/>
+                <w:i w:val="0"/>
+                <w:color w:val="1A1A1A"/>
+                <w:sz w:val="19"/>
+              </w:rPr>
+              <w:t>마진≠현금, 속도조절=코스트</w:t>
+            </w:r>
+          </w:p>
+        </w:tc>
+      </w:tr>
+      <w:tr>
+        <w:trPr>
+          <w:cantSplit/>
+        </w:trPr>
+        <w:tc>
+          <w:tcPr>
+            <w:tcW w:type="dxa" w:w="1587"/>
+            <w:shd w:val="clear" w:color="auto" w:fill="F7F9FC"/>
+            <w:tcMar>
+              <w:top w:w="60" w:type="dxa"/>
+              <w:left w:w="80" w:type="dxa"/>
+              <w:bottom w:w="60" w:type="dxa"/>
+              <w:right w:w="80" w:type="dxa"/>
+            </w:tcMar>
+          </w:tcPr>
+          <w:p>
+            <w:pPr>
+              <w:spacing w:before="0" w:after="0" w:line="269" w:lineRule="auto"/>
+              <w:jc w:val="left"/>
+            </w:pPr>
+            <w:r/>
+            <w:r>
+              <w:rPr>
+                <w:rFonts w:ascii="맑은 고딕" w:hAnsi="맑은 고딕" w:eastAsia="맑은 고딕"/>
+                <w:b/>
+                <w:i w:val="0"/>
+                <w:color w:val="1A1A1A"/>
+                <w:sz w:val="19"/>
+              </w:rPr>
+              <w:t>인포맥스</w:t>
+            </w:r>
+          </w:p>
+        </w:tc>
+        <w:tc>
+          <w:tcPr>
+            <w:tcW w:type="dxa" w:w="2381"/>
+            <w:shd w:val="clear" w:color="auto" w:fill="F7F9FC"/>
+            <w:tcMar>
+              <w:top w:w="60" w:type="dxa"/>
+              <w:left w:w="80" w:type="dxa"/>
+              <w:bottom w:w="60" w:type="dxa"/>
+              <w:right w:w="80" w:type="dxa"/>
+            </w:tcMar>
+          </w:tcPr>
+          <w:p>
+            <w:pPr>
+              <w:spacing w:before="0" w:after="0" w:line="269" w:lineRule="auto"/>
+              <w:jc w:val="center"/>
+            </w:pPr>
+            <w:r/>
+            <w:r>
+              <w:rPr>
+                <w:rFonts w:ascii="맑은 고딕" w:hAnsi="맑은 고딕" w:eastAsia="맑은 고딕"/>
+                <w:b w:val="0"/>
+                <w:i w:val="0"/>
+                <w:color w:val="1A1A1A"/>
+                <w:sz w:val="19"/>
+              </w:rPr>
+              <w:t>7,150 네 번째를 본다</w:t>
+            </w:r>
+          </w:p>
+        </w:tc>
+        <w:tc>
+          <w:tcPr>
+            <w:tcW w:type="dxa" w:w="3061"/>
+            <w:shd w:val="clear" w:color="auto" w:fill="F7F9FC"/>
+            <w:tcMar>
+              <w:top w:w="60" w:type="dxa"/>
+              <w:left w:w="80" w:type="dxa"/>
+              <w:bottom w:w="60" w:type="dxa"/>
+              <w:right w:w="80" w:type="dxa"/>
+            </w:tcMar>
+          </w:tcPr>
+          <w:p>
+            <w:pPr>
+              <w:spacing w:before="0" w:after="0" w:line="269" w:lineRule="auto"/>
+              <w:jc w:val="center"/>
+            </w:pPr>
+            <w:r/>
+            <w:r>
+              <w:rPr>
+                <w:rFonts w:ascii="맑은 고딕" w:hAnsi="맑은 고딕" w:eastAsia="맑은 고딕"/>
+                <w:b w:val="0"/>
+                <w:i w:val="0"/>
+                <w:color w:val="1A1A1A"/>
+                <w:sz w:val="19"/>
+              </w:rPr>
+              <w:t>P↓Q↑, 삼성 EPS 조건</w:t>
+            </w:r>
+          </w:p>
+        </w:tc>
+        <w:tc>
+          <w:tcPr>
+            <w:tcW w:type="dxa" w:w="2948"/>
+            <w:shd w:val="clear" w:color="auto" w:fill="F7F9FC"/>
+            <w:tcMar>
+              <w:top w:w="60" w:type="dxa"/>
+              <w:left w:w="80" w:type="dxa"/>
+              <w:bottom w:w="60" w:type="dxa"/>
+              <w:right w:w="80" w:type="dxa"/>
+            </w:tcMar>
+          </w:tcPr>
+          <w:p>
+            <w:pPr>
+              <w:spacing w:before="0" w:after="0" w:line="269" w:lineRule="auto"/>
+              <w:jc w:val="center"/>
+            </w:pPr>
+            <w:r/>
+            <w:r>
+              <w:rPr>
+                <w:rFonts w:ascii="맑은 고딕" w:hAnsi="맑은 고딕" w:eastAsia="맑은 고딕"/>
+                <w:b w:val="0"/>
+                <w:i w:val="0"/>
+                <w:color w:val="1A1A1A"/>
+                <w:sz w:val="19"/>
+              </w:rPr>
+              <w:t>송유관·추석 연휴 변동</w:t>
+            </w:r>
+          </w:p>
+        </w:tc>
+      </w:tr>
+      <w:tr>
+        <w:trPr>
+          <w:cantSplit/>
+        </w:trPr>
+        <w:tc>
+          <w:tcPr>
+            <w:tcW w:type="dxa" w:w="1587"/>
+            <w:shd w:val="clear" w:color="auto" w:fill="FFFFFF"/>
+            <w:tcMar>
+              <w:top w:w="60" w:type="dxa"/>
+              <w:left w:w="80" w:type="dxa"/>
+              <w:bottom w:w="60" w:type="dxa"/>
+              <w:right w:w="80" w:type="dxa"/>
+            </w:tcMar>
+          </w:tcPr>
+          <w:p>
+            <w:pPr>
+              <w:spacing w:before="0" w:after="0" w:line="269" w:lineRule="auto"/>
+              <w:jc w:val="left"/>
+            </w:pPr>
+            <w:r/>
+            <w:r>
+              <w:rPr>
+                <w:rFonts w:ascii="맑은 고딕" w:hAnsi="맑은 고딕" w:eastAsia="맑은 고딕"/>
+                <w:b/>
+                <w:i w:val="0"/>
+                <w:color w:val="1A1A1A"/>
+                <w:sz w:val="19"/>
+              </w:rPr>
+              <w:t>황유현</w:t>
+            </w:r>
+          </w:p>
+        </w:tc>
+        <w:tc>
+          <w:tcPr>
+            <w:tcW w:type="dxa" w:w="2381"/>
+            <w:shd w:val="clear" w:color="auto" w:fill="FFFFFF"/>
+            <w:tcMar>
+              <w:top w:w="60" w:type="dxa"/>
+              <w:left w:w="80" w:type="dxa"/>
+              <w:bottom w:w="60" w:type="dxa"/>
+              <w:right w:w="80" w:type="dxa"/>
+            </w:tcMar>
+          </w:tcPr>
+          <w:p>
+            <w:pPr>
+              <w:spacing w:before="0" w:after="0" w:line="269" w:lineRule="auto"/>
+              <w:jc w:val="center"/>
+            </w:pPr>
+            <w:r/>
+            <w:r>
+              <w:rPr>
+                <w:rFonts w:ascii="맑은 고딕" w:hAnsi="맑은 고딕" w:eastAsia="맑은 고딕"/>
+                <w:b w:val="0"/>
+                <w:i w:val="0"/>
+                <w:color w:val="1A1A1A"/>
+                <w:sz w:val="19"/>
+              </w:rPr>
+              <w:t>지수 추세는 아직</w:t>
+            </w:r>
+          </w:p>
+        </w:tc>
+        <w:tc>
+          <w:tcPr>
+            <w:tcW w:type="dxa" w:w="3061"/>
+            <w:shd w:val="clear" w:color="auto" w:fill="FFFFFF"/>
+            <w:tcMar>
+              <w:top w:w="60" w:type="dxa"/>
+              <w:left w:w="80" w:type="dxa"/>
+              <w:bottom w:w="60" w:type="dxa"/>
+              <w:right w:w="80" w:type="dxa"/>
+            </w:tcMar>
+          </w:tcPr>
+          <w:p>
+            <w:pPr>
+              <w:spacing w:before="0" w:after="0" w:line="269" w:lineRule="auto"/>
+              <w:jc w:val="center"/>
+            </w:pPr>
+            <w:r/>
+            <w:r>
+              <w:rPr>
+                <w:rFonts w:ascii="맑은 고딕" w:hAnsi="맑은 고딕" w:eastAsia="맑은 고딕"/>
+                <w:b w:val="0"/>
+                <w:i w:val="0"/>
+                <w:color w:val="1A1A1A"/>
+                <w:sz w:val="19"/>
+              </w:rPr>
+              <w:t>순환매 1·2등, 전력</w:t>
+            </w:r>
+          </w:p>
+        </w:tc>
+        <w:tc>
+          <w:tcPr>
+            <w:tcW w:type="dxa" w:w="2948"/>
+            <w:shd w:val="clear" w:color="auto" w:fill="FFFFFF"/>
+            <w:tcMar>
+              <w:top w:w="60" w:type="dxa"/>
+              <w:left w:w="80" w:type="dxa"/>
+              <w:bottom w:w="60" w:type="dxa"/>
+              <w:right w:w="80" w:type="dxa"/>
+            </w:tcMar>
+          </w:tcPr>
+          <w:p>
+            <w:pPr>
+              <w:spacing w:before="0" w:after="0" w:line="269" w:lineRule="auto"/>
+              <w:jc w:val="center"/>
+            </w:pPr>
+            <w:r/>
+            <w:r>
+              <w:rPr>
+                <w:rFonts w:ascii="맑은 고딕" w:hAnsi="맑은 고딕" w:eastAsia="맑은 고딕"/>
+                <w:b w:val="0"/>
+                <w:i w:val="0"/>
+                <w:color w:val="1A1A1A"/>
+                <w:sz w:val="19"/>
+              </w:rPr>
+              <w:t>7,000 위 물량, 대주주 양도</w:t>
+            </w:r>
+          </w:p>
+        </w:tc>
+      </w:tr>
+      <w:tr>
+        <w:trPr>
+          <w:cantSplit/>
+        </w:trPr>
+        <w:tc>
+          <w:tcPr>
+            <w:tcW w:type="dxa" w:w="1587"/>
+            <w:shd w:val="clear" w:color="auto" w:fill="F7F9FC"/>
+            <w:tcMar>
+              <w:top w:w="60" w:type="dxa"/>
+              <w:left w:w="80" w:type="dxa"/>
+              <w:bottom w:w="60" w:type="dxa"/>
+              <w:right w:w="80" w:type="dxa"/>
+            </w:tcMar>
+          </w:tcPr>
+          <w:p>
+            <w:pPr>
+              <w:spacing w:before="0" w:after="0" w:line="269" w:lineRule="auto"/>
+              <w:jc w:val="left"/>
+            </w:pPr>
+            <w:r/>
+            <w:r>
+              <w:rPr>
+                <w:rFonts w:ascii="맑은 고딕" w:hAnsi="맑은 고딕" w:eastAsia="맑은 고딕"/>
+                <w:b/>
+                <w:i w:val="0"/>
+                <w:color w:val="1A1A1A"/>
+                <w:sz w:val="19"/>
+              </w:rPr>
+              <w:t>소부장 좌담</w:t>
+            </w:r>
+          </w:p>
+        </w:tc>
+        <w:tc>
+          <w:tcPr>
+            <w:tcW w:type="dxa" w:w="2381"/>
+            <w:shd w:val="clear" w:color="auto" w:fill="F7F9FC"/>
+            <w:tcMar>
+              <w:top w:w="60" w:type="dxa"/>
+              <w:left w:w="80" w:type="dxa"/>
+              <w:bottom w:w="60" w:type="dxa"/>
+              <w:right w:w="80" w:type="dxa"/>
+            </w:tcMar>
+          </w:tcPr>
+          <w:p>
+            <w:pPr>
+              <w:spacing w:before="0" w:after="0" w:line="269" w:lineRule="auto"/>
+              <w:jc w:val="center"/>
+            </w:pPr>
+            <w:r/>
+            <w:r>
+              <w:rPr>
+                <w:rFonts w:ascii="맑은 고딕" w:hAnsi="맑은 고딕" w:eastAsia="맑은 고딕"/>
+                <w:b w:val="0"/>
+                <w:i w:val="0"/>
+                <w:color w:val="1A1A1A"/>
+                <w:sz w:val="19"/>
+              </w:rPr>
+              <w:t>Q는 28년. 지금 풀베팅 아님</w:t>
+            </w:r>
+          </w:p>
+        </w:tc>
+        <w:tc>
+          <w:tcPr>
+            <w:tcW w:type="dxa" w:w="3061"/>
+            <w:shd w:val="clear" w:color="auto" w:fill="F7F9FC"/>
+            <w:tcMar>
+              <w:top w:w="60" w:type="dxa"/>
+              <w:left w:w="80" w:type="dxa"/>
+              <w:bottom w:w="60" w:type="dxa"/>
+              <w:right w:w="80" w:type="dxa"/>
+            </w:tcMar>
+          </w:tcPr>
+          <w:p>
+            <w:pPr>
+              <w:spacing w:before="0" w:after="0" w:line="269" w:lineRule="auto"/>
+              <w:jc w:val="center"/>
+            </w:pPr>
+            <w:r/>
+            <w:r>
+              <w:rPr>
+                <w:rFonts w:ascii="맑은 고딕" w:hAnsi="맑은 고딕" w:eastAsia="맑은 고딕"/>
+                <w:b w:val="0"/>
+                <w:i w:val="0"/>
+                <w:color w:val="1A1A1A"/>
+                <w:sz w:val="19"/>
+              </w:rPr>
+              <w:t>후공정·테스트·선제증설</w:t>
+            </w:r>
+          </w:p>
+        </w:tc>
+        <w:tc>
+          <w:tcPr>
+            <w:tcW w:type="dxa" w:w="2948"/>
+            <w:shd w:val="clear" w:color="auto" w:fill="F7F9FC"/>
+            <w:tcMar>
+              <w:top w:w="60" w:type="dxa"/>
+              <w:left w:w="80" w:type="dxa"/>
+              <w:bottom w:w="60" w:type="dxa"/>
+              <w:right w:w="80" w:type="dxa"/>
+            </w:tcMar>
+          </w:tcPr>
+          <w:p>
+            <w:pPr>
+              <w:spacing w:before="0" w:after="0" w:line="269" w:lineRule="auto"/>
+              <w:jc w:val="center"/>
+            </w:pPr>
+            <w:r/>
+            <w:r>
+              <w:rPr>
+                <w:rFonts w:ascii="맑은 고딕" w:hAnsi="맑은 고딕" w:eastAsia="맑은 고딕"/>
+                <w:b w:val="0"/>
+                <w:i w:val="0"/>
+                <w:color w:val="1A1A1A"/>
+                <w:sz w:val="19"/>
+              </w:rPr>
+              <w:t>소재 후행, 전지 마진</w:t>
+            </w:r>
+          </w:p>
+        </w:tc>
+      </w:tr>
     </w:tbl>
     <w:p>
       <w:pPr>
@@ -8279,7 +9231,1744 @@
           <w:color w:val="0F2043"/>
           <w:sz w:val="32"/>
         </w:rPr>
-        <w:t>고친 것 · 확인 넷</w:t>
+        <w:t>윤지호 — 박스이지 추세가 아니다</w:t>
+      </w:r>
+    </w:p>
+    <w:p>
+      <w:pPr>
+        <w:spacing w:before="40" w:after="160"/>
+        <w:jc w:val="center"/>
+      </w:pPr>
+      <w:r>
+        <w:drawing>
+          <wp:inline xmlns:a="http://schemas.openxmlformats.org/drawingml/2006/main" xmlns:pic="http://schemas.openxmlformats.org/drawingml/2006/picture">
+            <wp:extent cx="5903999" cy="3039042"/>
+            <wp:docPr id="13" name="Picture 13"/>
+            <wp:cNvGraphicFramePr>
+              <a:graphicFrameLocks noChangeAspect="1"/>
+            </wp:cNvGraphicFramePr>
+            <a:graphic>
+              <a:graphicData uri="http://schemas.openxmlformats.org/drawingml/2006/picture">
+                <pic:pic>
+                  <pic:nvPicPr>
+                    <pic:cNvPr id="0" name="13_box_range.png"/>
+                    <pic:cNvPicPr/>
+                  </pic:nvPicPr>
+                  <pic:blipFill>
+                    <a:blip r:embed="rId23"/>
+                    <a:stretch>
+                      <a:fillRect/>
+                    </a:stretch>
+                  </pic:blipFill>
+                  <pic:spPr>
+                    <a:xfrm>
+                      <a:off x="0" y="0"/>
+                      <a:ext cx="5903999" cy="3039042"/>
+                    </a:xfrm>
+                    <a:prstGeom prst="rect"/>
+                  </pic:spPr>
+                </pic:pic>
+              </a:graphicData>
+            </a:graphic>
+          </wp:inline>
+        </w:drawing>
+      </w:r>
+    </w:p>
+    <w:p>
+      <w:pPr>
+        <w:spacing w:after="120" w:before="0" w:line="283" w:lineRule="auto"/>
+        <w:jc w:val="left"/>
+      </w:pPr>
+      <w:r>
+        <w:rPr>
+          <w:rFonts w:ascii="맑은 고딕" w:hAnsi="맑은 고딕" w:eastAsia="맑은 고딕"/>
+          <w:b w:val="0"/>
+          <w:i w:val="0"/>
+          <w:color w:val="1A1A1A"/>
+          <w:sz w:val="22"/>
+        </w:rPr>
+        <w:t>파이낸셜뉴스 대담. 한줄평은 ‘위로도 아래로도 쉽지 않다’. 논트렌딩, 박스, 비추세. 주가 방향 세 갈래(오르냐 내리냐 횡보냐)로 줄이지 말고, 지금 가격을 결정하는 힘을 찾으라고 한다.</w:t>
+      </w:r>
+    </w:p>
+    <w:p>
+      <w:pPr>
+        <w:spacing w:before="200" w:after="80"/>
+      </w:pPr>
+      <w:r>
+        <w:rPr>
+          <w:rFonts w:ascii="맑은 고딕" w:hAnsi="맑은 고딕" w:eastAsia="맑은 고딕"/>
+          <w:b/>
+          <w:i w:val="0"/>
+          <w:color w:val="1E407C"/>
+          <w:sz w:val="26"/>
+        </w:rPr>
+        <w:t>두 소, 두 곰</w:t>
+      </w:r>
+    </w:p>
+    <w:p>
+      <w:pPr>
+        <w:spacing w:after="50" w:before="0" w:line="276" w:lineRule="auto"/>
+        <w:ind w:left="312" w:hanging="198"/>
+      </w:pPr>
+      <w:r>
+        <w:rPr>
+          <w:rFonts w:ascii="맑은 고딕" w:hAnsi="맑은 고딕" w:eastAsia="맑은 고딕"/>
+          <w:b w:val="0"/>
+          <w:i w:val="0"/>
+          <w:color w:val="1E407C"/>
+          <w:sz w:val="22"/>
+        </w:rPr>
+        <w:t xml:space="preserve">• </w:t>
+      </w:r>
+      <w:r>
+        <w:rPr>
+          <w:rFonts w:ascii="맑은 고딕" w:hAnsi="맑은 고딕" w:eastAsia="맑은 고딕"/>
+          <w:b w:val="0"/>
+          <w:i w:val="0"/>
+          <w:color w:val="1A1A1A"/>
+          <w:sz w:val="22"/>
+        </w:rPr>
+        <w:t>소: AI 과잉투자에 노출된 한국 기업 이익이 매우 좋아졌다. 작년 상법 개정·주주환원 기대가 겹쳐 주가가 날아올랐다.</w:t>
+      </w:r>
+    </w:p>
+    <w:p>
+      <w:pPr>
+        <w:spacing w:after="50" w:before="0" w:line="276" w:lineRule="auto"/>
+        <w:ind w:left="312" w:hanging="198"/>
+      </w:pPr>
+      <w:r>
+        <w:rPr>
+          <w:rFonts w:ascii="맑은 고딕" w:hAnsi="맑은 고딕" w:eastAsia="맑은 고딕"/>
+          <w:b w:val="0"/>
+          <w:i w:val="0"/>
+          <w:color w:val="1E407C"/>
+          <w:sz w:val="22"/>
+        </w:rPr>
+        <w:t xml:space="preserve">• </w:t>
+      </w:r>
+      <w:r>
+        <w:rPr>
+          <w:rFonts w:ascii="맑은 고딕" w:hAnsi="맑은 고딕" w:eastAsia="맑은 고딕"/>
+          <w:b w:val="0"/>
+          <w:i w:val="0"/>
+          <w:color w:val="1A1A1A"/>
+          <w:sz w:val="22"/>
+        </w:rPr>
+        <w:t>곰 1: 투자 사이클의 한계. 돈이 떨어지고 빌려 쓰게 되면 한계가 온 것 아니냐는 우려.</w:t>
+      </w:r>
+    </w:p>
+    <w:p>
+      <w:pPr>
+        <w:spacing w:after="50" w:before="0" w:line="276" w:lineRule="auto"/>
+        <w:ind w:left="312" w:hanging="198"/>
+      </w:pPr>
+      <w:r>
+        <w:rPr>
+          <w:rFonts w:ascii="맑은 고딕" w:hAnsi="맑은 고딕" w:eastAsia="맑은 고딕"/>
+          <w:b w:val="0"/>
+          <w:i w:val="0"/>
+          <w:color w:val="1E407C"/>
+          <w:sz w:val="22"/>
+        </w:rPr>
+        <w:t xml:space="preserve">• </w:t>
+      </w:r>
+      <w:r>
+        <w:rPr>
+          <w:rFonts w:ascii="맑은 고딕" w:hAnsi="맑은 고딕" w:eastAsia="맑은 고딕"/>
+          <w:b w:val="0"/>
+          <w:i w:val="0"/>
+          <w:color w:val="1A1A1A"/>
+          <w:sz w:val="22"/>
+        </w:rPr>
+        <w:t>곰 2: 전쟁·포퓰리즘·방만 재정. 정부와 기업이 동시에 돈을 쓰니 금리가 오른다.</w:t>
+      </w:r>
+    </w:p>
+    <w:p>
+      <w:pPr>
+        <w:spacing w:after="50" w:before="0" w:line="276" w:lineRule="auto"/>
+        <w:ind w:left="312" w:hanging="198"/>
+      </w:pPr>
+      <w:r>
+        <w:rPr>
+          <w:rFonts w:ascii="맑은 고딕" w:hAnsi="맑은 고딕" w:eastAsia="맑은 고딕"/>
+          <w:b w:val="0"/>
+          <w:i w:val="0"/>
+          <w:color w:val="1E407C"/>
+          <w:sz w:val="22"/>
+        </w:rPr>
+        <w:t xml:space="preserve">• </w:t>
+      </w:r>
+      <w:r>
+        <w:rPr>
+          <w:rFonts w:ascii="맑은 고딕" w:hAnsi="맑은 고딕" w:eastAsia="맑은 고딕"/>
+          <w:b w:val="0"/>
+          <w:i w:val="0"/>
+          <w:color w:val="1A1A1A"/>
+          <w:sz w:val="22"/>
+        </w:rPr>
+        <w:t>금리 자체가 나쁜 게 아니다. 빌려서 그 이상을 벌면 문제 없다. 오펜하이머(골드만)가 미국 10년 5%를 넘기면 좋은 데가 별로 없었다는 말을 책에서 남겼다고 전한다. 원문은 따로 못 박지 못했다. 부분.</w:t>
+      </w:r>
+    </w:p>
+    <w:p>
+      <w:pPr>
+        <w:spacing w:before="200" w:after="80"/>
+      </w:pPr>
+      <w:r>
+        <w:rPr>
+          <w:rFonts w:ascii="맑은 고딕" w:hAnsi="맑은 고딕" w:eastAsia="맑은 고딕"/>
+          <w:b/>
+          <w:i w:val="0"/>
+          <w:color w:val="1E407C"/>
+          <w:sz w:val="26"/>
+        </w:rPr>
+        <w:t>PER 19.5의 역수는 20%가 아니다</w:t>
+      </w:r>
+    </w:p>
+    <w:p>
+      <w:pPr>
+        <w:spacing w:after="50" w:before="0" w:line="276" w:lineRule="auto"/>
+        <w:ind w:left="312" w:hanging="198"/>
+      </w:pPr>
+      <w:r>
+        <w:rPr>
+          <w:rFonts w:ascii="맑은 고딕" w:hAnsi="맑은 고딕" w:eastAsia="맑은 고딕"/>
+          <w:b w:val="0"/>
+          <w:i w:val="0"/>
+          <w:color w:val="1E407C"/>
+          <w:sz w:val="22"/>
+        </w:rPr>
+        <w:t xml:space="preserve">• </w:t>
+      </w:r>
+      <w:r>
+        <w:rPr>
+          <w:rFonts w:ascii="맑은 고딕" w:hAnsi="맑은 고딕" w:eastAsia="맑은 고딕"/>
+          <w:b w:val="0"/>
+          <w:i w:val="0"/>
+          <w:color w:val="1A1A1A"/>
+          <w:sz w:val="22"/>
+        </w:rPr>
+        <w:t>윤지호: S&amp;P 500 PER 19.5~19.7, 5%면 역수가 20%라 주식이 매력 없다고 했다.</w:t>
+      </w:r>
+    </w:p>
+    <w:p>
+      <w:pPr>
+        <w:spacing w:after="50" w:before="0" w:line="276" w:lineRule="auto"/>
+        <w:ind w:left="312" w:hanging="198"/>
+      </w:pPr>
+      <w:r>
+        <w:rPr>
+          <w:rFonts w:ascii="맑은 고딕" w:hAnsi="맑은 고딕" w:eastAsia="맑은 고딕"/>
+          <w:b w:val="0"/>
+          <w:i w:val="0"/>
+          <w:color w:val="1E407C"/>
+          <w:sz w:val="22"/>
+        </w:rPr>
+        <w:t xml:space="preserve">• </w:t>
+      </w:r>
+      <w:r>
+        <w:rPr>
+          <w:rFonts w:ascii="맑은 고딕" w:hAnsi="맑은 고딕" w:eastAsia="맑은 고딕"/>
+          <w:b w:val="0"/>
+          <w:i w:val="0"/>
+          <w:color w:val="1A1A1A"/>
+          <w:sz w:val="22"/>
+        </w:rPr>
+        <w:t>부분: FactSet 9/11 선행 PER 19.1, 후행 25.9. 19.5는 선행 근처다.</w:t>
+      </w:r>
+    </w:p>
+    <w:p>
+      <w:pPr>
+        <w:spacing w:after="50" w:before="0" w:line="276" w:lineRule="auto"/>
+        <w:ind w:left="312" w:hanging="198"/>
+      </w:pPr>
+      <w:r>
+        <w:rPr>
+          <w:rFonts w:ascii="맑은 고딕" w:hAnsi="맑은 고딕" w:eastAsia="맑은 고딕"/>
+          <w:b w:val="0"/>
+          <w:i w:val="0"/>
+          <w:color w:val="1E407C"/>
+          <w:sz w:val="22"/>
+        </w:rPr>
+        <w:t xml:space="preserve">• </w:t>
+      </w:r>
+      <w:r>
+        <w:rPr>
+          <w:rFonts w:ascii="맑은 고딕" w:hAnsi="맑은 고딕" w:eastAsia="맑은 고딕"/>
+          <w:b w:val="0"/>
+          <w:i w:val="0"/>
+          <w:color w:val="1A1A1A"/>
+          <w:sz w:val="22"/>
+        </w:rPr>
+        <w:t>오해: 19.5의 역수는 약 5.1%다. 20%가 아니다. Fed 모델로 10년 5%와 선행 이익수익률을 붙이는 논리는 살릴 수 있다. 주식이 이기려면 앞으로 이익이 더 나와야 한다.</w:t>
+      </w:r>
+    </w:p>
+    <w:p>
+      <w:pPr>
+        <w:spacing w:after="50" w:before="0" w:line="276" w:lineRule="auto"/>
+        <w:ind w:left="312" w:hanging="198"/>
+      </w:pPr>
+      <w:r>
+        <w:rPr>
+          <w:rFonts w:ascii="맑은 고딕" w:hAnsi="맑은 고딕" w:eastAsia="맑은 고딕"/>
+          <w:b w:val="0"/>
+          <w:i w:val="0"/>
+          <w:color w:val="1E407C"/>
+          <w:sz w:val="22"/>
+        </w:rPr>
+        <w:t xml:space="preserve">• </w:t>
+      </w:r>
+      <w:r>
+        <w:rPr>
+          <w:rFonts w:ascii="맑은 고딕" w:hAnsi="맑은 고딕" w:eastAsia="맑은 고딕"/>
+          <w:b w:val="0"/>
+          <w:i w:val="0"/>
+          <w:color w:val="1A1A1A"/>
+          <w:sz w:val="22"/>
+        </w:rPr>
+        <w:t>주식의 본질은 지분을 갖고 있으면 그 회사가 돈을 더 만든다는 기대. 반도체가 싸 보여도 현금의 근원을 쫓으면 하이퍼스케일러가 나온다.</w:t>
+      </w:r>
+    </w:p>
+    <w:p>
+      <w:pPr>
+        <w:spacing w:before="200" w:after="80"/>
+      </w:pPr>
+      <w:r>
+        <w:rPr>
+          <w:rFonts w:ascii="맑은 고딕" w:hAnsi="맑은 고딕" w:eastAsia="맑은 고딕"/>
+          <w:b/>
+          <w:i w:val="0"/>
+          <w:color w:val="1E407C"/>
+          <w:sz w:val="26"/>
+        </w:rPr>
+        <w:t>대응</w:t>
+      </w:r>
+    </w:p>
+    <w:p>
+      <w:pPr>
+        <w:spacing w:after="50" w:before="0" w:line="276" w:lineRule="auto"/>
+        <w:ind w:left="312" w:hanging="198"/>
+      </w:pPr>
+      <w:r>
+        <w:rPr>
+          <w:rFonts w:ascii="맑은 고딕" w:hAnsi="맑은 고딕" w:eastAsia="맑은 고딕"/>
+          <w:b w:val="0"/>
+          <w:i w:val="0"/>
+          <w:color w:val="1E407C"/>
+          <w:sz w:val="22"/>
+        </w:rPr>
+        <w:t xml:space="preserve">• </w:t>
+      </w:r>
+      <w:r>
+        <w:rPr>
+          <w:rFonts w:ascii="맑은 고딕" w:hAnsi="맑은 고딕" w:eastAsia="맑은 고딕"/>
+          <w:b w:val="0"/>
+          <w:i w:val="0"/>
+          <w:color w:val="1A1A1A"/>
+          <w:sz w:val="22"/>
+        </w:rPr>
+        <w:t>박스는 트레이딩 바이는 되지만 추세 상승을 기대하기는 어렵다.</w:t>
+      </w:r>
+    </w:p>
+    <w:p>
+      <w:pPr>
+        <w:spacing w:after="50" w:before="0" w:line="276" w:lineRule="auto"/>
+        <w:ind w:left="312" w:hanging="198"/>
+      </w:pPr>
+      <w:r>
+        <w:rPr>
+          <w:rFonts w:ascii="맑은 고딕" w:hAnsi="맑은 고딕" w:eastAsia="맑은 고딕"/>
+          <w:b w:val="0"/>
+          <w:i w:val="0"/>
+          <w:color w:val="1E407C"/>
+          <w:sz w:val="22"/>
+        </w:rPr>
+        <w:t xml:space="preserve">• </w:t>
+      </w:r>
+      <w:r>
+        <w:rPr>
+          <w:rFonts w:ascii="맑은 고딕" w:hAnsi="맑은 고딕" w:eastAsia="맑은 고딕"/>
+          <w:b w:val="0"/>
+          <w:i w:val="0"/>
+          <w:color w:val="1A1A1A"/>
+          <w:sz w:val="22"/>
+        </w:rPr>
+        <w:t>포트에 따라 답이 다르다. 물린 사람은 반등 때 현금을 만들고, 비어 있는 사람은 하단에서 모은다.</w:t>
+      </w:r>
+    </w:p>
+    <w:p>
+      <w:pPr>
+        <w:spacing w:after="50" w:before="0" w:line="276" w:lineRule="auto"/>
+        <w:ind w:left="312" w:hanging="198"/>
+      </w:pPr>
+      <w:r>
+        <w:rPr>
+          <w:rFonts w:ascii="맑은 고딕" w:hAnsi="맑은 고딕" w:eastAsia="맑은 고딕"/>
+          <w:b w:val="0"/>
+          <w:i w:val="0"/>
+          <w:color w:val="1E407C"/>
+          <w:sz w:val="22"/>
+        </w:rPr>
+        <w:t xml:space="preserve">• </w:t>
+      </w:r>
+      <w:r>
+        <w:rPr>
+          <w:rFonts w:ascii="맑은 고딕" w:hAnsi="맑은 고딕" w:eastAsia="맑은 고딕"/>
+          <w:b w:val="0"/>
+          <w:i w:val="0"/>
+          <w:color w:val="1A1A1A"/>
+          <w:sz w:val="22"/>
+        </w:rPr>
+        <w:t>피터 린치: 아침마다 등락률 상위·하위를 보지 마라. 내 포트와 상관없다.</w:t>
+      </w:r>
+    </w:p>
+    <w:p>
+      <w:pPr>
+        <w:spacing w:after="50" w:before="0" w:line="276" w:lineRule="auto"/>
+        <w:ind w:left="312" w:hanging="198"/>
+      </w:pPr>
+      <w:r>
+        <w:rPr>
+          <w:rFonts w:ascii="맑은 고딕" w:hAnsi="맑은 고딕" w:eastAsia="맑은 고딕"/>
+          <w:b w:val="0"/>
+          <w:i w:val="0"/>
+          <w:color w:val="1E407C"/>
+          <w:sz w:val="22"/>
+        </w:rPr>
+        <w:t xml:space="preserve">• </w:t>
+      </w:r>
+      <w:r>
+        <w:rPr>
+          <w:rFonts w:ascii="맑은 고딕" w:hAnsi="맑은 고딕" w:eastAsia="맑은 고딕"/>
+          <w:b w:val="0"/>
+          <w:i w:val="0"/>
+          <w:color w:val="1A1A1A"/>
+          <w:sz w:val="22"/>
+        </w:rPr>
+        <w:t>9–10월은 우려가 가격에 붙는 구간. 8,000을 넘는 강세장은 아니라는 평가. 본인은 주식 비중을 줄이고 현금을 늘리는 중이라고 했다.</w:t>
+      </w:r>
+    </w:p>
+    <w:tbl>
+      <w:tblPr>
+        <w:tblW w:type="auto" w:w="0"/>
+        <w:jc w:val="center"/>
+        <w:tblLayout w:type="autofit"/>
+        <w:tblLook w:firstColumn="1" w:firstRow="1" w:lastColumn="0" w:lastRow="0" w:noHBand="0" w:noVBand="1" w:val="04A0"/>
+      </w:tblPr>
+      <w:tblGrid>
+        <w:gridCol w:w="10092"/>
+      </w:tblGrid>
+      <w:tr>
+        <w:tc>
+          <w:tcPr>
+            <w:tcW w:type="dxa" w:w="10092"/>
+            <w:shd w:val="clear" w:color="auto" w:fill="FFF8E7"/>
+            <w:tcBorders>
+              <w:top w:val="nil"/>
+              <w:left w:val="single" w:sz="28" w:space="0" w:color="B8943A"/>
+              <w:bottom w:val="nil"/>
+              <w:right w:val="nil"/>
+            </w:tcBorders>
+            <w:tcMar>
+              <w:top w:w="80" w:type="dxa"/>
+              <w:left w:w="120" w:type="dxa"/>
+              <w:bottom w:w="80" w:type="dxa"/>
+              <w:right w:w="120" w:type="dxa"/>
+            </w:tcMar>
+          </w:tcPr>
+          <w:p>
+            <w:pPr>
+              <w:spacing w:after="40" w:before="0"/>
+            </w:pPr>
+            <w:r/>
+            <w:r>
+              <w:rPr>
+                <w:rFonts w:ascii="맑은 고딕" w:hAnsi="맑은 고딕" w:eastAsia="맑은 고딕"/>
+                <w:b/>
+                <w:i w:val="0"/>
+                <w:color w:val="7A5C12"/>
+                <w:sz w:val="20"/>
+              </w:rPr>
+              <w:t>핵심 질문</w:t>
+            </w:r>
+          </w:p>
+          <w:p>
+            <w:pPr>
+              <w:spacing w:after="20" w:before="0" w:line="276" w:lineRule="auto"/>
+            </w:pPr>
+            <w:r>
+              <w:rPr>
+                <w:rFonts w:ascii="맑은 고딕" w:hAnsi="맑은 고딕" w:eastAsia="맑은 고딕"/>
+                <w:b w:val="0"/>
+                <w:i w:val="0"/>
+                <w:color w:val="1A1A1A"/>
+                <w:sz w:val="21"/>
+              </w:rPr>
+              <w:t>AI 투자 사이클을 누르는 힘이 약해지면 산다. 팽팽하면 계좌만 녹는다. 시점은 변수에 변화가 생길 때다.</w:t>
+            </w:r>
+          </w:p>
+        </w:tc>
+      </w:tr>
+    </w:tbl>
+    <w:p>
+      <w:pPr>
+        <w:spacing w:after="120"/>
+      </w:pPr>
+    </w:p>
+    <w:p>
+      <w:pPr>
+        <w:spacing w:before="280" w:after="160" w:line="264" w:lineRule="auto"/>
+        <w:pBdr>
+          <w:bottom w:val="single" w:sz="12" w:space="4" w:color="0F2043"/>
+        </w:pBdr>
+      </w:pPr>
+      <w:r>
+        <w:rPr>
+          <w:rFonts w:ascii="맑은 고딕" w:hAnsi="맑은 고딕" w:eastAsia="맑은 고딕"/>
+          <w:b/>
+          <w:i w:val="0"/>
+          <w:color w:val="B8943A"/>
+          <w:sz w:val="32"/>
+        </w:rPr>
+        <w:t xml:space="preserve">14.  </w:t>
+      </w:r>
+      <w:r>
+        <w:rPr>
+          <w:rFonts w:ascii="맑은 고딕" w:hAnsi="맑은 고딕" w:eastAsia="맑은 고딕"/>
+          <w:b/>
+          <w:i w:val="0"/>
+          <w:color w:val="0F2043"/>
+          <w:sz w:val="32"/>
+        </w:rPr>
+        <w:t>엔비디아 — 마진 75, 현금은 40</w:t>
+      </w:r>
+    </w:p>
+    <w:p>
+      <w:pPr>
+        <w:spacing w:before="40" w:after="160"/>
+        <w:jc w:val="center"/>
+      </w:pPr>
+      <w:r>
+        <w:drawing>
+          <wp:inline xmlns:a="http://schemas.openxmlformats.org/drawingml/2006/main" xmlns:pic="http://schemas.openxmlformats.org/drawingml/2006/picture">
+            <wp:extent cx="5903999" cy="3260417"/>
+            <wp:docPr id="14" name="Picture 14"/>
+            <wp:cNvGraphicFramePr>
+              <a:graphicFrameLocks noChangeAspect="1"/>
+            </wp:cNvGraphicFramePr>
+            <a:graphic>
+              <a:graphicData uri="http://schemas.openxmlformats.org/drawingml/2006/picture">
+                <pic:pic>
+                  <pic:nvPicPr>
+                    <pic:cNvPr id="0" name="14_nvidia_cash.png"/>
+                    <pic:cNvPicPr/>
+                  </pic:nvPicPr>
+                  <pic:blipFill>
+                    <a:blip r:embed="rId24"/>
+                    <a:stretch>
+                      <a:fillRect/>
+                    </a:stretch>
+                  </pic:blipFill>
+                  <pic:spPr>
+                    <a:xfrm>
+                      <a:off x="0" y="0"/>
+                      <a:ext cx="5903999" cy="3260417"/>
+                    </a:xfrm>
+                    <a:prstGeom prst="rect"/>
+                  </pic:spPr>
+                </pic:pic>
+              </a:graphicData>
+            </a:graphic>
+          </wp:inline>
+        </w:drawing>
+      </w:r>
+    </w:p>
+    <w:p>
+      <w:pPr>
+        <w:spacing w:after="50" w:before="0" w:line="276" w:lineRule="auto"/>
+        <w:ind w:left="312" w:hanging="198"/>
+      </w:pPr>
+      <w:r>
+        <w:rPr>
+          <w:rFonts w:ascii="맑은 고딕" w:hAnsi="맑은 고딕" w:eastAsia="맑은 고딕"/>
+          <w:b w:val="0"/>
+          <w:i w:val="0"/>
+          <w:color w:val="1E407C"/>
+          <w:sz w:val="22"/>
+        </w:rPr>
+        <w:t xml:space="preserve">• </w:t>
+      </w:r>
+      <w:r>
+        <w:rPr>
+          <w:rFonts w:ascii="맑은 고딕" w:hAnsi="맑은 고딕" w:eastAsia="맑은 고딕"/>
+          <w:b w:val="0"/>
+          <w:i w:val="0"/>
+          <w:color w:val="1A1A1A"/>
+          <w:sz w:val="22"/>
+        </w:rPr>
+        <w:t>사실: Q2 FY27(분기 7/26 마감, 8/26 발표) 매출 $96.2B, GAAP 매출총이익률 75.0%, 순이익 $59.7B, 영업현금 $24.1B. 전환율 40.3%.</w:t>
+      </w:r>
+    </w:p>
+    <w:p>
+      <w:pPr>
+        <w:spacing w:after="50" w:before="0" w:line="276" w:lineRule="auto"/>
+        <w:ind w:left="312" w:hanging="198"/>
+      </w:pPr>
+      <w:r>
+        <w:rPr>
+          <w:rFonts w:ascii="맑은 고딕" w:hAnsi="맑은 고딕" w:eastAsia="맑은 고딕"/>
+          <w:b w:val="0"/>
+          <w:i w:val="0"/>
+          <w:color w:val="1E407C"/>
+          <w:sz w:val="22"/>
+        </w:rPr>
+        <w:t xml:space="preserve">• </w:t>
+      </w:r>
+      <w:r>
+        <w:rPr>
+          <w:rFonts w:ascii="맑은 고딕" w:hAnsi="맑은 고딕" w:eastAsia="맑은 고딕"/>
+          <w:b w:val="0"/>
+          <w:i w:val="0"/>
+          <w:color w:val="1A1A1A"/>
+          <w:sz w:val="22"/>
+        </w:rPr>
+        <w:t>매출채권 $63.1B. DSO 45일→60일. 우량 고객 복수 분기 계약의 결제 연장. 방송의 ‘외상’은 이 숫자다.</w:t>
+      </w:r>
+    </w:p>
+    <w:p>
+      <w:pPr>
+        <w:spacing w:after="50" w:before="0" w:line="276" w:lineRule="auto"/>
+        <w:ind w:left="312" w:hanging="198"/>
+      </w:pPr>
+      <w:r>
+        <w:rPr>
+          <w:rFonts w:ascii="맑은 고딕" w:hAnsi="맑은 고딕" w:eastAsia="맑은 고딕"/>
+          <w:b w:val="0"/>
+          <w:i w:val="0"/>
+          <w:color w:val="1E407C"/>
+          <w:sz w:val="22"/>
+        </w:rPr>
+        <w:t xml:space="preserve">• </w:t>
+      </w:r>
+      <w:r>
+        <w:rPr>
+          <w:rFonts w:ascii="맑은 고딕" w:hAnsi="맑은 고딕" w:eastAsia="맑은 고딕"/>
+          <w:b w:val="0"/>
+          <w:i w:val="0"/>
+          <w:color w:val="1A1A1A"/>
+          <w:sz w:val="22"/>
+        </w:rPr>
+        <w:t>부분: ‘2분기 이익의 상당액이 지분 투자 평가이익’. Q2 평가이익은 $7.8B로 순이익의 약 13%. 상반기 $23.7B를 한 분기로 말한 듯하다.</w:t>
+      </w:r>
+    </w:p>
+    <w:p>
+      <w:pPr>
+        <w:spacing w:after="50" w:before="0" w:line="276" w:lineRule="auto"/>
+        <w:ind w:left="312" w:hanging="198"/>
+      </w:pPr>
+      <w:r>
+        <w:rPr>
+          <w:rFonts w:ascii="맑은 고딕" w:hAnsi="맑은 고딕" w:eastAsia="맑은 고딕"/>
+          <w:b w:val="0"/>
+          <w:i w:val="0"/>
+          <w:color w:val="1E407C"/>
+          <w:sz w:val="22"/>
+        </w:rPr>
+        <w:t xml:space="preserve">• </w:t>
+      </w:r>
+      <w:r>
+        <w:rPr>
+          <w:rFonts w:ascii="맑은 고딕" w:hAnsi="맑은 고딕" w:eastAsia="맑은 고딕"/>
+          <w:b w:val="0"/>
+          <w:i w:val="0"/>
+          <w:color w:val="1A1A1A"/>
+          <w:sz w:val="22"/>
+        </w:rPr>
+        <w:t>부분·쓰지 말 것: CDS 프리미엄이 7월부터 크게 올랐다는 말은 공개 시계열로 확인하지 못했다.</w:t>
+      </w:r>
+    </w:p>
+    <w:p>
+      <w:pPr>
+        <w:spacing w:after="50" w:before="0" w:line="276" w:lineRule="auto"/>
+        <w:ind w:left="312" w:hanging="198"/>
+      </w:pPr>
+      <w:r>
+        <w:rPr>
+          <w:rFonts w:ascii="맑은 고딕" w:hAnsi="맑은 고딕" w:eastAsia="맑은 고딕"/>
+          <w:b w:val="0"/>
+          <w:i w:val="0"/>
+          <w:color w:val="1E407C"/>
+          <w:sz w:val="22"/>
+        </w:rPr>
+        <w:t xml:space="preserve">• </w:t>
+      </w:r>
+      <w:r>
+        <w:rPr>
+          <w:rFonts w:ascii="맑은 고딕" w:hAnsi="맑은 고딕" w:eastAsia="맑은 고딕"/>
+          <w:b w:val="0"/>
+          <w:i w:val="0"/>
+          <w:color w:val="1A1A1A"/>
+          <w:sz w:val="22"/>
+        </w:rPr>
+        <w:t>인포맥스: 엔비디아도 2025년 1–4월 딥시크+관세로 거의 −40% 빠졌다가 전고점을 뚫고 갔다. 이익(주당순이익)이 안 꺾이면 미국 주식은 우상향한 경우가 많다. 방향은 맞다.</w:t>
+      </w:r>
+    </w:p>
+    <w:tbl>
+      <w:tblPr>
+        <w:tblW w:type="auto" w:w="0"/>
+        <w:jc w:val="center"/>
+        <w:tblLayout w:type="autofit"/>
+        <w:tblLook w:firstColumn="1" w:firstRow="1" w:lastColumn="0" w:lastRow="0" w:noHBand="0" w:noVBand="1" w:val="04A0"/>
+      </w:tblPr>
+      <w:tblGrid>
+        <w:gridCol w:w="10092"/>
+      </w:tblGrid>
+      <w:tr>
+        <w:tc>
+          <w:tcPr>
+            <w:tcW w:type="dxa" w:w="10092"/>
+            <w:shd w:val="clear" w:color="auto" w:fill="FDECEA"/>
+            <w:tcBorders>
+              <w:top w:val="nil"/>
+              <w:left w:val="single" w:sz="28" w:space="0" w:color="991B1B"/>
+              <w:bottom w:val="nil"/>
+              <w:right w:val="nil"/>
+            </w:tcBorders>
+            <w:tcMar>
+              <w:top w:w="80" w:type="dxa"/>
+              <w:left w:w="120" w:type="dxa"/>
+              <w:bottom w:w="80" w:type="dxa"/>
+              <w:right w:w="120" w:type="dxa"/>
+            </w:tcMar>
+          </w:tcPr>
+          <w:p>
+            <w:pPr>
+              <w:spacing w:after="40" w:before="0"/>
+            </w:pPr>
+            <w:r/>
+            <w:r>
+              <w:rPr>
+                <w:rFonts w:ascii="맑은 고딕" w:hAnsi="맑은 고딕" w:eastAsia="맑은 고딕"/>
+                <w:b/>
+                <w:i w:val="0"/>
+                <w:color w:val="991B1B"/>
+                <w:sz w:val="20"/>
+              </w:rPr>
+              <w:t>시장이 묻는 것</w:t>
+            </w:r>
+          </w:p>
+          <w:p>
+            <w:pPr>
+              <w:spacing w:after="20" w:before="0" w:line="276" w:lineRule="auto"/>
+            </w:pPr>
+            <w:r>
+              <w:rPr>
+                <w:rFonts w:ascii="맑은 고딕" w:hAnsi="맑은 고딕" w:eastAsia="맑은 고딕"/>
+                <w:b w:val="0"/>
+                <w:i w:val="0"/>
+                <w:color w:val="1A1A1A"/>
+                <w:sz w:val="21"/>
+              </w:rPr>
+              <w:t>하이퍼스케일러 현금이 데이터센터나 토큰으로 다시 도느냐. 답이 나오면 상단이 열리고, 못 하면 흐르고, 더 나쁜 답이 나오면 빠진다.</w:t>
+            </w:r>
+          </w:p>
+        </w:tc>
+      </w:tr>
+    </w:tbl>
+    <w:p>
+      <w:pPr>
+        <w:spacing w:after="120"/>
+      </w:pPr>
+    </w:p>
+    <w:p>
+      <w:pPr>
+        <w:spacing w:before="280" w:after="160" w:line="264" w:lineRule="auto"/>
+        <w:pBdr>
+          <w:bottom w:val="single" w:sz="12" w:space="4" w:color="0F2043"/>
+        </w:pBdr>
+      </w:pPr>
+      <w:r>
+        <w:rPr>
+          <w:rFonts w:ascii="맑은 고딕" w:hAnsi="맑은 고딕" w:eastAsia="맑은 고딕"/>
+          <w:b/>
+          <w:i w:val="0"/>
+          <w:color w:val="B8943A"/>
+          <w:sz w:val="32"/>
+        </w:rPr>
+        <w:t xml:space="preserve">15.  </w:t>
+      </w:r>
+      <w:r>
+        <w:rPr>
+          <w:rFonts w:ascii="맑은 고딕" w:hAnsi="맑은 고딕" w:eastAsia="맑은 고딕"/>
+          <w:b/>
+          <w:i w:val="0"/>
+          <w:color w:val="0F2043"/>
+          <w:sz w:val="32"/>
+        </w:rPr>
+        <w:t>토큰 — P↓여도 Q가 더 늘면 된다</w:t>
+      </w:r>
+    </w:p>
+    <w:p>
+      <w:pPr>
+        <w:spacing w:before="40" w:after="160"/>
+        <w:jc w:val="center"/>
+      </w:pPr>
+      <w:r>
+        <w:drawing>
+          <wp:inline xmlns:a="http://schemas.openxmlformats.org/drawingml/2006/main" xmlns:pic="http://schemas.openxmlformats.org/drawingml/2006/picture">
+            <wp:extent cx="5903999" cy="2726135"/>
+            <wp:docPr id="15" name="Picture 15"/>
+            <wp:cNvGraphicFramePr>
+              <a:graphicFrameLocks noChangeAspect="1"/>
+            </wp:cNvGraphicFramePr>
+            <a:graphic>
+              <a:graphicData uri="http://schemas.openxmlformats.org/drawingml/2006/picture">
+                <pic:pic>
+                  <pic:nvPicPr>
+                    <pic:cNvPr id="0" name="15_token_pq.png"/>
+                    <pic:cNvPicPr/>
+                  </pic:nvPicPr>
+                  <pic:blipFill>
+                    <a:blip r:embed="rId25"/>
+                    <a:stretch>
+                      <a:fillRect/>
+                    </a:stretch>
+                  </pic:blipFill>
+                  <pic:spPr>
+                    <a:xfrm>
+                      <a:off x="0" y="0"/>
+                      <a:ext cx="5903999" cy="2726135"/>
+                    </a:xfrm>
+                    <a:prstGeom prst="rect"/>
+                  </pic:spPr>
+                </pic:pic>
+              </a:graphicData>
+            </a:graphic>
+          </wp:inline>
+        </w:drawing>
+      </w:r>
+    </w:p>
+    <w:p>
+      <w:pPr>
+        <w:spacing w:after="50" w:before="0" w:line="276" w:lineRule="auto"/>
+        <w:ind w:left="312" w:hanging="198"/>
+      </w:pPr>
+      <w:r>
+        <w:rPr>
+          <w:rFonts w:ascii="맑은 고딕" w:hAnsi="맑은 고딕" w:eastAsia="맑은 고딕"/>
+          <w:b w:val="0"/>
+          <w:i w:val="0"/>
+          <w:color w:val="1E407C"/>
+          <w:sz w:val="22"/>
+        </w:rPr>
+        <w:t xml:space="preserve">• </w:t>
+      </w:r>
+      <w:r>
+        <w:rPr>
+          <w:rFonts w:ascii="맑은 고딕" w:hAnsi="맑은 고딕" w:eastAsia="맑은 고딕"/>
+          <w:b w:val="0"/>
+          <w:i w:val="0"/>
+          <w:color w:val="1A1A1A"/>
+          <w:sz w:val="22"/>
+        </w:rPr>
+        <w:t>사실: JPM이 인용한 OpenRouter 8월. 볼륨 MoM +47%, YoY 28배. 지출 +7%, 12배. 볼륨가중 단가 −28%, YoY −56%.</w:t>
+      </w:r>
+    </w:p>
+    <w:p>
+      <w:pPr>
+        <w:spacing w:after="50" w:before="0" w:line="276" w:lineRule="auto"/>
+        <w:ind w:left="312" w:hanging="198"/>
+      </w:pPr>
+      <w:r>
+        <w:rPr>
+          <w:rFonts w:ascii="맑은 고딕" w:hAnsi="맑은 고딕" w:eastAsia="맑은 고딕"/>
+          <w:b w:val="0"/>
+          <w:i w:val="0"/>
+          <w:color w:val="1E407C"/>
+          <w:sz w:val="22"/>
+        </w:rPr>
+        <w:t xml:space="preserve">• </w:t>
+      </w:r>
+      <w:r>
+        <w:rPr>
+          <w:rFonts w:ascii="맑은 고딕" w:hAnsi="맑은 고딕" w:eastAsia="맑은 고딕"/>
+          <w:b w:val="0"/>
+          <w:i w:val="0"/>
+          <w:color w:val="1A1A1A"/>
+          <w:sz w:val="22"/>
+        </w:rPr>
+        <w:t>윤지호: OpenAI가 토큰을 많이 만들어 생태가 돌아가야 한다. 비용은 내려오고 품질은 올라가야 한다. Astra는 돈이 너무 든다.</w:t>
+      </w:r>
+    </w:p>
+    <w:p>
+      <w:pPr>
+        <w:spacing w:after="50" w:before="0" w:line="276" w:lineRule="auto"/>
+        <w:ind w:left="312" w:hanging="198"/>
+      </w:pPr>
+      <w:r>
+        <w:rPr>
+          <w:rFonts w:ascii="맑은 고딕" w:hAnsi="맑은 고딕" w:eastAsia="맑은 고딕"/>
+          <w:b w:val="0"/>
+          <w:i w:val="0"/>
+          <w:color w:val="1E407C"/>
+          <w:sz w:val="22"/>
+        </w:rPr>
+        <w:t xml:space="preserve">• </w:t>
+      </w:r>
+      <w:r>
+        <w:rPr>
+          <w:rFonts w:ascii="맑은 고딕" w:hAnsi="맑은 고딕" w:eastAsia="맑은 고딕"/>
+          <w:b w:val="0"/>
+          <w:i w:val="0"/>
+          <w:color w:val="1A1A1A"/>
+          <w:sz w:val="22"/>
+        </w:rPr>
+        <w:t>아모데이·알트만·머스크·허사비스의 속도조절은 ‘추가 투자가 부담’ 시그널. 죄수의 딜레마 때문에 진짜로 늦추기는 어렵다. 해석.</w:t>
+      </w:r>
+    </w:p>
+    <w:p>
+      <w:pPr>
+        <w:spacing w:after="50" w:before="0" w:line="276" w:lineRule="auto"/>
+        <w:ind w:left="312" w:hanging="198"/>
+      </w:pPr>
+      <w:r>
+        <w:rPr>
+          <w:rFonts w:ascii="맑은 고딕" w:hAnsi="맑은 고딕" w:eastAsia="맑은 고딕"/>
+          <w:b w:val="0"/>
+          <w:i w:val="0"/>
+          <w:color w:val="1E407C"/>
+          <w:sz w:val="22"/>
+        </w:rPr>
+        <w:t xml:space="preserve">• </w:t>
+      </w:r>
+      <w:r>
+        <w:rPr>
+          <w:rFonts w:ascii="맑은 고딕" w:hAnsi="맑은 고딕" w:eastAsia="맑은 고딕"/>
+          <w:b w:val="0"/>
+          <w:i w:val="0"/>
+          <w:color w:val="1A1A1A"/>
+          <w:sz w:val="22"/>
+        </w:rPr>
+        <w:t>인포맥스 민수: P가 떨어져도 Q가 더 늘면 하이퍼스케일러를 걱정 마라. 윤지호는 그 그림의 신호가 아직 약해서 주가가 못 간다고 본다.</w:t>
+      </w:r>
+    </w:p>
+    <w:p>
+      <w:pPr>
+        <w:spacing w:after="50" w:before="0" w:line="276" w:lineRule="auto"/>
+        <w:ind w:left="312" w:hanging="198"/>
+      </w:pPr>
+      <w:r>
+        <w:rPr>
+          <w:rFonts w:ascii="맑은 고딕" w:hAnsi="맑은 고딕" w:eastAsia="맑은 고딕"/>
+          <w:b w:val="0"/>
+          <w:i w:val="0"/>
+          <w:color w:val="1E407C"/>
+          <w:sz w:val="22"/>
+        </w:rPr>
+        <w:t xml:space="preserve">• </w:t>
+      </w:r>
+      <w:r>
+        <w:rPr>
+          <w:rFonts w:ascii="맑은 고딕" w:hAnsi="맑은 고딕" w:eastAsia="맑은 고딕"/>
+          <w:b w:val="0"/>
+          <w:i w:val="0"/>
+          <w:color w:val="1A1A1A"/>
+          <w:sz w:val="22"/>
+        </w:rPr>
+        <w:t>부분: 방송 ‘올해 8월까지 31%, 전년 동기 2,400%, 초당 1,000억’은 원소스를 못 박지 못했다. 방향으로만 JPM을 쓴다.</w:t>
+      </w:r>
+    </w:p>
+    <w:tbl>
+      <w:tblPr>
+        <w:tblW w:type="auto" w:w="0"/>
+        <w:jc w:val="center"/>
+        <w:tblLayout w:type="autofit"/>
+        <w:tblLook w:firstColumn="1" w:firstRow="1" w:lastColumn="0" w:lastRow="0" w:noHBand="0" w:noVBand="1" w:val="04A0"/>
+      </w:tblPr>
+      <w:tblGrid>
+        <w:gridCol w:w="10092"/>
+      </w:tblGrid>
+      <w:tr>
+        <w:tc>
+          <w:tcPr>
+            <w:tcW w:type="dxa" w:w="10092"/>
+            <w:shd w:val="clear" w:color="auto" w:fill="E8F1FB"/>
+            <w:tcBorders>
+              <w:top w:val="nil"/>
+              <w:left w:val="single" w:sz="28" w:space="0" w:color="1E407C"/>
+              <w:bottom w:val="nil"/>
+              <w:right w:val="nil"/>
+            </w:tcBorders>
+            <w:tcMar>
+              <w:top w:w="80" w:type="dxa"/>
+              <w:left w:w="120" w:type="dxa"/>
+              <w:bottom w:w="80" w:type="dxa"/>
+              <w:right w:w="120" w:type="dxa"/>
+            </w:tcMar>
+          </w:tcPr>
+          <w:p>
+            <w:pPr>
+              <w:spacing w:after="40" w:before="0"/>
+            </w:pPr>
+            <w:r/>
+            <w:r>
+              <w:rPr>
+                <w:rFonts w:ascii="맑은 고딕" w:hAnsi="맑은 고딕" w:eastAsia="맑은 고딕"/>
+                <w:b/>
+                <w:i w:val="0"/>
+                <w:color w:val="1E407C"/>
+                <w:sz w:val="20"/>
+              </w:rPr>
+              <w:t>DevDay</w:t>
+            </w:r>
+          </w:p>
+          <w:p>
+            <w:pPr>
+              <w:spacing w:after="20" w:before="0" w:line="276" w:lineRule="auto"/>
+            </w:pPr>
+            <w:r>
+              <w:rPr>
+                <w:rFonts w:ascii="맑은 고딕" w:hAnsi="맑은 고딕" w:eastAsia="맑은 고딕"/>
+                <w:b w:val="0"/>
+                <w:i w:val="0"/>
+                <w:color w:val="1A1A1A"/>
+                <w:sz w:val="21"/>
+              </w:rPr>
+              <w:t>9/29에 에이전트·API 토큰·기업 배포가 숫자로 나오는지가 가을 확인이다. 현금이 다시 돈다는 증거가 필요한 자리다.</w:t>
+            </w:r>
+          </w:p>
+        </w:tc>
+      </w:tr>
+    </w:tbl>
+    <w:p>
+      <w:pPr>
+        <w:spacing w:after="120"/>
+      </w:pPr>
+    </w:p>
+    <w:p>
+      <w:pPr>
+        <w:spacing w:before="280" w:after="160" w:line="264" w:lineRule="auto"/>
+        <w:pBdr>
+          <w:bottom w:val="single" w:sz="12" w:space="4" w:color="0F2043"/>
+        </w:pBdr>
+      </w:pPr>
+      <w:r>
+        <w:rPr>
+          <w:rFonts w:ascii="맑은 고딕" w:hAnsi="맑은 고딕" w:eastAsia="맑은 고딕"/>
+          <w:b/>
+          <w:i w:val="0"/>
+          <w:color w:val="B8943A"/>
+          <w:sz w:val="32"/>
+        </w:rPr>
+        <w:t xml:space="preserve">16.  </w:t>
+      </w:r>
+      <w:r>
+        <w:rPr>
+          <w:rFonts w:ascii="맑은 고딕" w:hAnsi="맑은 고딕" w:eastAsia="맑은 고딕"/>
+          <w:b/>
+          <w:i w:val="0"/>
+          <w:color w:val="0F2043"/>
+          <w:sz w:val="32"/>
+        </w:rPr>
+        <w:t>금요일 주간 — 7,150 네 번째, 순환매</w:t>
+      </w:r>
+    </w:p>
+    <w:p>
+      <w:pPr>
+        <w:spacing w:before="200" w:after="80"/>
+      </w:pPr>
+      <w:r>
+        <w:rPr>
+          <w:rFonts w:ascii="맑은 고딕" w:hAnsi="맑은 고딕" w:eastAsia="맑은 고딕"/>
+          <w:b/>
+          <w:i w:val="0"/>
+          <w:color w:val="1E407C"/>
+          <w:sz w:val="26"/>
+        </w:rPr>
+        <w:t>인포맥스 라이브</w:t>
+      </w:r>
+    </w:p>
+    <w:p>
+      <w:pPr>
+        <w:spacing w:after="50" w:before="0" w:line="276" w:lineRule="auto"/>
+        <w:ind w:left="312" w:hanging="198"/>
+      </w:pPr>
+      <w:r>
+        <w:rPr>
+          <w:rFonts w:ascii="맑은 고딕" w:hAnsi="맑은 고딕" w:eastAsia="맑은 고딕"/>
+          <w:b w:val="0"/>
+          <w:i w:val="0"/>
+          <w:color w:val="1E407C"/>
+          <w:sz w:val="22"/>
+        </w:rPr>
+        <w:t xml:space="preserve">• </w:t>
+      </w:r>
+      <w:r>
+        <w:rPr>
+          <w:rFonts w:ascii="맑은 고딕" w:hAnsi="맑은 고딕" w:eastAsia="맑은 고딕"/>
+          <w:b w:val="0"/>
+          <w:i w:val="0"/>
+          <w:color w:val="1A1A1A"/>
+          <w:sz w:val="22"/>
+        </w:rPr>
+        <w:t>FOMC는 당일보다 둘째 날이 본심. 첫날 메리츠는 ‘물가를 위해 경기를 희생’, NH는 ‘호미로 막았다’. 나스닥 급등은 NH 쪽에 배팅한 결과.</w:t>
+      </w:r>
+    </w:p>
+    <w:p>
+      <w:pPr>
+        <w:spacing w:after="50" w:before="0" w:line="276" w:lineRule="auto"/>
+        <w:ind w:left="312" w:hanging="198"/>
+      </w:pPr>
+      <w:r>
+        <w:rPr>
+          <w:rFonts w:ascii="맑은 고딕" w:hAnsi="맑은 고딕" w:eastAsia="맑은 고딕"/>
+          <w:b w:val="0"/>
+          <w:i w:val="0"/>
+          <w:color w:val="1E407C"/>
+          <w:sz w:val="22"/>
+        </w:rPr>
+        <w:t xml:space="preserve">• </w:t>
+      </w:r>
+      <w:r>
+        <w:rPr>
+          <w:rFonts w:ascii="맑은 고딕" w:hAnsi="맑은 고딕" w:eastAsia="맑은 고딕"/>
+          <w:b w:val="0"/>
+          <w:i w:val="0"/>
+          <w:color w:val="1A1A1A"/>
+          <w:sz w:val="22"/>
+        </w:rPr>
+        <w:t>워시가 파월과 다른 사람임을 시장이 믿었다. 연준도 하이퍼스케일러 자금 조달이 10년을 올렸다고 인정했다는 전언. 해석이 섞여 있다.</w:t>
+      </w:r>
+    </w:p>
+    <w:p>
+      <w:pPr>
+        <w:spacing w:after="50" w:before="0" w:line="276" w:lineRule="auto"/>
+        <w:ind w:left="312" w:hanging="198"/>
+      </w:pPr>
+      <w:r>
+        <w:rPr>
+          <w:rFonts w:ascii="맑은 고딕" w:hAnsi="맑은 고딕" w:eastAsia="맑은 고딕"/>
+          <w:b w:val="0"/>
+          <w:i w:val="0"/>
+          <w:color w:val="1E407C"/>
+          <w:sz w:val="22"/>
+        </w:rPr>
+        <w:t xml:space="preserve">• </w:t>
+      </w:r>
+      <w:r>
+        <w:rPr>
+          <w:rFonts w:ascii="맑은 고딕" w:hAnsi="맑은 고딕" w:eastAsia="맑은 고딕"/>
+          <w:b w:val="0"/>
+          <w:i w:val="0"/>
+          <w:color w:val="1A1A1A"/>
+          <w:sz w:val="22"/>
+        </w:rPr>
+        <w:t>코스피 7,150–7,200을 네 번 두드렸다. 오늘은 6,894. 코스닥은 ‘변비’ — 힘은 쓰는데 거래가 소멸된다.</w:t>
+      </w:r>
+    </w:p>
+    <w:p>
+      <w:pPr>
+        <w:spacing w:after="50" w:before="0" w:line="276" w:lineRule="auto"/>
+        <w:ind w:left="312" w:hanging="198"/>
+      </w:pPr>
+      <w:r>
+        <w:rPr>
+          <w:rFonts w:ascii="맑은 고딕" w:hAnsi="맑은 고딕" w:eastAsia="맑은 고딕"/>
+          <w:b w:val="0"/>
+          <w:i w:val="0"/>
+          <w:color w:val="1E407C"/>
+          <w:sz w:val="22"/>
+        </w:rPr>
+        <w:t xml:space="preserve">• </w:t>
+      </w:r>
+      <w:r>
+        <w:rPr>
+          <w:rFonts w:ascii="맑은 고딕" w:hAnsi="맑은 고딕" w:eastAsia="맑은 고딕"/>
+          <w:b w:val="0"/>
+          <w:i w:val="0"/>
+          <w:color w:val="1A1A1A"/>
+          <w:sz w:val="22"/>
+        </w:rPr>
+        <w:t>부분: 예탁금 100조. 뉴시스 8/28 약 96.7조로 이미 100조 아래. ‘곧 100조’는 지난 숫자다.</w:t>
+      </w:r>
+    </w:p>
+    <w:p>
+      <w:pPr>
+        <w:spacing w:after="50" w:before="0" w:line="276" w:lineRule="auto"/>
+        <w:ind w:left="312" w:hanging="198"/>
+      </w:pPr>
+      <w:r>
+        <w:rPr>
+          <w:rFonts w:ascii="맑은 고딕" w:hAnsi="맑은 고딕" w:eastAsia="맑은 고딕"/>
+          <w:b w:val="0"/>
+          <w:i w:val="0"/>
+          <w:color w:val="1E407C"/>
+          <w:sz w:val="22"/>
+        </w:rPr>
+        <w:t xml:space="preserve">• </w:t>
+      </w:r>
+      <w:r>
+        <w:rPr>
+          <w:rFonts w:ascii="맑은 고딕" w:hAnsi="맑은 고딕" w:eastAsia="맑은 고딕"/>
+          <w:b w:val="0"/>
+          <w:i w:val="0"/>
+          <w:color w:val="1A1A1A"/>
+          <w:sz w:val="22"/>
+        </w:rPr>
+        <w:t>부분: 현대차 수출 30%. 산업부 8월 자동차 수출액 −29.8%. 현대 수출 대수 −48.9%. 현대 해외판매 −8.5%와 섞지 말 것.</w:t>
+      </w:r>
+    </w:p>
+    <w:p>
+      <w:pPr>
+        <w:spacing w:after="50" w:before="0" w:line="276" w:lineRule="auto"/>
+        <w:ind w:left="312" w:hanging="198"/>
+      </w:pPr>
+      <w:r>
+        <w:rPr>
+          <w:rFonts w:ascii="맑은 고딕" w:hAnsi="맑은 고딕" w:eastAsia="맑은 고딕"/>
+          <w:b w:val="0"/>
+          <w:i w:val="0"/>
+          <w:color w:val="1E407C"/>
+          <w:sz w:val="22"/>
+        </w:rPr>
+        <w:t xml:space="preserve">• </w:t>
+      </w:r>
+      <w:r>
+        <w:rPr>
+          <w:rFonts w:ascii="맑은 고딕" w:hAnsi="맑은 고딕" w:eastAsia="맑은 고딕"/>
+          <w:b w:val="0"/>
+          <w:i w:val="0"/>
+          <w:color w:val="1A1A1A"/>
+          <w:sz w:val="22"/>
+        </w:rPr>
+        <w:t>유가: 사우디 동서(Petroline) 송유관 펌프장 피격. 수리 4–6주면 10월. 얀부 처리량 방송 700만 b/d vs Kpler 약 550만. 부분.</w:t>
+      </w:r>
+    </w:p>
+    <w:p>
+      <w:pPr>
+        <w:spacing w:after="50" w:before="0" w:line="276" w:lineRule="auto"/>
+        <w:ind w:left="312" w:hanging="198"/>
+      </w:pPr>
+      <w:r>
+        <w:rPr>
+          <w:rFonts w:ascii="맑은 고딕" w:hAnsi="맑은 고딕" w:eastAsia="맑은 고딕"/>
+          <w:b w:val="0"/>
+          <w:i w:val="0"/>
+          <w:color w:val="1E407C"/>
+          <w:sz w:val="22"/>
+        </w:rPr>
+        <w:t xml:space="preserve">• </w:t>
+      </w:r>
+      <w:r>
+        <w:rPr>
+          <w:rFonts w:ascii="맑은 고딕" w:hAnsi="맑은 고딕" w:eastAsia="맑은 고딕"/>
+          <w:b w:val="0"/>
+          <w:i w:val="0"/>
+          <w:color w:val="1A1A1A"/>
+          <w:sz w:val="22"/>
+        </w:rPr>
+        <w:t>조건: 삼성 주당순이익 추정치가 27년 4분기까지 안 꺾이면 전고점 자리는 열려 있다. 시장이 그 숫자를 안 믿어서 안 간다. 해석.</w:t>
+      </w:r>
+    </w:p>
+    <w:p>
+      <w:pPr>
+        <w:spacing w:before="200" w:after="80"/>
+      </w:pPr>
+      <w:r>
+        <w:rPr>
+          <w:rFonts w:ascii="맑은 고딕" w:hAnsi="맑은 고딕" w:eastAsia="맑은 고딕"/>
+          <w:b/>
+          <w:i w:val="0"/>
+          <w:color w:val="1E407C"/>
+          <w:sz w:val="26"/>
+        </w:rPr>
+        <w:t>황유현</w:t>
+      </w:r>
+    </w:p>
+    <w:p>
+      <w:pPr>
+        <w:spacing w:after="50" w:before="0" w:line="276" w:lineRule="auto"/>
+        <w:ind w:left="312" w:hanging="198"/>
+      </w:pPr>
+      <w:r>
+        <w:rPr>
+          <w:rFonts w:ascii="맑은 고딕" w:hAnsi="맑은 고딕" w:eastAsia="맑은 고딕"/>
+          <w:b w:val="0"/>
+          <w:i w:val="0"/>
+          <w:color w:val="1E407C"/>
+          <w:sz w:val="22"/>
+        </w:rPr>
+        <w:t xml:space="preserve">• </w:t>
+      </w:r>
+      <w:r>
+        <w:rPr>
+          <w:rFonts w:ascii="맑은 고딕" w:hAnsi="맑은 고딕" w:eastAsia="맑은 고딕"/>
+          <w:b w:val="0"/>
+          <w:i w:val="0"/>
+          <w:color w:val="1A1A1A"/>
+          <w:sz w:val="22"/>
+        </w:rPr>
+        <w:t>금리 인상은 기정사실화(빼다 콤플리). 남은 퍼즐은 유가. 중간선거 직전에 극적으로 끝내려 할 수 있다. 해석.</w:t>
+      </w:r>
+    </w:p>
+    <w:p>
+      <w:pPr>
+        <w:spacing w:after="50" w:before="0" w:line="276" w:lineRule="auto"/>
+        <w:ind w:left="312" w:hanging="198"/>
+      </w:pPr>
+      <w:r>
+        <w:rPr>
+          <w:rFonts w:ascii="맑은 고딕" w:hAnsi="맑은 고딕" w:eastAsia="맑은 고딕"/>
+          <w:b w:val="0"/>
+          <w:i w:val="0"/>
+          <w:color w:val="1E407C"/>
+          <w:sz w:val="22"/>
+        </w:rPr>
+        <w:t xml:space="preserve">• </w:t>
+      </w:r>
+      <w:r>
+        <w:rPr>
+          <w:rFonts w:ascii="맑은 고딕" w:hAnsi="맑은 고딕" w:eastAsia="맑은 고딕"/>
+          <w:b w:val="0"/>
+          <w:i w:val="0"/>
+          <w:color w:val="1A1A1A"/>
+          <w:sz w:val="22"/>
+        </w:rPr>
+        <w:t>지수는 아직 추세 전환이 아니다. 대형주 대신 전력·전선·에너지, 화장품, 조선 엔진.</w:t>
+      </w:r>
+    </w:p>
+    <w:p>
+      <w:pPr>
+        <w:spacing w:after="50" w:before="0" w:line="276" w:lineRule="auto"/>
+        <w:ind w:left="312" w:hanging="198"/>
+      </w:pPr>
+      <w:r>
+        <w:rPr>
+          <w:rFonts w:ascii="맑은 고딕" w:hAnsi="맑은 고딕" w:eastAsia="맑은 고딕"/>
+          <w:b w:val="0"/>
+          <w:i w:val="0"/>
+          <w:color w:val="1E407C"/>
+          <w:sz w:val="22"/>
+        </w:rPr>
+        <w:t xml:space="preserve">• </w:t>
+      </w:r>
+      <w:r>
+        <w:rPr>
+          <w:rFonts w:ascii="맑은 고딕" w:hAnsi="맑은 고딕" w:eastAsia="맑은 고딕"/>
+          <w:b w:val="0"/>
+          <w:i w:val="0"/>
+          <w:color w:val="1A1A1A"/>
+          <w:sz w:val="22"/>
+        </w:rPr>
+        <w:t>너무 급하게 7,000을 넘으면 개인 물량과 대주주 양도 이슈가 코스피로 온다. 150조는 공개 집계가 아니다. 부분.</w:t>
+      </w:r>
+    </w:p>
+    <w:p>
+      <w:pPr>
+        <w:spacing w:after="50" w:before="0" w:line="276" w:lineRule="auto"/>
+        <w:ind w:left="312" w:hanging="198"/>
+      </w:pPr>
+      <w:r>
+        <w:rPr>
+          <w:rFonts w:ascii="맑은 고딕" w:hAnsi="맑은 고딕" w:eastAsia="맑은 고딕"/>
+          <w:b w:val="0"/>
+          <w:i w:val="0"/>
+          <w:color w:val="1E407C"/>
+          <w:sz w:val="22"/>
+        </w:rPr>
+        <w:t xml:space="preserve">• </w:t>
+      </w:r>
+      <w:r>
+        <w:rPr>
+          <w:rFonts w:ascii="맑은 고딕" w:hAnsi="맑은 고딕" w:eastAsia="맑은 고딕"/>
+          <w:b w:val="0"/>
+          <w:i w:val="0"/>
+          <w:color w:val="1A1A1A"/>
+          <w:sz w:val="22"/>
+        </w:rPr>
+        <w:t>닉스 210–214만은 한 번은 연다. 자사주 매입 종료·10월 중하순과 겹칠 수 있다. 해석. 3·4등주는 사지 마라.</w:t>
+      </w:r>
+    </w:p>
+    <w:p>
+      <w:pPr>
+        <w:spacing w:after="50" w:before="0" w:line="276" w:lineRule="auto"/>
+        <w:ind w:left="312" w:hanging="198"/>
+      </w:pPr>
+      <w:r>
+        <w:rPr>
+          <w:rFonts w:ascii="맑은 고딕" w:hAnsi="맑은 고딕" w:eastAsia="맑은 고딕"/>
+          <w:b w:val="0"/>
+          <w:i w:val="0"/>
+          <w:color w:val="1E407C"/>
+          <w:sz w:val="22"/>
+        </w:rPr>
+        <w:t xml:space="preserve">• </w:t>
+      </w:r>
+      <w:r>
+        <w:rPr>
+          <w:rFonts w:ascii="맑은 고딕" w:hAnsi="맑은 고딕" w:eastAsia="맑은 고딕"/>
+          <w:b w:val="0"/>
+          <w:i w:val="0"/>
+          <w:color w:val="1A1A1A"/>
+          <w:sz w:val="22"/>
+        </w:rPr>
+        <w:t>쓰지 말 것: 외인 7월까지 180조 매도, 삼성 외인 지분 46–47%(평균 49/52). 확인하지 못했다.</w:t>
+      </w:r>
+    </w:p>
+    <w:p>
+      <w:pPr>
+        <w:spacing w:before="280" w:after="160" w:line="264" w:lineRule="auto"/>
+        <w:pBdr>
+          <w:bottom w:val="single" w:sz="12" w:space="4" w:color="0F2043"/>
+        </w:pBdr>
+      </w:pPr>
+      <w:r>
+        <w:rPr>
+          <w:rFonts w:ascii="맑은 고딕" w:hAnsi="맑은 고딕" w:eastAsia="맑은 고딕"/>
+          <w:b/>
+          <w:i w:val="0"/>
+          <w:color w:val="B8943A"/>
+          <w:sz w:val="32"/>
+        </w:rPr>
+        <w:t xml:space="preserve">17.  </w:t>
+      </w:r>
+      <w:r>
+        <w:rPr>
+          <w:rFonts w:ascii="맑은 고딕" w:hAnsi="맑은 고딕" w:eastAsia="맑은 고딕"/>
+          <w:b/>
+          <w:i w:val="0"/>
+          <w:color w:val="0F2043"/>
+          <w:sz w:val="32"/>
+        </w:rPr>
+        <w:t>소부장 — HBM이 온양을 먹고, Q는 28년에 온다</w:t>
+      </w:r>
+    </w:p>
+    <w:p>
+      <w:pPr>
+        <w:spacing w:after="50" w:before="0" w:line="276" w:lineRule="auto"/>
+        <w:ind w:left="312" w:hanging="198"/>
+      </w:pPr>
+      <w:r>
+        <w:rPr>
+          <w:rFonts w:ascii="맑은 고딕" w:hAnsi="맑은 고딕" w:eastAsia="맑은 고딕"/>
+          <w:b w:val="0"/>
+          <w:i w:val="0"/>
+          <w:color w:val="1E407C"/>
+          <w:sz w:val="22"/>
+        </w:rPr>
+        <w:t xml:space="preserve">• </w:t>
+      </w:r>
+      <w:r>
+        <w:rPr>
+          <w:rFonts w:ascii="맑은 고딕" w:hAnsi="맑은 고딕" w:eastAsia="맑은 고딕"/>
+          <w:b w:val="0"/>
+          <w:i w:val="0"/>
+          <w:color w:val="1A1A1A"/>
+          <w:sz w:val="22"/>
+        </w:rPr>
+        <w:t>사실: TheElec 9/15. 삼성은 DDR5 모듈·SSD의 증분을 외주하고 천안·온양을 HBM에 쓴다. 확인된 파트너는 한양디지텍(베트남), 드림텍(인도), SFA세미콘(필리핀).</w:t>
+      </w:r>
+    </w:p>
+    <w:p>
+      <w:pPr>
+        <w:spacing w:after="50" w:before="0" w:line="276" w:lineRule="auto"/>
+        <w:ind w:left="312" w:hanging="198"/>
+      </w:pPr>
+      <w:r>
+        <w:rPr>
+          <w:rFonts w:ascii="맑은 고딕" w:hAnsi="맑은 고딕" w:eastAsia="맑은 고딕"/>
+          <w:b w:val="0"/>
+          <w:i w:val="0"/>
+          <w:color w:val="1E407C"/>
+          <w:sz w:val="22"/>
+        </w:rPr>
+        <w:t xml:space="preserve">• </w:t>
+      </w:r>
+      <w:r>
+        <w:rPr>
+          <w:rFonts w:ascii="맑은 고딕" w:hAnsi="맑은 고딕" w:eastAsia="맑은 고딕"/>
+          <w:b w:val="0"/>
+          <w:i w:val="0"/>
+          <w:color w:val="1A1A1A"/>
+          <w:sz w:val="22"/>
+        </w:rPr>
+        <w:t>부분: 좌담이 하나마이크론을 삼성 DDR5 파트너로 특정. 공개 보도의 이름은 위 셋이다. 하나마이크론은 베트남 OSAT 증설 수혜 후보다.</w:t>
+      </w:r>
+    </w:p>
+    <w:p>
+      <w:pPr>
+        <w:spacing w:after="50" w:before="0" w:line="276" w:lineRule="auto"/>
+        <w:ind w:left="312" w:hanging="198"/>
+      </w:pPr>
+      <w:r>
+        <w:rPr>
+          <w:rFonts w:ascii="맑은 고딕" w:hAnsi="맑은 고딕" w:eastAsia="맑은 고딕"/>
+          <w:b w:val="0"/>
+          <w:i w:val="0"/>
+          <w:color w:val="1E407C"/>
+          <w:sz w:val="22"/>
+        </w:rPr>
+        <w:t xml:space="preserve">• </w:t>
+      </w:r>
+      <w:r>
+        <w:rPr>
+          <w:rFonts w:ascii="맑은 고딕" w:hAnsi="맑은 고딕" w:eastAsia="맑은 고딕"/>
+          <w:b w:val="0"/>
+          <w:i w:val="0"/>
+          <w:color w:val="1A1A1A"/>
+          <w:sz w:val="22"/>
+        </w:rPr>
+        <w:t>테스트·소켓·OSAT가 7월 말 이후 상대 강도. DI, 엑시콘, ISC, 하나마이크론, 한양디지텍, PSK홀딩스.</w:t>
+      </w:r>
+    </w:p>
+    <w:p>
+      <w:pPr>
+        <w:spacing w:after="50" w:before="0" w:line="276" w:lineRule="auto"/>
+        <w:ind w:left="312" w:hanging="198"/>
+      </w:pPr>
+      <w:r>
+        <w:rPr>
+          <w:rFonts w:ascii="맑은 고딕" w:hAnsi="맑은 고딕" w:eastAsia="맑은 고딕"/>
+          <w:b w:val="0"/>
+          <w:i w:val="0"/>
+          <w:color w:val="1E407C"/>
+          <w:sz w:val="22"/>
+        </w:rPr>
+        <w:t xml:space="preserve">• </w:t>
+      </w:r>
+      <w:r>
+        <w:rPr>
+          <w:rFonts w:ascii="맑은 고딕" w:hAnsi="맑은 고딕" w:eastAsia="맑은 고딕"/>
+          <w:b w:val="0"/>
+          <w:i w:val="0"/>
+          <w:color w:val="1A1A1A"/>
+          <w:sz w:val="22"/>
+        </w:rPr>
+        <w:t>부품·소재 실적은 삼성 반등보다 대략 6개월 후행. 심텍 등 기판은 2분기부터 추정치를 상회하기 시작했다.</w:t>
+      </w:r>
+    </w:p>
+    <w:p>
+      <w:pPr>
+        <w:spacing w:after="50" w:before="0" w:line="276" w:lineRule="auto"/>
+        <w:ind w:left="312" w:hanging="198"/>
+      </w:pPr>
+      <w:r>
+        <w:rPr>
+          <w:rFonts w:ascii="맑은 고딕" w:hAnsi="맑은 고딕" w:eastAsia="맑은 고딕"/>
+          <w:b w:val="0"/>
+          <w:i w:val="0"/>
+          <w:color w:val="1E407C"/>
+          <w:sz w:val="22"/>
+        </w:rPr>
+        <w:t xml:space="preserve">• </w:t>
+      </w:r>
+      <w:r>
+        <w:rPr>
+          <w:rFonts w:ascii="맑은 고딕" w:hAnsi="맑은 고딕" w:eastAsia="맑은 고딕"/>
+          <w:b w:val="0"/>
+          <w:i w:val="0"/>
+          <w:color w:val="1A1A1A"/>
+          <w:sz w:val="22"/>
+        </w:rPr>
+        <w:t>손희원: 블랙 약 180만 장 → 베라루빈 약 280만 장. HBM Q와 서버 디램·소캠이 같이 는다. 선제 증설은 고객 요청의 흔적.</w:t>
+      </w:r>
+    </w:p>
+    <w:p>
+      <w:pPr>
+        <w:spacing w:after="50" w:before="0" w:line="276" w:lineRule="auto"/>
+        <w:ind w:left="312" w:hanging="198"/>
+      </w:pPr>
+      <w:r>
+        <w:rPr>
+          <w:rFonts w:ascii="맑은 고딕" w:hAnsi="맑은 고딕" w:eastAsia="맑은 고딕"/>
+          <w:b w:val="0"/>
+          <w:i w:val="0"/>
+          <w:color w:val="1E407C"/>
+          <w:sz w:val="22"/>
+        </w:rPr>
+        <w:t xml:space="preserve">• </w:t>
+      </w:r>
+      <w:r>
+        <w:rPr>
+          <w:rFonts w:ascii="맑은 고딕" w:hAnsi="맑은 고딕" w:eastAsia="맑은 고딕"/>
+          <w:b w:val="0"/>
+          <w:i w:val="0"/>
+          <w:color w:val="1A1A1A"/>
+          <w:sz w:val="22"/>
+        </w:rPr>
+        <w:t>해석: Q사이클은 28년. 지금부터 그것 때문에 풀베팅할 수는 없다. 장비는 먼저, 소재는 내년 램프업(청주 15x, 평택 P4).</w:t>
+      </w:r>
+    </w:p>
+    <w:p>
+      <w:pPr>
+        <w:spacing w:after="50" w:before="0" w:line="276" w:lineRule="auto"/>
+        <w:ind w:left="312" w:hanging="198"/>
+      </w:pPr>
+      <w:r>
+        <w:rPr>
+          <w:rFonts w:ascii="맑은 고딕" w:hAnsi="맑은 고딕" w:eastAsia="맑은 고딕"/>
+          <w:b w:val="0"/>
+          <w:i w:val="0"/>
+          <w:color w:val="1E407C"/>
+          <w:sz w:val="22"/>
+        </w:rPr>
+        <w:t xml:space="preserve">• </w:t>
+      </w:r>
+      <w:r>
+        <w:rPr>
+          <w:rFonts w:ascii="맑은 고딕" w:hAnsi="맑은 고딕" w:eastAsia="맑은 고딕"/>
+          <w:b w:val="0"/>
+          <w:i w:val="0"/>
+          <w:color w:val="1A1A1A"/>
+          <w:sz w:val="22"/>
+        </w:rPr>
+        <w:t>원전은 신재생이 대체할 수 없는 베이스로드. 2차전지는 바닥은 찍었으나 가격 주도권이 없다. 셀(SDI)이 소재보다 낫고, 실적 시즌엔 의심.</w:t>
+      </w:r>
+    </w:p>
+    <w:p>
+      <w:pPr>
+        <w:spacing w:after="50" w:before="0" w:line="276" w:lineRule="auto"/>
+        <w:ind w:left="312" w:hanging="198"/>
+      </w:pPr>
+      <w:r>
+        <w:rPr>
+          <w:rFonts w:ascii="맑은 고딕" w:hAnsi="맑은 고딕" w:eastAsia="맑은 고딕"/>
+          <w:b w:val="0"/>
+          <w:i w:val="0"/>
+          <w:color w:val="1E407C"/>
+          <w:sz w:val="22"/>
+        </w:rPr>
+        <w:t xml:space="preserve">• </w:t>
+      </w:r>
+      <w:r>
+        <w:rPr>
+          <w:rFonts w:ascii="맑은 고딕" w:hAnsi="맑은 고딕" w:eastAsia="맑은 고딕"/>
+          <w:b w:val="0"/>
+          <w:i w:val="0"/>
+          <w:color w:val="1A1A1A"/>
+          <w:sz w:val="22"/>
+        </w:rPr>
+        <w:t>광통신은 파일럿이 아니라 양산 스케줄이 나오는 단계. 엔비디아에 납품하는 기업과 ‘우리도 한다’를 밸류로 가를 것.</w:t>
+      </w:r>
+    </w:p>
+    <w:p>
+      <w:pPr>
+        <w:spacing w:after="50" w:before="0" w:line="276" w:lineRule="auto"/>
+        <w:ind w:left="312" w:hanging="198"/>
+      </w:pPr>
+      <w:r>
+        <w:rPr>
+          <w:rFonts w:ascii="맑은 고딕" w:hAnsi="맑은 고딕" w:eastAsia="맑은 고딕"/>
+          <w:b w:val="0"/>
+          <w:i w:val="0"/>
+          <w:color w:val="1E407C"/>
+          <w:sz w:val="22"/>
+        </w:rPr>
+        <w:t xml:space="preserve">• </w:t>
+      </w:r>
+      <w:r>
+        <w:rPr>
+          <w:rFonts w:ascii="맑은 고딕" w:hAnsi="맑은 고딕" w:eastAsia="맑은 고딕"/>
+          <w:b w:val="0"/>
+          <w:i w:val="0"/>
+          <w:color w:val="1A1A1A"/>
+          <w:sz w:val="22"/>
+        </w:rPr>
+        <w:t>부분: 알테오젠 시총 18조. 9월 초 약 20.8조. 에코프로 11조는 미확인. 상징은 주성엔지니어링이 4위라는 말.</w:t>
+      </w:r>
+    </w:p>
+    <w:tbl>
+      <w:tblPr>
+        <w:tblW w:type="auto" w:w="0"/>
+        <w:jc w:val="center"/>
+        <w:tblLayout w:type="autofit"/>
+        <w:tblLook w:firstColumn="1" w:firstRow="1" w:lastColumn="0" w:lastRow="0" w:noHBand="0" w:noVBand="1" w:val="04A0"/>
+      </w:tblPr>
+      <w:tblGrid>
+        <w:gridCol w:w="10092"/>
+      </w:tblGrid>
+      <w:tr>
+        <w:tc>
+          <w:tcPr>
+            <w:tcW w:type="dxa" w:w="10092"/>
+            <w:shd w:val="clear" w:color="auto" w:fill="EEF2F8"/>
+            <w:tcBorders>
+              <w:top w:val="nil"/>
+              <w:left w:val="single" w:sz="28" w:space="0" w:color="0F2043"/>
+              <w:bottom w:val="nil"/>
+              <w:right w:val="nil"/>
+            </w:tcBorders>
+            <w:tcMar>
+              <w:top w:w="80" w:type="dxa"/>
+              <w:left w:w="120" w:type="dxa"/>
+              <w:bottom w:w="80" w:type="dxa"/>
+              <w:right w:w="120" w:type="dxa"/>
+            </w:tcMar>
+          </w:tcPr>
+          <w:p>
+            <w:pPr>
+              <w:spacing w:after="40" w:before="0"/>
+            </w:pPr>
+            <w:r/>
+            <w:r>
+              <w:rPr>
+                <w:rFonts w:ascii="맑은 고딕" w:hAnsi="맑은 고딕" w:eastAsia="맑은 고딕"/>
+                <w:b/>
+                <w:i w:val="0"/>
+                <w:color w:val="0F2043"/>
+                <w:sz w:val="20"/>
+              </w:rPr>
+              <w:t>물리 영수증</w:t>
+            </w:r>
+          </w:p>
+          <w:p>
+            <w:pPr>
+              <w:spacing w:after="20" w:before="0" w:line="276" w:lineRule="auto"/>
+            </w:pPr>
+            <w:r>
+              <w:rPr>
+                <w:rFonts w:ascii="맑은 고딕" w:hAnsi="맑은 고딕" w:eastAsia="맑은 고딕"/>
+                <w:b w:val="0"/>
+                <w:i w:val="0"/>
+                <w:color w:val="1A1A1A"/>
+                <w:sz w:val="21"/>
+              </w:rPr>
+              <w:t>효성중공업 변압기, 두산퓨얼셀, 두산 CCL 증설, 현대일렉 엔진, 아마존–Generac. 기업이 거짓말한 거래가 아니다. 주가가 안 가는 이유는 숫자를 안 믿어서다.</w:t>
+            </w:r>
+          </w:p>
+        </w:tc>
+      </w:tr>
+    </w:tbl>
+    <w:p>
+      <w:pPr>
+        <w:spacing w:after="120"/>
+      </w:pPr>
+    </w:p>
+    <w:p>
+      <w:pPr>
+        <w:spacing w:before="280" w:after="160" w:line="264" w:lineRule="auto"/>
+        <w:pBdr>
+          <w:bottom w:val="single" w:sz="12" w:space="4" w:color="0F2043"/>
+        </w:pBdr>
+      </w:pPr>
+      <w:r>
+        <w:rPr>
+          <w:rFonts w:ascii="맑은 고딕" w:hAnsi="맑은 고딕" w:eastAsia="맑은 고딕"/>
+          <w:b/>
+          <w:i w:val="0"/>
+          <w:color w:val="B8943A"/>
+          <w:sz w:val="32"/>
+        </w:rPr>
+        <w:t xml:space="preserve">18.  </w:t>
+      </w:r>
+      <w:r>
+        <w:rPr>
+          <w:rFonts w:ascii="맑은 고딕" w:hAnsi="맑은 고딕" w:eastAsia="맑은 고딕"/>
+          <w:b/>
+          <w:i w:val="0"/>
+          <w:color w:val="0F2043"/>
+          <w:sz w:val="32"/>
+        </w:rPr>
+        <w:t>고친 것 · 확인 다섯</w:t>
       </w:r>
     </w:p>
     <w:tbl>
@@ -9682,6 +12371,850 @@
           </w:p>
         </w:tc>
       </w:tr>
+      <w:tr>
+        <w:trPr>
+          <w:cantSplit/>
+        </w:trPr>
+        <w:tc>
+          <w:tcPr>
+            <w:tcW w:type="dxa" w:w="2608"/>
+            <w:shd w:val="clear" w:color="auto" w:fill="FFFFFF"/>
+            <w:tcMar>
+              <w:top w:w="60" w:type="dxa"/>
+              <w:left w:w="80" w:type="dxa"/>
+              <w:bottom w:w="60" w:type="dxa"/>
+              <w:right w:w="80" w:type="dxa"/>
+            </w:tcMar>
+          </w:tcPr>
+          <w:p>
+            <w:pPr>
+              <w:spacing w:before="0" w:after="0" w:line="269" w:lineRule="auto"/>
+              <w:jc w:val="left"/>
+            </w:pPr>
+            <w:r/>
+            <w:r>
+              <w:rPr>
+                <w:rFonts w:ascii="맑은 고딕" w:hAnsi="맑은 고딕" w:eastAsia="맑은 고딕"/>
+                <w:b/>
+                <w:i w:val="0"/>
+                <w:color w:val="1A1A1A"/>
+                <w:sz w:val="19"/>
+              </w:rPr>
+              <w:t>PER 19.5의 역수=20%</w:t>
+            </w:r>
+          </w:p>
+        </w:tc>
+        <w:tc>
+          <w:tcPr>
+            <w:tcW w:type="dxa" w:w="3628"/>
+            <w:shd w:val="clear" w:color="auto" w:fill="FFFFFF"/>
+            <w:tcMar>
+              <w:top w:w="60" w:type="dxa"/>
+              <w:left w:w="80" w:type="dxa"/>
+              <w:bottom w:w="60" w:type="dxa"/>
+              <w:right w:w="80" w:type="dxa"/>
+            </w:tcMar>
+          </w:tcPr>
+          <w:p>
+            <w:pPr>
+              <w:spacing w:before="0" w:after="0" w:line="269" w:lineRule="auto"/>
+              <w:jc w:val="center"/>
+            </w:pPr>
+            <w:r/>
+            <w:r>
+              <w:rPr>
+                <w:rFonts w:ascii="맑은 고딕" w:hAnsi="맑은 고딕" w:eastAsia="맑은 고딕"/>
+                <w:b w:val="0"/>
+                <w:i w:val="0"/>
+                <w:color w:val="1A1A1A"/>
+                <w:sz w:val="19"/>
+              </w:rPr>
+              <w:t>역수는 약 5.1%</w:t>
+            </w:r>
+          </w:p>
+        </w:tc>
+        <w:tc>
+          <w:tcPr>
+            <w:tcW w:type="dxa" w:w="3742"/>
+            <w:shd w:val="clear" w:color="auto" w:fill="FFFFFF"/>
+            <w:tcMar>
+              <w:top w:w="60" w:type="dxa"/>
+              <w:left w:w="80" w:type="dxa"/>
+              <w:bottom w:w="60" w:type="dxa"/>
+              <w:right w:w="80" w:type="dxa"/>
+            </w:tcMar>
+          </w:tcPr>
+          <w:p>
+            <w:pPr>
+              <w:spacing w:before="0" w:after="0" w:line="269" w:lineRule="auto"/>
+              <w:jc w:val="center"/>
+            </w:pPr>
+            <w:r/>
+            <w:r>
+              <w:rPr>
+                <w:rFonts w:ascii="맑은 고딕" w:hAnsi="맑은 고딕" w:eastAsia="맑은 고딕"/>
+                <w:b w:val="0"/>
+                <w:i w:val="0"/>
+                <w:color w:val="1A1A1A"/>
+                <w:sz w:val="19"/>
+              </w:rPr>
+              <w:t>선행 PER≈19. 후행은 25.9</w:t>
+            </w:r>
+          </w:p>
+        </w:tc>
+      </w:tr>
+      <w:tr>
+        <w:trPr>
+          <w:cantSplit/>
+        </w:trPr>
+        <w:tc>
+          <w:tcPr>
+            <w:tcW w:type="dxa" w:w="2608"/>
+            <w:shd w:val="clear" w:color="auto" w:fill="F7F9FC"/>
+            <w:tcMar>
+              <w:top w:w="60" w:type="dxa"/>
+              <w:left w:w="80" w:type="dxa"/>
+              <w:bottom w:w="60" w:type="dxa"/>
+              <w:right w:w="80" w:type="dxa"/>
+            </w:tcMar>
+          </w:tcPr>
+          <w:p>
+            <w:pPr>
+              <w:spacing w:before="0" w:after="0" w:line="269" w:lineRule="auto"/>
+              <w:jc w:val="left"/>
+            </w:pPr>
+            <w:r/>
+            <w:r>
+              <w:rPr>
+                <w:rFonts w:ascii="맑은 고딕" w:hAnsi="맑은 고딕" w:eastAsia="맑은 고딕"/>
+                <w:b/>
+                <w:i w:val="0"/>
+                <w:color w:val="1A1A1A"/>
+                <w:sz w:val="19"/>
+              </w:rPr>
+              <w:t>엔비디아 2분기 상당액=지분평가</w:t>
+            </w:r>
+          </w:p>
+        </w:tc>
+        <w:tc>
+          <w:tcPr>
+            <w:tcW w:type="dxa" w:w="3628"/>
+            <w:shd w:val="clear" w:color="auto" w:fill="F7F9FC"/>
+            <w:tcMar>
+              <w:top w:w="60" w:type="dxa"/>
+              <w:left w:w="80" w:type="dxa"/>
+              <w:bottom w:w="60" w:type="dxa"/>
+              <w:right w:w="80" w:type="dxa"/>
+            </w:tcMar>
+          </w:tcPr>
+          <w:p>
+            <w:pPr>
+              <w:spacing w:before="0" w:after="0" w:line="269" w:lineRule="auto"/>
+              <w:jc w:val="center"/>
+            </w:pPr>
+            <w:r/>
+            <w:r>
+              <w:rPr>
+                <w:rFonts w:ascii="맑은 고딕" w:hAnsi="맑은 고딕" w:eastAsia="맑은 고딕"/>
+                <w:b w:val="0"/>
+                <w:i w:val="0"/>
+                <w:color w:val="1A1A1A"/>
+                <w:sz w:val="19"/>
+              </w:rPr>
+              <w:t>Q2 $7.8B(13%), 상반기 $23.7B</w:t>
+            </w:r>
+          </w:p>
+        </w:tc>
+        <w:tc>
+          <w:tcPr>
+            <w:tcW w:type="dxa" w:w="3742"/>
+            <w:shd w:val="clear" w:color="auto" w:fill="F7F9FC"/>
+            <w:tcMar>
+              <w:top w:w="60" w:type="dxa"/>
+              <w:left w:w="80" w:type="dxa"/>
+              <w:bottom w:w="60" w:type="dxa"/>
+              <w:right w:w="80" w:type="dxa"/>
+            </w:tcMar>
+          </w:tcPr>
+          <w:p>
+            <w:pPr>
+              <w:spacing w:before="0" w:after="0" w:line="269" w:lineRule="auto"/>
+              <w:jc w:val="center"/>
+            </w:pPr>
+            <w:r/>
+            <w:r>
+              <w:rPr>
+                <w:rFonts w:ascii="맑은 고딕" w:hAnsi="맑은 고딕" w:eastAsia="맑은 고딕"/>
+                <w:b w:val="0"/>
+                <w:i w:val="0"/>
+                <w:color w:val="1A1A1A"/>
+                <w:sz w:val="19"/>
+              </w:rPr>
+              <w:t>분기를 혼동</w:t>
+            </w:r>
+          </w:p>
+        </w:tc>
+      </w:tr>
+      <w:tr>
+        <w:trPr>
+          <w:cantSplit/>
+        </w:trPr>
+        <w:tc>
+          <w:tcPr>
+            <w:tcW w:type="dxa" w:w="2608"/>
+            <w:shd w:val="clear" w:color="auto" w:fill="FFFFFF"/>
+            <w:tcMar>
+              <w:top w:w="60" w:type="dxa"/>
+              <w:left w:w="80" w:type="dxa"/>
+              <w:bottom w:w="60" w:type="dxa"/>
+              <w:right w:w="80" w:type="dxa"/>
+            </w:tcMar>
+          </w:tcPr>
+          <w:p>
+            <w:pPr>
+              <w:spacing w:before="0" w:after="0" w:line="269" w:lineRule="auto"/>
+              <w:jc w:val="left"/>
+            </w:pPr>
+            <w:r/>
+            <w:r>
+              <w:rPr>
+                <w:rFonts w:ascii="맑은 고딕" w:hAnsi="맑은 고딕" w:eastAsia="맑은 고딕"/>
+                <w:b/>
+                <w:i w:val="0"/>
+                <w:color w:val="1A1A1A"/>
+                <w:sz w:val="19"/>
+              </w:rPr>
+              <w:t>엔비디아 CDS 7월 급등</w:t>
+            </w:r>
+          </w:p>
+        </w:tc>
+        <w:tc>
+          <w:tcPr>
+            <w:tcW w:type="dxa" w:w="3628"/>
+            <w:shd w:val="clear" w:color="auto" w:fill="FFFFFF"/>
+            <w:tcMar>
+              <w:top w:w="60" w:type="dxa"/>
+              <w:left w:w="80" w:type="dxa"/>
+              <w:bottom w:w="60" w:type="dxa"/>
+              <w:right w:w="80" w:type="dxa"/>
+            </w:tcMar>
+          </w:tcPr>
+          <w:p>
+            <w:pPr>
+              <w:spacing w:before="0" w:after="0" w:line="269" w:lineRule="auto"/>
+              <w:jc w:val="center"/>
+            </w:pPr>
+            <w:r/>
+            <w:r>
+              <w:rPr>
+                <w:rFonts w:ascii="맑은 고딕" w:hAnsi="맑은 고딕" w:eastAsia="맑은 고딕"/>
+                <w:b w:val="0"/>
+                <w:i w:val="0"/>
+                <w:color w:val="1A1A1A"/>
+                <w:sz w:val="19"/>
+              </w:rPr>
+              <w:t>미확인</w:t>
+            </w:r>
+          </w:p>
+        </w:tc>
+        <w:tc>
+          <w:tcPr>
+            <w:tcW w:type="dxa" w:w="3742"/>
+            <w:shd w:val="clear" w:color="auto" w:fill="FFFFFF"/>
+            <w:tcMar>
+              <w:top w:w="60" w:type="dxa"/>
+              <w:left w:w="80" w:type="dxa"/>
+              <w:bottom w:w="60" w:type="dxa"/>
+              <w:right w:w="80" w:type="dxa"/>
+            </w:tcMar>
+          </w:tcPr>
+          <w:p>
+            <w:pPr>
+              <w:spacing w:before="0" w:after="0" w:line="269" w:lineRule="auto"/>
+              <w:jc w:val="center"/>
+            </w:pPr>
+            <w:r/>
+            <w:r>
+              <w:rPr>
+                <w:rFonts w:ascii="맑은 고딕" w:hAnsi="맑은 고딕" w:eastAsia="맑은 고딕"/>
+                <w:b w:val="0"/>
+                <w:i w:val="0"/>
+                <w:color w:val="1A1A1A"/>
+                <w:sz w:val="19"/>
+              </w:rPr>
+              <w:t>쓰지 말 것</w:t>
+            </w:r>
+          </w:p>
+        </w:tc>
+      </w:tr>
+      <w:tr>
+        <w:trPr>
+          <w:cantSplit/>
+        </w:trPr>
+        <w:tc>
+          <w:tcPr>
+            <w:tcW w:type="dxa" w:w="2608"/>
+            <w:shd w:val="clear" w:color="auto" w:fill="F7F9FC"/>
+            <w:tcMar>
+              <w:top w:w="60" w:type="dxa"/>
+              <w:left w:w="80" w:type="dxa"/>
+              <w:bottom w:w="60" w:type="dxa"/>
+              <w:right w:w="80" w:type="dxa"/>
+            </w:tcMar>
+          </w:tcPr>
+          <w:p>
+            <w:pPr>
+              <w:spacing w:before="0" w:after="0" w:line="269" w:lineRule="auto"/>
+              <w:jc w:val="left"/>
+            </w:pPr>
+            <w:r/>
+            <w:r>
+              <w:rPr>
+                <w:rFonts w:ascii="맑은 고딕" w:hAnsi="맑은 고딕" w:eastAsia="맑은 고딕"/>
+                <w:b/>
+                <w:i w:val="0"/>
+                <w:color w:val="1A1A1A"/>
+                <w:sz w:val="19"/>
+              </w:rPr>
+              <w:t>토큰 2,400% · 초당 1,000억</w:t>
+            </w:r>
+          </w:p>
+        </w:tc>
+        <w:tc>
+          <w:tcPr>
+            <w:tcW w:type="dxa" w:w="3628"/>
+            <w:shd w:val="clear" w:color="auto" w:fill="F7F9FC"/>
+            <w:tcMar>
+              <w:top w:w="60" w:type="dxa"/>
+              <w:left w:w="80" w:type="dxa"/>
+              <w:bottom w:w="60" w:type="dxa"/>
+              <w:right w:w="80" w:type="dxa"/>
+            </w:tcMar>
+          </w:tcPr>
+          <w:p>
+            <w:pPr>
+              <w:spacing w:before="0" w:after="0" w:line="269" w:lineRule="auto"/>
+              <w:jc w:val="center"/>
+            </w:pPr>
+            <w:r/>
+            <w:r>
+              <w:rPr>
+                <w:rFonts w:ascii="맑은 고딕" w:hAnsi="맑은 고딕" w:eastAsia="맑은 고딕"/>
+                <w:b w:val="0"/>
+                <w:i w:val="0"/>
+                <w:color w:val="1A1A1A"/>
+                <w:sz w:val="19"/>
+              </w:rPr>
+              <w:t>OpenRouter 볼륨 YoY 28배</w:t>
+            </w:r>
+          </w:p>
+        </w:tc>
+        <w:tc>
+          <w:tcPr>
+            <w:tcW w:type="dxa" w:w="3742"/>
+            <w:shd w:val="clear" w:color="auto" w:fill="F7F9FC"/>
+            <w:tcMar>
+              <w:top w:w="60" w:type="dxa"/>
+              <w:left w:w="80" w:type="dxa"/>
+              <w:bottom w:w="60" w:type="dxa"/>
+              <w:right w:w="80" w:type="dxa"/>
+            </w:tcMar>
+          </w:tcPr>
+          <w:p>
+            <w:pPr>
+              <w:spacing w:before="0" w:after="0" w:line="269" w:lineRule="auto"/>
+              <w:jc w:val="center"/>
+            </w:pPr>
+            <w:r/>
+            <w:r>
+              <w:rPr>
+                <w:rFonts w:ascii="맑은 고딕" w:hAnsi="맑은 고딕" w:eastAsia="맑은 고딕"/>
+                <w:b w:val="0"/>
+                <w:i w:val="0"/>
+                <w:color w:val="1A1A1A"/>
+                <w:sz w:val="19"/>
+              </w:rPr>
+              <w:t>방송 숫자 원소스가 없음</w:t>
+            </w:r>
+          </w:p>
+        </w:tc>
+      </w:tr>
+      <w:tr>
+        <w:trPr>
+          <w:cantSplit/>
+        </w:trPr>
+        <w:tc>
+          <w:tcPr>
+            <w:tcW w:type="dxa" w:w="2608"/>
+            <w:shd w:val="clear" w:color="auto" w:fill="FFFFFF"/>
+            <w:tcMar>
+              <w:top w:w="60" w:type="dxa"/>
+              <w:left w:w="80" w:type="dxa"/>
+              <w:bottom w:w="60" w:type="dxa"/>
+              <w:right w:w="80" w:type="dxa"/>
+            </w:tcMar>
+          </w:tcPr>
+          <w:p>
+            <w:pPr>
+              <w:spacing w:before="0" w:after="0" w:line="269" w:lineRule="auto"/>
+              <w:jc w:val="left"/>
+            </w:pPr>
+            <w:r/>
+            <w:r>
+              <w:rPr>
+                <w:rFonts w:ascii="맑은 고딕" w:hAnsi="맑은 고딕" w:eastAsia="맑은 고딕"/>
+                <w:b/>
+                <w:i w:val="0"/>
+                <w:color w:val="1A1A1A"/>
+                <w:sz w:val="19"/>
+              </w:rPr>
+              <w:t>하나마이크론=삼성 DDR5 파트너</w:t>
+            </w:r>
+          </w:p>
+        </w:tc>
+        <w:tc>
+          <w:tcPr>
+            <w:tcW w:type="dxa" w:w="3628"/>
+            <w:shd w:val="clear" w:color="auto" w:fill="FFFFFF"/>
+            <w:tcMar>
+              <w:top w:w="60" w:type="dxa"/>
+              <w:left w:w="80" w:type="dxa"/>
+              <w:bottom w:w="60" w:type="dxa"/>
+              <w:right w:w="80" w:type="dxa"/>
+            </w:tcMar>
+          </w:tcPr>
+          <w:p>
+            <w:pPr>
+              <w:spacing w:before="0" w:after="0" w:line="269" w:lineRule="auto"/>
+              <w:jc w:val="center"/>
+            </w:pPr>
+            <w:r/>
+            <w:r>
+              <w:rPr>
+                <w:rFonts w:ascii="맑은 고딕" w:hAnsi="맑은 고딕" w:eastAsia="맑은 고딕"/>
+                <w:b w:val="0"/>
+                <w:i w:val="0"/>
+                <w:color w:val="1A1A1A"/>
+                <w:sz w:val="19"/>
+              </w:rPr>
+              <w:t>한양디지텍·드림텍·SFA</w:t>
+            </w:r>
+          </w:p>
+        </w:tc>
+        <w:tc>
+          <w:tcPr>
+            <w:tcW w:type="dxa" w:w="3742"/>
+            <w:shd w:val="clear" w:color="auto" w:fill="FFFFFF"/>
+            <w:tcMar>
+              <w:top w:w="60" w:type="dxa"/>
+              <w:left w:w="80" w:type="dxa"/>
+              <w:bottom w:w="60" w:type="dxa"/>
+              <w:right w:w="80" w:type="dxa"/>
+            </w:tcMar>
+          </w:tcPr>
+          <w:p>
+            <w:pPr>
+              <w:spacing w:before="0" w:after="0" w:line="269" w:lineRule="auto"/>
+              <w:jc w:val="center"/>
+            </w:pPr>
+            <w:r/>
+            <w:r>
+              <w:rPr>
+                <w:rFonts w:ascii="맑은 고딕" w:hAnsi="맑은 고딕" w:eastAsia="맑은 고딕"/>
+                <w:b w:val="0"/>
+                <w:i w:val="0"/>
+                <w:color w:val="1A1A1A"/>
+                <w:sz w:val="19"/>
+              </w:rPr>
+              <w:t>베트남 OSAT 후보는 가능</w:t>
+            </w:r>
+          </w:p>
+        </w:tc>
+      </w:tr>
+      <w:tr>
+        <w:trPr>
+          <w:cantSplit/>
+        </w:trPr>
+        <w:tc>
+          <w:tcPr>
+            <w:tcW w:type="dxa" w:w="2608"/>
+            <w:shd w:val="clear" w:color="auto" w:fill="F7F9FC"/>
+            <w:tcMar>
+              <w:top w:w="60" w:type="dxa"/>
+              <w:left w:w="80" w:type="dxa"/>
+              <w:bottom w:w="60" w:type="dxa"/>
+              <w:right w:w="80" w:type="dxa"/>
+            </w:tcMar>
+          </w:tcPr>
+          <w:p>
+            <w:pPr>
+              <w:spacing w:before="0" w:after="0" w:line="269" w:lineRule="auto"/>
+              <w:jc w:val="left"/>
+            </w:pPr>
+            <w:r/>
+            <w:r>
+              <w:rPr>
+                <w:rFonts w:ascii="맑은 고딕" w:hAnsi="맑은 고딕" w:eastAsia="맑은 고딕"/>
+                <w:b/>
+                <w:i w:val="0"/>
+                <w:color w:val="1A1A1A"/>
+                <w:sz w:val="19"/>
+              </w:rPr>
+              <w:t>현대차 수출 −30%</w:t>
+            </w:r>
+          </w:p>
+        </w:tc>
+        <w:tc>
+          <w:tcPr>
+            <w:tcW w:type="dxa" w:w="3628"/>
+            <w:shd w:val="clear" w:color="auto" w:fill="F7F9FC"/>
+            <w:tcMar>
+              <w:top w:w="60" w:type="dxa"/>
+              <w:left w:w="80" w:type="dxa"/>
+              <w:bottom w:w="60" w:type="dxa"/>
+              <w:right w:w="80" w:type="dxa"/>
+            </w:tcMar>
+          </w:tcPr>
+          <w:p>
+            <w:pPr>
+              <w:spacing w:before="0" w:after="20" w:line="269" w:lineRule="auto"/>
+              <w:jc w:val="center"/>
+            </w:pPr>
+            <w:r/>
+            <w:r>
+              <w:rPr>
+                <w:rFonts w:ascii="맑은 고딕" w:hAnsi="맑은 고딕" w:eastAsia="맑은 고딕"/>
+                <w:b w:val="0"/>
+                <w:i w:val="0"/>
+                <w:color w:val="1A1A1A"/>
+                <w:sz w:val="19"/>
+              </w:rPr>
+              <w:t>산업 수출액 −29.8%</w:t>
+            </w:r>
+          </w:p>
+          <w:p>
+            <w:pPr>
+              <w:spacing w:before="0" w:after="0" w:line="269" w:lineRule="auto"/>
+              <w:jc w:val="center"/>
+            </w:pPr>
+            <w:r>
+              <w:rPr>
+                <w:rFonts w:ascii="맑은 고딕" w:hAnsi="맑은 고딕" w:eastAsia="맑은 고딕"/>
+                <w:b w:val="0"/>
+                <w:i w:val="0"/>
+                <w:color w:val="1A1A1A"/>
+                <w:sz w:val="19"/>
+              </w:rPr>
+              <w:t>현대 대수 −48.9%</w:t>
+            </w:r>
+          </w:p>
+        </w:tc>
+        <w:tc>
+          <w:tcPr>
+            <w:tcW w:type="dxa" w:w="3742"/>
+            <w:shd w:val="clear" w:color="auto" w:fill="F7F9FC"/>
+            <w:tcMar>
+              <w:top w:w="60" w:type="dxa"/>
+              <w:left w:w="80" w:type="dxa"/>
+              <w:bottom w:w="60" w:type="dxa"/>
+              <w:right w:w="80" w:type="dxa"/>
+            </w:tcMar>
+          </w:tcPr>
+          <w:p>
+            <w:pPr>
+              <w:spacing w:before="0" w:after="0" w:line="269" w:lineRule="auto"/>
+              <w:jc w:val="center"/>
+            </w:pPr>
+            <w:r/>
+            <w:r>
+              <w:rPr>
+                <w:rFonts w:ascii="맑은 고딕" w:hAnsi="맑은 고딕" w:eastAsia="맑은 고딕"/>
+                <w:b w:val="0"/>
+                <w:i w:val="0"/>
+                <w:color w:val="1A1A1A"/>
+                <w:sz w:val="19"/>
+              </w:rPr>
+              <w:t>해외판매 −8.5%와 별개</w:t>
+            </w:r>
+          </w:p>
+        </w:tc>
+      </w:tr>
+      <w:tr>
+        <w:trPr>
+          <w:cantSplit/>
+        </w:trPr>
+        <w:tc>
+          <w:tcPr>
+            <w:tcW w:type="dxa" w:w="2608"/>
+            <w:shd w:val="clear" w:color="auto" w:fill="FFFFFF"/>
+            <w:tcMar>
+              <w:top w:w="60" w:type="dxa"/>
+              <w:left w:w="80" w:type="dxa"/>
+              <w:bottom w:w="60" w:type="dxa"/>
+              <w:right w:w="80" w:type="dxa"/>
+            </w:tcMar>
+          </w:tcPr>
+          <w:p>
+            <w:pPr>
+              <w:spacing w:before="0" w:after="0" w:line="269" w:lineRule="auto"/>
+              <w:jc w:val="left"/>
+            </w:pPr>
+            <w:r/>
+            <w:r>
+              <w:rPr>
+                <w:rFonts w:ascii="맑은 고딕" w:hAnsi="맑은 고딕" w:eastAsia="맑은 고딕"/>
+                <w:b/>
+                <w:i w:val="0"/>
+                <w:color w:val="1A1A1A"/>
+                <w:sz w:val="19"/>
+              </w:rPr>
+              <w:t>예탁금 100조</w:t>
+            </w:r>
+          </w:p>
+        </w:tc>
+        <w:tc>
+          <w:tcPr>
+            <w:tcW w:type="dxa" w:w="3628"/>
+            <w:shd w:val="clear" w:color="auto" w:fill="FFFFFF"/>
+            <w:tcMar>
+              <w:top w:w="60" w:type="dxa"/>
+              <w:left w:w="80" w:type="dxa"/>
+              <w:bottom w:w="60" w:type="dxa"/>
+              <w:right w:w="80" w:type="dxa"/>
+            </w:tcMar>
+          </w:tcPr>
+          <w:p>
+            <w:pPr>
+              <w:spacing w:before="0" w:after="0" w:line="269" w:lineRule="auto"/>
+              <w:jc w:val="center"/>
+            </w:pPr>
+            <w:r/>
+            <w:r>
+              <w:rPr>
+                <w:rFonts w:ascii="맑은 고딕" w:hAnsi="맑은 고딕" w:eastAsia="맑은 고딕"/>
+                <w:b w:val="0"/>
+                <w:i w:val="0"/>
+                <w:color w:val="1A1A1A"/>
+                <w:sz w:val="19"/>
+              </w:rPr>
+              <w:t>8/28 약 96.7조</w:t>
+            </w:r>
+          </w:p>
+        </w:tc>
+        <w:tc>
+          <w:tcPr>
+            <w:tcW w:type="dxa" w:w="3742"/>
+            <w:shd w:val="clear" w:color="auto" w:fill="FFFFFF"/>
+            <w:tcMar>
+              <w:top w:w="60" w:type="dxa"/>
+              <w:left w:w="80" w:type="dxa"/>
+              <w:bottom w:w="60" w:type="dxa"/>
+              <w:right w:w="80" w:type="dxa"/>
+            </w:tcMar>
+          </w:tcPr>
+          <w:p>
+            <w:pPr>
+              <w:spacing w:before="0" w:after="0" w:line="269" w:lineRule="auto"/>
+              <w:jc w:val="center"/>
+            </w:pPr>
+            <w:r/>
+            <w:r>
+              <w:rPr>
+                <w:rFonts w:ascii="맑은 고딕" w:hAnsi="맑은 고딕" w:eastAsia="맑은 고딕"/>
+                <w:b w:val="0"/>
+                <w:i w:val="0"/>
+                <w:color w:val="1A1A1A"/>
+                <w:sz w:val="19"/>
+              </w:rPr>
+              <w:t>이미 100조 아래</w:t>
+            </w:r>
+          </w:p>
+        </w:tc>
+      </w:tr>
+      <w:tr>
+        <w:trPr>
+          <w:cantSplit/>
+        </w:trPr>
+        <w:tc>
+          <w:tcPr>
+            <w:tcW w:type="dxa" w:w="2608"/>
+            <w:shd w:val="clear" w:color="auto" w:fill="F7F9FC"/>
+            <w:tcMar>
+              <w:top w:w="60" w:type="dxa"/>
+              <w:left w:w="80" w:type="dxa"/>
+              <w:bottom w:w="60" w:type="dxa"/>
+              <w:right w:w="80" w:type="dxa"/>
+            </w:tcMar>
+          </w:tcPr>
+          <w:p>
+            <w:pPr>
+              <w:spacing w:before="0" w:after="0" w:line="269" w:lineRule="auto"/>
+              <w:jc w:val="left"/>
+            </w:pPr>
+            <w:r/>
+            <w:r>
+              <w:rPr>
+                <w:rFonts w:ascii="맑은 고딕" w:hAnsi="맑은 고딕" w:eastAsia="맑은 고딕"/>
+                <w:b/>
+                <w:i w:val="0"/>
+                <w:color w:val="1A1A1A"/>
+                <w:sz w:val="19"/>
+              </w:rPr>
+              <w:t>원/달러 1,500→1,320</w:t>
+            </w:r>
+          </w:p>
+        </w:tc>
+        <w:tc>
+          <w:tcPr>
+            <w:tcW w:type="dxa" w:w="3628"/>
+            <w:shd w:val="clear" w:color="auto" w:fill="F7F9FC"/>
+            <w:tcMar>
+              <w:top w:w="60" w:type="dxa"/>
+              <w:left w:w="80" w:type="dxa"/>
+              <w:bottom w:w="60" w:type="dxa"/>
+              <w:right w:w="80" w:type="dxa"/>
+            </w:tcMar>
+          </w:tcPr>
+          <w:p>
+            <w:pPr>
+              <w:spacing w:before="0" w:after="0" w:line="269" w:lineRule="auto"/>
+              <w:jc w:val="center"/>
+            </w:pPr>
+            <w:r/>
+            <w:r>
+              <w:rPr>
+                <w:rFonts w:ascii="맑은 고딕" w:hAnsi="맑은 고딕" w:eastAsia="맑은 고딕"/>
+                <w:b w:val="0"/>
+                <w:i w:val="0"/>
+                <w:color w:val="1A1A1A"/>
+                <w:sz w:val="19"/>
+              </w:rPr>
+              <w:t>종가 1,383.3</w:t>
+            </w:r>
+          </w:p>
+        </w:tc>
+        <w:tc>
+          <w:tcPr>
+            <w:tcW w:type="dxa" w:w="3742"/>
+            <w:shd w:val="clear" w:color="auto" w:fill="F7F9FC"/>
+            <w:tcMar>
+              <w:top w:w="60" w:type="dxa"/>
+              <w:left w:w="80" w:type="dxa"/>
+              <w:bottom w:w="60" w:type="dxa"/>
+              <w:right w:w="80" w:type="dxa"/>
+            </w:tcMar>
+          </w:tcPr>
+          <w:p>
+            <w:pPr>
+              <w:spacing w:before="0" w:after="0" w:line="269" w:lineRule="auto"/>
+              <w:jc w:val="center"/>
+            </w:pPr>
+            <w:r/>
+            <w:r>
+              <w:rPr>
+                <w:rFonts w:ascii="맑은 고딕" w:hAnsi="맑은 고딕" w:eastAsia="맑은 고딕"/>
+                <w:b w:val="0"/>
+                <w:i w:val="0"/>
+                <w:color w:val="1A1A1A"/>
+                <w:sz w:val="19"/>
+              </w:rPr>
+              <w:t>과거 저점과 오늘을 섞음</w:t>
+            </w:r>
+          </w:p>
+        </w:tc>
+      </w:tr>
+      <w:tr>
+        <w:trPr>
+          <w:cantSplit/>
+        </w:trPr>
+        <w:tc>
+          <w:tcPr>
+            <w:tcW w:type="dxa" w:w="2608"/>
+            <w:shd w:val="clear" w:color="auto" w:fill="FFFFFF"/>
+            <w:tcMar>
+              <w:top w:w="60" w:type="dxa"/>
+              <w:left w:w="80" w:type="dxa"/>
+              <w:bottom w:w="60" w:type="dxa"/>
+              <w:right w:w="80" w:type="dxa"/>
+            </w:tcMar>
+          </w:tcPr>
+          <w:p>
+            <w:pPr>
+              <w:spacing w:before="0" w:after="0" w:line="269" w:lineRule="auto"/>
+              <w:jc w:val="left"/>
+            </w:pPr>
+            <w:r/>
+            <w:r>
+              <w:rPr>
+                <w:rFonts w:ascii="맑은 고딕" w:hAnsi="맑은 고딕" w:eastAsia="맑은 고딕"/>
+                <w:b/>
+                <w:i w:val="0"/>
+                <w:color w:val="1A1A1A"/>
+                <w:sz w:val="19"/>
+              </w:rPr>
+              <w:t>알테오젠 시총 18조</w:t>
+            </w:r>
+          </w:p>
+        </w:tc>
+        <w:tc>
+          <w:tcPr>
+            <w:tcW w:type="dxa" w:w="3628"/>
+            <w:shd w:val="clear" w:color="auto" w:fill="FFFFFF"/>
+            <w:tcMar>
+              <w:top w:w="60" w:type="dxa"/>
+              <w:left w:w="80" w:type="dxa"/>
+              <w:bottom w:w="60" w:type="dxa"/>
+              <w:right w:w="80" w:type="dxa"/>
+            </w:tcMar>
+          </w:tcPr>
+          <w:p>
+            <w:pPr>
+              <w:spacing w:before="0" w:after="0" w:line="269" w:lineRule="auto"/>
+              <w:jc w:val="center"/>
+            </w:pPr>
+            <w:r/>
+            <w:r>
+              <w:rPr>
+                <w:rFonts w:ascii="맑은 고딕" w:hAnsi="맑은 고딕" w:eastAsia="맑은 고딕"/>
+                <w:b w:val="0"/>
+                <w:i w:val="0"/>
+                <w:color w:val="1A1A1A"/>
+                <w:sz w:val="19"/>
+              </w:rPr>
+              <w:t>9월 초 약 20.8조</w:t>
+            </w:r>
+          </w:p>
+        </w:tc>
+        <w:tc>
+          <w:tcPr>
+            <w:tcW w:type="dxa" w:w="3742"/>
+            <w:shd w:val="clear" w:color="auto" w:fill="FFFFFF"/>
+            <w:tcMar>
+              <w:top w:w="60" w:type="dxa"/>
+              <w:left w:w="80" w:type="dxa"/>
+              <w:bottom w:w="60" w:type="dxa"/>
+              <w:right w:w="80" w:type="dxa"/>
+            </w:tcMar>
+          </w:tcPr>
+          <w:p>
+            <w:pPr>
+              <w:spacing w:before="0" w:after="0" w:line="269" w:lineRule="auto"/>
+              <w:jc w:val="center"/>
+            </w:pPr>
+            <w:r/>
+            <w:r>
+              <w:rPr>
+                <w:rFonts w:ascii="맑은 고딕" w:hAnsi="맑은 고딕" w:eastAsia="맑은 고딕"/>
+                <w:b w:val="0"/>
+                <w:i w:val="0"/>
+                <w:color w:val="1A1A1A"/>
+                <w:sz w:val="19"/>
+              </w:rPr>
+              <w:t>대략치</w:t>
+            </w:r>
+          </w:p>
+        </w:tc>
+      </w:tr>
     </w:tbl>
     <w:p>
       <w:pPr>
@@ -9729,7 +13262,7 @@
                 <w:color w:val="0F2043"/>
                 <w:sz w:val="20"/>
               </w:rPr>
-              <w:t>가을 확인 넷</w:t>
+              <w:t>가을 확인 다섯</w:t>
             </w:r>
           </w:p>
           <w:p>
@@ -9774,7 +13307,7 @@
                 <w:color w:val="1A1A1A"/>
                 <w:sz w:val="21"/>
               </w:rPr>
-              <w:t>9/29 DevDay에서 에이전트·API 토큰·기업 배포가 숫자로 나오는지.</w:t>
+              <w:t>9/29 DevDay에서 에이전트·API 토큰·기업 배포가 숫자로 나오는지. 현금이 다시 도는지.</w:t>
             </w:r>
           </w:p>
           <w:p>
@@ -9790,6 +13323,21 @@
                 <w:sz w:val="21"/>
               </w:rPr>
               <w:t>Ohio·New York이 탐색에서 계약으로 넘어가는지. Indiana는 이미 별축.</w:t>
+            </w:r>
+          </w:p>
+          <w:p>
+            <w:pPr>
+              <w:spacing w:after="20" w:before="0" w:line="276" w:lineRule="auto"/>
+            </w:pPr>
+            <w:r>
+              <w:rPr>
+                <w:rFonts w:ascii="맑은 고딕" w:hAnsi="맑은 고딕" w:eastAsia="맑은 고딕"/>
+                <w:b w:val="0"/>
+                <w:i w:val="0"/>
+                <w:color w:val="1A1A1A"/>
+                <w:sz w:val="21"/>
+              </w:rPr>
+              <w:t>3분기, 하이퍼스케일러 현금과 삼성 모듈 외주·후공정 가동률이 추정치를 받쳐 주는지.</w:t>
             </w:r>
           </w:p>
         </w:tc>
@@ -9843,7 +13391,7 @@
         <w:color w:val="4B5563"/>
         <w:sz w:val="16"/>
       </w:rPr>
-      <w:t xml:space="preserve">영상 6편 + 퀵코멘트를 주제별로 재구성  ·  숫자는 공개 자료로 교차검증  ·  </w:t>
+      <w:t xml:space="preserve">영상 10편 + 퀵코멘트를 주제별로 재구성  ·  숫자는 공개 자료로 교차검증  ·  </w:t>
     </w:r>
     <w:fldSimple w:instr=" PAGE ">
       <w:r>
@@ -9874,7 +13422,7 @@
         <w:color w:val="4B5563"/>
         <w:sz w:val="17"/>
       </w:rPr>
-      <w:t>9/18  AI·반도체 시장 코멘트  ·  BOJ + 이은택  ·  강의노트</w:t>
+      <w:t>9/18  AI·반도체 시장 코멘트  ·  BOJ + 이은택 + 윤지호  ·  강의노트</w:t>
     </w:r>
   </w:p>
 </w:hdr>

</xml_diff>